<commit_message>
Paper: paired McNemar/bootstrap statistic for Hit@1, BM25 baseline described, in-sample query provenance, related work II-D with five verified references, reproducibility sentence corrected; all four variants rebuilt at 6 pages; handoff for the ACCTCON path
</commit_message>
<xml_diff>
--- a/docs/paper/DreamOS-IEEE-Paper-AI-disclosed.docx
+++ b/docs/paper/DreamOS-IEEE-Paper-AI-disclosed.docx
@@ -272,7 +272,7 @@
           <w:sz w:val="18"/>
           <w:szCs w:val="18"/>
         </w:rPr>
-        <w:t xml:space="preserve">Personal file collections are organised by names chosen at save time, and those names rarely describe the content later. Language-model assistants can search by meaning, but they can also launch the wrong file, follow a mistaken guess, or send data off the machine without the user knowing. We present DreamOS, a locally run desktop file manager that finds, opens, relates and organises files from natural-language requests using a local embedding model and a local 3B language model, with four explicit trust mechanisms: a confidence guard on the open action, evidence-before-model precedence for follow-ups, reversible organisation and a privacy audit that can be falsified. On 36 labelled queries over a 37-file vault, DreamOS ranks the intended file first for 94% of queries (MRR 0.97) against 56% for a BM25 content index and 33% for filename matching; on the 10 queries sharing no word with their target, both lexical baselines score 0.00 and DreamOS 0.80. Opening the top result unconditionally would launch 2 wrong files; the guarded action launches 29 files, all correct, at the cost of 5 extra confirmations. On synthetic collections of 500 to 5,000 files, replacing three all-pairs computations cut the graph rebuild from 143.3 s to 3.2 s at 5,000 files. Limitations, including the small hand-labelled query set, are stated in full.</w:t>
+        <w:t xml:space="preserve">Personal file collections are organised by names chosen at save time, and those names rarely describe the content later. Language-model assistants can search by meaning, but they can also launch the wrong file, follow a mistaken guess, or send data off the machine without the user knowing. We present DreamOS, a locally run desktop file manager that finds, opens, relates and organises files from natural-language requests using a local embedding model and a local 3B language model, with four explicit trust mechanisms: a confidence guard on the open action, evidence-before-model precedence for follow-ups, reversible organisation and a privacy audit that can be falsified. On 36 author-written queries over a 37-file vault, DreamOS ranks the intended file first for 94% of queries (MRR 0.97) against 56% for a BM25 content index and 33% for filename matching (paired exact test, p &lt; 0.001); on the 10 queries sharing no word with their target, both lexical baselines score 0.00 and DreamOS 0.80. Opening the top result unconditionally would launch 2 wrong files; the guarded action launches 29 files, all correct, at the cost of 5 extra confirmations. On synthetic collections of 500 to 5,000 files, replacing three all-pairs loops cut the graph rebuild from 143.3 s to 3.2 s at 5,000 files. The query set is small and in-sample to the vault; limitations are stated in full.</w:t>
       </w:r>
     </w:p>
     <w:p>
@@ -359,7 +359,7 @@
           <w:sz w:val="20"/>
           <w:szCs w:val="20"/>
         </w:rPr>
-        <w:t xml:space="preserve">1) An architecture that exposes semantic retrieval and action through one conversational interface for a human user, with six cooperating modules and four explicit trust mechanisms (Table III): a confidence guard on the open action, evidence-before-model precedence, reversible moves and a checkable privacy audit.</w:t>
+        <w:t xml:space="preserve">1) An architecture that exposes semantic retrieval and action through one conversational interface for a human user, with six modules plus an indexer and a privacy audit, and four explicit trust mechanisms (Table II): a confidence guard on the open action, evidence-before-model precedence, reversible moves and a checkable privacy audit.</w:t>
       </w:r>
     </w:p>
     <w:p>
@@ -387,7 +387,7 @@
           <w:sz w:val="20"/>
           <w:szCs w:val="20"/>
         </w:rPr>
-        <w:t xml:space="preserve">3) A measurement of the guard: on the labelled queries, opening the top result unconditionally would launch two wrong files, while the guarded action launches 29 files, all correct, and blocks both, at the price of five unnecessary confirmations; and a deterministic-precedence rule for follow-ups, introduced after a live failure in which the model's own "refers to previous" flag overrode a confident search result.</w:t>
+        <w:t xml:space="preserve">3) A measurement of the confidence guard on the same queries (both wrong opens prevented at the price of five confirmations), and an evidence-before-model precedence rule for follow-ups, introduced after a live failure in which the model's own "refers to previous" flag overrode a confident search result.</w:t>
       </w:r>
     </w:p>
     <w:p>
@@ -401,7 +401,7 @@
           <w:sz w:val="20"/>
           <w:szCs w:val="20"/>
         </w:rPr>
-        <w:t xml:space="preserve">4) A vectorised, equivalence-tested knowledge-graph construction with mean-centred similarity and average-linkage clustering, evaluated at up to 5,000 files with the real local models, in which profiling-driven fixes removed all-pairs computations and brought the 5,000-file rebuild to seconds.</w:t>
+        <w:t xml:space="preserve">4) A vectorised, equivalence-tested knowledge-graph construction with mean-centred similarity and average-linkage clustering, evaluated at up to 5,000 files with the real local models, in which profiling-driven fixes replaced three all-pairs Python loops and brought the 5,000-file rebuild from minutes to seconds.</w:t>
       </w:r>
     </w:p>
     <w:p>
@@ -465,7 +465,7 @@
           <w:sz w:val="20"/>
           <w:szCs w:val="20"/>
         </w:rPr>
-        <w:t xml:space="preserve">Gifford et al. introduced semantic file systems, in which attributes extracted from content are exposed as virtual directories [8]. Stuff I've Seen made previously encountered personal information retrievable by content rather than location [11]. LSFS, presented at ICLR 2025, indexes files as embedding vectors and exposes create, retrieve, update and roll-up operations to an LLM agent, showing that embedding indexes can replace command-based file operations at the operating-system-agent level [1]. DreamOS follows the same architectural direction but targets a person rather than an agent, adds a relationship graph and conversational memory, and reports an auditable privacy statement.</w:t>
+        <w:t xml:space="preserve">Gifford et al. introduced semantic file systems, in which attributes extracted from content are exposed as virtual directories [8]. Stuff I've Seen made previously encountered personal information retrievable by content rather than location [11]. LSFS, presented at ICLR 2025, indexes files as embedding vectors and exposes create, retrieve, update and roll-up operations to an LLM agent, showing that embedding indexes can replace command-based file operations for agents [1]. DreamOS follows the same architectural direction but targets a person rather than an agent, adds a relationship graph and conversational memory, and reports an auditable privacy statement.</w:t>
       </w:r>
     </w:p>
     <w:p>
@@ -521,6 +521,39 @@
     </w:p>
     <w:p>
       <w:pPr>
+        <w:spacing w:after="0" w:line="230"/>
+        <w:ind w:firstLine="280"/>
+        <w:jc w:val="both"/>
+      </w:pPr>
+      <w:r>
+        <w:rPr>
+          <w:rFonts w:ascii="Times New Roman" w:cs="Times New Roman" w:eastAsia="Times New Roman" w:hAnsi="Times New Roman"/>
+          <w:sz w:val="20"/>
+          <w:szCs w:val="20"/>
+        </w:rPr>
+        <w:t xml:space="preserve">Windows Search indexes names, metadata and text but matches lexically [5]; Spotlight layers ranking heuristics on a keyword index [6]; Everything indexes NTFS file names without reading content [7]. Table I summarises the gap: none retrieves by meaning in the documented configuration, and none reports a checkable statement of what leaves the machine.</w:t>
+      </w:r>
+    </w:p>
+    <w:p>
+      <w:pPr>
+        <w:keepNext/>
+        <w:spacing w:after="30" w:before="80"/>
+      </w:pPr>
+      <w:r>
+        <w:rPr>
+          <w:rFonts w:ascii="Times New Roman" w:cs="Times New Roman" w:eastAsia="Times New Roman" w:hAnsi="Times New Roman"/>
+          <w:b/>
+          <w:bCs/>
+          <w:i/>
+          <w:iCs/>
+          <w:sz w:val="20"/>
+          <w:szCs w:val="20"/>
+        </w:rPr>
+        <w:t xml:space="preserve">D. Local-first assistants, RAG and privacy</w:t>
+      </w:r>
+    </w:p>
+    <w:p>
+      <w:pPr>
         <w:spacing w:after="60" w:line="230"/>
         <w:ind w:firstLine="280"/>
         <w:jc w:val="both"/>
@@ -531,7 +564,7 @@
           <w:sz w:val="20"/>
           <w:szCs w:val="20"/>
         </w:rPr>
-        <w:t xml:space="preserve">Windows Search indexes names, metadata and text but matches lexically [5]; Spotlight layers ranking heuristics on a keyword index [6]; Everything indexes NTFS file names without reading content [7]. Table I summarises the gap: none retrieves by meaning in the documented configuration, and none reports a checkable statement of what leaves the machine.</w:t>
+        <w:t xml:space="preserve">Retrieval-augmented generation [21] retrieves passages so that a model can write an answer; DreamOS retrieves files so that a person can act on them, and the model only routes the request and labels content. Open-source assistants such as Khoj [23] offer semantic search and chat over personal notes with optional local models, and lexical full-text tools such as Recoll [24] index document content on the desktop; neither reports a measured action guard or a checkable statement of its network behaviour. Windows Recall [22] shows why that statement matters: Microsoft delayed its local screen-snapshot index in 2024 and re-released it as opt-in with encrypted, enclave-protected storage after public security and privacy criticism. DreamOS makes the equivalent claim about its own traffic falsifiable rather than asserted.</w:t>
       </w:r>
     </w:p>
     <w:p>
@@ -2554,7 +2587,7 @@
           <w:sz w:val="20"/>
           <w:szCs w:val="20"/>
         </w:rPr>
-        <w:t xml:space="preserve">DreamOS is a client-server application confined to one machine (Fig. 1). A Tauri 2 shell hosts a React interface with four views. It calls a FastAPI service on 127.0.0.1:8420, which calls a local Ollama runtime for two models, nomic-embed-text [16] for embeddings and llama3.2 (3B) for intent, summaries and tags, and uses three local stores: SQLite for relational data, ChromaDB [4] for chunk vectors and a sandboxed vault of files.</w:t>
+        <w:t xml:space="preserve">DreamOS is a client-server application confined to one machine (Fig. 1). A Tauri 2 shell hosts a React interface with four views (Fig. 6). It calls a FastAPI service on 127.0.0.1:8420, which calls a local Ollama runtime for two models, nomic-embed-text [16] for embeddings and llama3.2 (3B) for intent, summaries and tags, and uses three local stores: SQLite for relational data, ChromaDB [4] for chunk vectors and a sandboxed vault of files.</w:t>
       </w:r>
     </w:p>
     <w:p>
@@ -2612,7 +2645,1199 @@
       <w:r>
         <w:drawing>
           <wp:inline distT="0" distB="0" distL="0" distR="0">
-            <wp:extent cx="4238625" cy="1847850"/>
+            <wp:extent cx="3581400" cy="1562100"/>
+            <wp:effectExtent t="0" r="0" b="0" l="0"/>
+            <wp:docPr id="1" name="" descr="" title=""/>
+            <wp:cNvGraphicFramePr>
+              <a:graphicFrameLocks xmlns:a="http://schemas.openxmlformats.org/drawingml/2006/main" noChangeAspect="1"/>
+            </wp:cNvGraphicFramePr>
+            <a:graphic xmlns:a="http://schemas.openxmlformats.org/drawingml/2006/main">
+              <a:graphicData uri="http://schemas.openxmlformats.org/drawingml/2006/picture">
+                <pic:pic xmlns:pic="http://schemas.openxmlformats.org/drawingml/2006/picture">
+                  <pic:nvPicPr>
+                    <pic:cNvPr id="0" name="" descr=""/>
+                    <pic:cNvPicPr>
+                      <a:picLocks noChangeAspect="1" noChangeArrowheads="1"/>
+                    </pic:cNvPicPr>
+                  </pic:nvPicPr>
+                  <pic:blipFill>
+                    <a:blip r:embed="rId23" cstate="none"/>
+                    <a:srcRect/>
+                    <a:stretch>
+                      <a:fillRect/>
+                    </a:stretch>
+                  </pic:blipFill>
+                  <pic:spPr bwMode="auto">
+                    <a:xfrm>
+                      <a:off x="0" y="0"/>
+                      <a:ext cx="3581400" cy="1562100"/>
+                    </a:xfrm>
+                    <a:prstGeom prst="rect">
+                      <a:avLst/>
+                    </a:prstGeom>
+                  </pic:spPr>
+                </pic:pic>
+              </a:graphicData>
+            </a:graphic>
+          </wp:inline>
+        </w:drawing>
+      </w:r>
+    </w:p>
+    <w:p>
+      <w:pPr>
+        <w:spacing w:after="110" w:before="50" w:line="216"/>
+        <w:jc w:val="both"/>
+      </w:pPr>
+      <w:r>
+        <w:rPr>
+          <w:rFonts w:ascii="Times New Roman" w:cs="Times New Roman" w:eastAsia="Times New Roman" w:hAnsi="Times New Roman"/>
+          <w:b/>
+          <w:bCs/>
+          <w:sz w:val="16"/>
+          <w:szCs w:val="16"/>
+        </w:rPr>
+        <w:t xml:space="preserve">Fig. 1. </w:t>
+      </w:r>
+      <w:r>
+        <w:rPr>
+          <w:rFonts w:ascii="Times New Roman" w:cs="Times New Roman" w:eastAsia="Times New Roman" w:hAnsi="Times New Roman"/>
+          <w:sz w:val="16"/>
+          <w:szCs w:val="16"/>
+        </w:rPr>
+        <w:t xml:space="preserve">DreamOS architecture. A desktop client talks over loopback HTTP to a local service with eight components (blue: request modules; green: supporting modules). The service calls a local model runtime and three local stores. Nothing in the path leaves the machine.</w:t>
+      </w:r>
+    </w:p>
+    <w:p>
+      <w:pPr>
+        <w:keepNext/>
+        <w:spacing w:after="0" w:before="80"/>
+        <w:jc w:val="center"/>
+      </w:pPr>
+      <w:r>
+        <w:drawing>
+          <wp:inline distT="0" distB="0" distL="0" distR="0">
+            <wp:extent cx="3981450" cy="1104900"/>
+            <wp:effectExtent t="0" r="0" b="0" l="0"/>
+            <wp:docPr id="1" name="" descr="" title=""/>
+            <wp:cNvGraphicFramePr>
+              <a:graphicFrameLocks xmlns:a="http://schemas.openxmlformats.org/drawingml/2006/main" noChangeAspect="1"/>
+            </wp:cNvGraphicFramePr>
+            <a:graphic xmlns:a="http://schemas.openxmlformats.org/drawingml/2006/main">
+              <a:graphicData uri="http://schemas.openxmlformats.org/drawingml/2006/picture">
+                <pic:pic xmlns:pic="http://schemas.openxmlformats.org/drawingml/2006/picture">
+                  <pic:nvPicPr>
+                    <pic:cNvPr id="0" name="" descr=""/>
+                    <pic:cNvPicPr>
+                      <a:picLocks noChangeAspect="1" noChangeArrowheads="1"/>
+                    </pic:cNvPicPr>
+                  </pic:nvPicPr>
+                  <pic:blipFill>
+                    <a:blip r:embed="rId24" cstate="none"/>
+                    <a:srcRect/>
+                    <a:stretch>
+                      <a:fillRect/>
+                    </a:stretch>
+                  </pic:blipFill>
+                  <pic:spPr bwMode="auto">
+                    <a:xfrm>
+                      <a:off x="0" y="0"/>
+                      <a:ext cx="3981450" cy="1104900"/>
+                    </a:xfrm>
+                    <a:prstGeom prst="rect">
+                      <a:avLst/>
+                    </a:prstGeom>
+                  </pic:spPr>
+                </pic:pic>
+              </a:graphicData>
+            </a:graphic>
+          </wp:inline>
+        </w:drawing>
+      </w:r>
+    </w:p>
+    <w:p>
+      <w:pPr>
+        <w:spacing w:after="110" w:before="50" w:line="216"/>
+        <w:jc w:val="both"/>
+      </w:pPr>
+      <w:r>
+        <w:rPr>
+          <w:rFonts w:ascii="Times New Roman" w:cs="Times New Roman" w:eastAsia="Times New Roman" w:hAnsi="Times New Roman"/>
+          <w:b/>
+          <w:bCs/>
+          <w:sz w:val="16"/>
+          <w:szCs w:val="16"/>
+        </w:rPr>
+        <w:t xml:space="preserve">Fig. 2. </w:t>
+      </w:r>
+      <w:r>
+        <w:rPr>
+          <w:rFonts w:ascii="Times New Roman" w:cs="Times New Roman" w:eastAsia="Times New Roman" w:hAnsi="Times New Roman"/>
+          <w:sz w:val="16"/>
+          <w:szCs w:val="16"/>
+        </w:rPr>
+        <w:t xml:space="preserve">(a) The indexing pipeline turns files into vectors, summaries, tags and graph edges. (b) The query pipeline classifies a message, resolves references (amber: the step that carries the paper's precedence rule), and routes to one of five actions.</w:t>
+      </w:r>
+    </w:p>
+    <w:p>
+      <w:pPr>
+        <w:sectPr>
+          <w:footerReference w:type="default" r:id="rId11"/>
+          <w:type w:val="continuous"/>
+          <w:pgSz w:w="12240" w:h="15840" w:orient="portrait"/>
+          <w:pgMar w:top="1080" w:right="900" w:bottom="1440" w:left="900" w:header="708" w:footer="708" w:gutter="0"/>
+          <w:pgNumType/>
+          <w:docGrid w:linePitch="360"/>
+        </w:sectPr>
+      </w:pPr>
+    </w:p>
+    <w:p>
+      <w:pPr>
+        <w:keepNext/>
+        <w:spacing w:after="30" w:before="80"/>
+      </w:pPr>
+      <w:r>
+        <w:rPr>
+          <w:rFonts w:ascii="Times New Roman" w:cs="Times New Roman" w:eastAsia="Times New Roman" w:hAnsi="Times New Roman"/>
+          <w:b/>
+          <w:bCs/>
+          <w:i/>
+          <w:iCs/>
+          <w:sz w:val="20"/>
+          <w:szCs w:val="20"/>
+        </w:rPr>
+        <w:t xml:space="preserve">C. Data model</w:t>
+      </w:r>
+    </w:p>
+    <w:p>
+      <w:pPr>
+        <w:spacing w:after="0" w:line="230"/>
+        <w:ind w:firstLine="280"/>
+        <w:jc w:val="both"/>
+      </w:pPr>
+      <w:r>
+        <w:rPr>
+          <w:rFonts w:ascii="Times New Roman" w:cs="Times New Roman" w:eastAsia="Times New Roman" w:hAnsi="Times New Roman"/>
+          <w:sz w:val="20"/>
+          <w:szCs w:val="20"/>
+        </w:rPr>
+        <w:t xml:space="preserve">SQLite holds one row per file (path, original path, content hash, summary, tags, category) and the derived tables: typed edges, conversation turns with the file identifiers each turn showed, open events, and workspaces with their members. ChromaDB holds one vector per chunk with the file path as metadata. Every derived table is keyed on the file's integer identifier, not its path. The organiser renames files when it moves them, but the identifier survives, so relationships and memory never need re-synchronising after a move, and a move can be reversed from the stored original path.</w:t>
+      </w:r>
+    </w:p>
+    <w:p>
+      <w:pPr>
+        <w:keepNext/>
+        <w:spacing w:after="30" w:before="80"/>
+      </w:pPr>
+      <w:r>
+        <w:rPr>
+          <w:rFonts w:ascii="Times New Roman" w:cs="Times New Roman" w:eastAsia="Times New Roman" w:hAnsi="Times New Roman"/>
+          <w:b/>
+          <w:bCs/>
+          <w:i/>
+          <w:iCs/>
+          <w:sz w:val="20"/>
+          <w:szCs w:val="20"/>
+        </w:rPr>
+        <w:t xml:space="preserve">D. Trust mechanisms</w:t>
+      </w:r>
+    </w:p>
+    <w:p>
+      <w:pPr>
+        <w:spacing w:after="0" w:line="230"/>
+        <w:ind w:firstLine="280"/>
+        <w:jc w:val="both"/>
+      </w:pPr>
+      <w:r>
+        <w:rPr>
+          <w:rFonts w:ascii="Times New Roman" w:cs="Times New Roman" w:eastAsia="Times New Roman" w:hAnsi="Times New Roman"/>
+          <w:sz w:val="20"/>
+          <w:szCs w:val="20"/>
+        </w:rPr>
+        <w:t xml:space="preserve">A language model sits at four points where an error would cost the user something. Table II names each point, the mechanism that bounds it and the evidence reported in this paper. The mechanisms are deliberately simple and deterministic, so each can be tested on its own and explained to a user: none relies on the model grading itself.</w:t>
+      </w:r>
+    </w:p>
+    <w:p>
+      <w:pPr>
+        <w:sectPr>
+          <w:footerReference w:type="default" r:id="rId12"/>
+          <w:type w:val="continuous"/>
+          <w:pgSz w:w="12240" w:h="15840" w:orient="portrait"/>
+          <w:pgMar w:top="1080" w:right="900" w:bottom="1440" w:left="900" w:header="708" w:footer="708" w:gutter="0"/>
+          <w:pgNumType/>
+          <w:cols w:space="360" w:num="2"/>
+          <w:docGrid w:linePitch="360"/>
+        </w:sectPr>
+      </w:pPr>
+    </w:p>
+    <w:p>
+      <w:pPr>
+        <w:keepNext/>
+        <w:spacing w:after="50" w:before="90" w:line="216"/>
+        <w:jc w:val="center"/>
+      </w:pPr>
+      <w:r>
+        <w:rPr>
+          <w:rFonts w:ascii="Times New Roman" w:cs="Times New Roman" w:eastAsia="Times New Roman" w:hAnsi="Times New Roman"/>
+          <w:b/>
+          <w:bCs/>
+          <w:sz w:val="16"/>
+          <w:szCs w:val="16"/>
+        </w:rPr>
+        <w:t xml:space="preserve">TABLE II</w:t>
+      </w:r>
+      <w:r>
+        <w:rPr>
+          <w:rFonts w:ascii="Times New Roman" w:cs="Times New Roman" w:eastAsia="Times New Roman" w:hAnsi="Times New Roman"/>
+          <w:sz w:val="16"/>
+          <w:szCs w:val="16"/>
+        </w:rPr>
+        <w:t xml:space="preserve">. Trust Mechanisms, the Failure Each Prevents and the Evidence</w:t>
+      </w:r>
+    </w:p>
+    <w:tbl>
+      <w:tblPr>
+        <w:tblW w:type="dxa" w:w="10440"/>
+        <w:tblBorders>
+          <w:top w:val="single" w:color="auto" w:sz="4"/>
+          <w:left w:val="single" w:color="auto" w:sz="4"/>
+          <w:bottom w:val="single" w:color="auto" w:sz="4"/>
+          <w:right w:val="single" w:color="auto" w:sz="4"/>
+          <w:insideH w:val="single" w:color="auto" w:sz="4"/>
+          <w:insideV w:val="single" w:color="auto" w:sz="4"/>
+        </w:tblBorders>
+      </w:tblPr>
+      <w:tblGrid>
+        <w:gridCol w:w="2000"/>
+        <w:gridCol w:w="2900"/>
+        <w:gridCol w:w="2800"/>
+        <w:gridCol w:w="2740"/>
+      </w:tblGrid>
+      <w:tr>
+        <w:trPr>
+          <w:cantSplit/>
+          <w:tblHeader/>
+        </w:trPr>
+        <w:tc>
+          <w:tcPr>
+            <w:tcW w:type="dxa" w:w="2000"/>
+            <w:tcBorders>
+              <w:top w:val="single" w:color="000000" w:sz="2"/>
+              <w:left w:val="single" w:color="000000" w:sz="2"/>
+              <w:bottom w:val="single" w:color="000000" w:sz="2"/>
+              <w:right w:val="single" w:color="000000" w:sz="2"/>
+            </w:tcBorders>
+            <w:shd w:fill="E6E6E6" w:val="clear"/>
+            <w:tcMar>
+              <w:top w:type="dxa" w:w="30"/>
+              <w:left w:type="dxa" w:w="60"/>
+              <w:bottom w:type="dxa" w:w="30"/>
+              <w:right w:type="dxa" w:w="60"/>
+            </w:tcMar>
+            <w:vAlign w:val="center"/>
+          </w:tcPr>
+          <w:p>
+            <w:pPr>
+              <w:spacing w:after="0" w:line="208"/>
+              <w:jc w:val="center"/>
+            </w:pPr>
+            <w:r>
+              <w:rPr>
+                <w:rFonts w:ascii="Times New Roman" w:cs="Times New Roman" w:eastAsia="Times New Roman" w:hAnsi="Times New Roman"/>
+                <w:b/>
+                <w:bCs/>
+                <w:sz w:val="16"/>
+                <w:szCs w:val="16"/>
+              </w:rPr>
+              <w:t xml:space="preserve">Mechanism</w:t>
+            </w:r>
+          </w:p>
+        </w:tc>
+        <w:tc>
+          <w:tcPr>
+            <w:tcW w:type="dxa" w:w="2900"/>
+            <w:tcBorders>
+              <w:top w:val="single" w:color="000000" w:sz="2"/>
+              <w:left w:val="single" w:color="000000" w:sz="2"/>
+              <w:bottom w:val="single" w:color="000000" w:sz="2"/>
+              <w:right w:val="single" w:color="000000" w:sz="2"/>
+            </w:tcBorders>
+            <w:shd w:fill="E6E6E6" w:val="clear"/>
+            <w:tcMar>
+              <w:top w:type="dxa" w:w="30"/>
+              <w:left w:type="dxa" w:w="60"/>
+              <w:bottom w:type="dxa" w:w="30"/>
+              <w:right w:type="dxa" w:w="60"/>
+            </w:tcMar>
+            <w:vAlign w:val="center"/>
+          </w:tcPr>
+          <w:p>
+            <w:pPr>
+              <w:spacing w:after="0" w:line="208"/>
+              <w:jc w:val="center"/>
+            </w:pPr>
+            <w:r>
+              <w:rPr>
+                <w:rFonts w:ascii="Times New Roman" w:cs="Times New Roman" w:eastAsia="Times New Roman" w:hAnsi="Times New Roman"/>
+                <w:b/>
+                <w:bCs/>
+                <w:sz w:val="16"/>
+                <w:szCs w:val="16"/>
+              </w:rPr>
+              <w:t xml:space="preserve">Failure it prevents</w:t>
+            </w:r>
+          </w:p>
+        </w:tc>
+        <w:tc>
+          <w:tcPr>
+            <w:tcW w:type="dxa" w:w="2800"/>
+            <w:tcBorders>
+              <w:top w:val="single" w:color="000000" w:sz="2"/>
+              <w:left w:val="single" w:color="000000" w:sz="2"/>
+              <w:bottom w:val="single" w:color="000000" w:sz="2"/>
+              <w:right w:val="single" w:color="000000" w:sz="2"/>
+            </w:tcBorders>
+            <w:shd w:fill="E6E6E6" w:val="clear"/>
+            <w:tcMar>
+              <w:top w:type="dxa" w:w="30"/>
+              <w:left w:type="dxa" w:w="60"/>
+              <w:bottom w:type="dxa" w:w="30"/>
+              <w:right w:type="dxa" w:w="60"/>
+            </w:tcMar>
+            <w:vAlign w:val="center"/>
+          </w:tcPr>
+          <w:p>
+            <w:pPr>
+              <w:spacing w:after="0" w:line="208"/>
+              <w:jc w:val="center"/>
+            </w:pPr>
+            <w:r>
+              <w:rPr>
+                <w:rFonts w:ascii="Times New Roman" w:cs="Times New Roman" w:eastAsia="Times New Roman" w:hAnsi="Times New Roman"/>
+                <w:b/>
+                <w:bCs/>
+                <w:sz w:val="16"/>
+                <w:szCs w:val="16"/>
+              </w:rPr>
+              <w:t xml:space="preserve">How it works</w:t>
+            </w:r>
+          </w:p>
+        </w:tc>
+        <w:tc>
+          <w:tcPr>
+            <w:tcW w:type="dxa" w:w="2740"/>
+            <w:tcBorders>
+              <w:top w:val="single" w:color="000000" w:sz="2"/>
+              <w:left w:val="single" w:color="000000" w:sz="2"/>
+              <w:bottom w:val="single" w:color="000000" w:sz="2"/>
+              <w:right w:val="single" w:color="000000" w:sz="2"/>
+            </w:tcBorders>
+            <w:shd w:fill="E6E6E6" w:val="clear"/>
+            <w:tcMar>
+              <w:top w:type="dxa" w:w="30"/>
+              <w:left w:type="dxa" w:w="60"/>
+              <w:bottom w:type="dxa" w:w="30"/>
+              <w:right w:type="dxa" w:w="60"/>
+            </w:tcMar>
+            <w:vAlign w:val="center"/>
+          </w:tcPr>
+          <w:p>
+            <w:pPr>
+              <w:spacing w:after="0" w:line="208"/>
+              <w:jc w:val="center"/>
+            </w:pPr>
+            <w:r>
+              <w:rPr>
+                <w:rFonts w:ascii="Times New Roman" w:cs="Times New Roman" w:eastAsia="Times New Roman" w:hAnsi="Times New Roman"/>
+                <w:b/>
+                <w:bCs/>
+                <w:sz w:val="16"/>
+                <w:szCs w:val="16"/>
+              </w:rPr>
+              <w:t xml:space="preserve">Evidence</w:t>
+            </w:r>
+          </w:p>
+        </w:tc>
+      </w:tr>
+      <w:tr>
+        <w:trPr>
+          <w:cantSplit/>
+        </w:trPr>
+        <w:tc>
+          <w:tcPr>
+            <w:tcW w:type="dxa" w:w="2000"/>
+            <w:tcBorders>
+              <w:top w:val="single" w:color="000000" w:sz="2"/>
+              <w:left w:val="single" w:color="000000" w:sz="2"/>
+              <w:bottom w:val="single" w:color="000000" w:sz="2"/>
+              <w:right w:val="single" w:color="000000" w:sz="2"/>
+            </w:tcBorders>
+            <w:tcMar>
+              <w:top w:type="dxa" w:w="30"/>
+              <w:left w:type="dxa" w:w="60"/>
+              <w:bottom w:type="dxa" w:w="30"/>
+              <w:right w:type="dxa" w:w="60"/>
+            </w:tcMar>
+            <w:vAlign w:val="center"/>
+          </w:tcPr>
+          <w:p>
+            <w:pPr>
+              <w:spacing w:after="0" w:line="208"/>
+              <w:jc w:val="left"/>
+            </w:pPr>
+            <w:r>
+              <w:rPr>
+                <w:rFonts w:ascii="Times New Roman" w:cs="Times New Roman" w:eastAsia="Times New Roman" w:hAnsi="Times New Roman"/>
+                <w:b w:val="false"/>
+                <w:bCs w:val="false"/>
+                <w:sz w:val="16"/>
+                <w:szCs w:val="16"/>
+              </w:rPr>
+              <w:t xml:space="preserve">Confidence guard on open</w:t>
+            </w:r>
+          </w:p>
+        </w:tc>
+        <w:tc>
+          <w:tcPr>
+            <w:tcW w:type="dxa" w:w="2900"/>
+            <w:tcBorders>
+              <w:top w:val="single" w:color="000000" w:sz="2"/>
+              <w:left w:val="single" w:color="000000" w:sz="2"/>
+              <w:bottom w:val="single" w:color="000000" w:sz="2"/>
+              <w:right w:val="single" w:color="000000" w:sz="2"/>
+            </w:tcBorders>
+            <w:tcMar>
+              <w:top w:type="dxa" w:w="30"/>
+              <w:left w:type="dxa" w:w="60"/>
+              <w:bottom w:type="dxa" w:w="30"/>
+              <w:right w:type="dxa" w:w="60"/>
+            </w:tcMar>
+            <w:vAlign w:val="center"/>
+          </w:tcPr>
+          <w:p>
+            <w:pPr>
+              <w:spacing w:after="0" w:line="208"/>
+              <w:jc w:val="center"/>
+            </w:pPr>
+            <w:r>
+              <w:rPr>
+                <w:rFonts w:ascii="Times New Roman" w:cs="Times New Roman" w:eastAsia="Times New Roman" w:hAnsi="Times New Roman"/>
+                <w:b w:val="false"/>
+                <w:bCs w:val="false"/>
+                <w:sz w:val="16"/>
+                <w:szCs w:val="16"/>
+              </w:rPr>
+              <w:t xml:space="preserve">Launching a wrong file on a weak or ambiguous match</w:t>
+            </w:r>
+          </w:p>
+        </w:tc>
+        <w:tc>
+          <w:tcPr>
+            <w:tcW w:type="dxa" w:w="2800"/>
+            <w:tcBorders>
+              <w:top w:val="single" w:color="000000" w:sz="2"/>
+              <w:left w:val="single" w:color="000000" w:sz="2"/>
+              <w:bottom w:val="single" w:color="000000" w:sz="2"/>
+              <w:right w:val="single" w:color="000000" w:sz="2"/>
+            </w:tcBorders>
+            <w:tcMar>
+              <w:top w:type="dxa" w:w="30"/>
+              <w:left w:type="dxa" w:w="60"/>
+              <w:bottom w:type="dxa" w:w="30"/>
+              <w:right w:type="dxa" w:w="60"/>
+            </w:tcMar>
+            <w:vAlign w:val="center"/>
+          </w:tcPr>
+          <w:p>
+            <w:pPr>
+              <w:spacing w:after="0" w:line="208"/>
+              <w:jc w:val="center"/>
+            </w:pPr>
+            <w:r>
+              <w:rPr>
+                <w:rFonts w:ascii="Times New Roman" w:cs="Times New Roman" w:eastAsia="Times New Roman" w:hAnsi="Times New Roman"/>
+                <w:b w:val="false"/>
+                <w:bCs w:val="false"/>
+                <w:sz w:val="16"/>
+                <w:szCs w:val="16"/>
+              </w:rPr>
+              <w:t xml:space="preserve">Opens only at similarity 0.55 or above with no runner-up within 0.05; otherwise shows candidates</w:t>
+            </w:r>
+          </w:p>
+        </w:tc>
+        <w:tc>
+          <w:tcPr>
+            <w:tcW w:type="dxa" w:w="2740"/>
+            <w:tcBorders>
+              <w:top w:val="single" w:color="000000" w:sz="2"/>
+              <w:left w:val="single" w:color="000000" w:sz="2"/>
+              <w:bottom w:val="single" w:color="000000" w:sz="2"/>
+              <w:right w:val="single" w:color="000000" w:sz="2"/>
+            </w:tcBorders>
+            <w:tcMar>
+              <w:top w:type="dxa" w:w="30"/>
+              <w:left w:type="dxa" w:w="60"/>
+              <w:bottom w:type="dxa" w:w="30"/>
+              <w:right w:type="dxa" w:w="60"/>
+            </w:tcMar>
+            <w:vAlign w:val="center"/>
+          </w:tcPr>
+          <w:p>
+            <w:pPr>
+              <w:spacing w:after="0" w:line="208"/>
+              <w:jc w:val="center"/>
+            </w:pPr>
+            <w:r>
+              <w:rPr>
+                <w:rFonts w:ascii="Times New Roman" w:cs="Times New Roman" w:eastAsia="Times New Roman" w:hAnsi="Times New Roman"/>
+                <w:b w:val="false"/>
+                <w:bCs w:val="false"/>
+                <w:sz w:val="16"/>
+                <w:szCs w:val="16"/>
+              </w:rPr>
+              <w:t xml:space="preserve">Sec. VI-B: 29 opens, 0 wrong, against 2 wrong without it</w:t>
+            </w:r>
+          </w:p>
+        </w:tc>
+      </w:tr>
+      <w:tr>
+        <w:trPr>
+          <w:cantSplit/>
+        </w:trPr>
+        <w:tc>
+          <w:tcPr>
+            <w:tcW w:type="dxa" w:w="2000"/>
+            <w:tcBorders>
+              <w:top w:val="single" w:color="000000" w:sz="2"/>
+              <w:left w:val="single" w:color="000000" w:sz="2"/>
+              <w:bottom w:val="single" w:color="000000" w:sz="2"/>
+              <w:right w:val="single" w:color="000000" w:sz="2"/>
+            </w:tcBorders>
+            <w:tcMar>
+              <w:top w:type="dxa" w:w="30"/>
+              <w:left w:type="dxa" w:w="60"/>
+              <w:bottom w:type="dxa" w:w="30"/>
+              <w:right w:type="dxa" w:w="60"/>
+            </w:tcMar>
+            <w:vAlign w:val="center"/>
+          </w:tcPr>
+          <w:p>
+            <w:pPr>
+              <w:spacing w:after="0" w:line="208"/>
+              <w:jc w:val="left"/>
+            </w:pPr>
+            <w:r>
+              <w:rPr>
+                <w:rFonts w:ascii="Times New Roman" w:cs="Times New Roman" w:eastAsia="Times New Roman" w:hAnsi="Times New Roman"/>
+                <w:b w:val="false"/>
+                <w:bCs w:val="false"/>
+                <w:sz w:val="16"/>
+                <w:szCs w:val="16"/>
+              </w:rPr>
+              <w:t xml:space="preserve">Evidence before model</w:t>
+            </w:r>
+          </w:p>
+        </w:tc>
+        <w:tc>
+          <w:tcPr>
+            <w:tcW w:type="dxa" w:w="2900"/>
+            <w:tcBorders>
+              <w:top w:val="single" w:color="000000" w:sz="2"/>
+              <w:left w:val="single" w:color="000000" w:sz="2"/>
+              <w:bottom w:val="single" w:color="000000" w:sz="2"/>
+              <w:right w:val="single" w:color="000000" w:sz="2"/>
+            </w:tcBorders>
+            <w:tcMar>
+              <w:top w:type="dxa" w:w="30"/>
+              <w:left w:type="dxa" w:w="60"/>
+              <w:bottom w:type="dxa" w:w="30"/>
+              <w:right w:type="dxa" w:w="60"/>
+            </w:tcMar>
+            <w:vAlign w:val="center"/>
+          </w:tcPr>
+          <w:p>
+            <w:pPr>
+              <w:spacing w:after="0" w:line="208"/>
+              <w:jc w:val="center"/>
+            </w:pPr>
+            <w:r>
+              <w:rPr>
+                <w:rFonts w:ascii="Times New Roman" w:cs="Times New Roman" w:eastAsia="Times New Roman" w:hAnsi="Times New Roman"/>
+                <w:b w:val="false"/>
+                <w:bCs w:val="false"/>
+                <w:sz w:val="16"/>
+                <w:szCs w:val="16"/>
+              </w:rPr>
+              <w:t xml:space="preserve">A stale or guessed reference overriding a clear request</w:t>
+            </w:r>
+          </w:p>
+        </w:tc>
+        <w:tc>
+          <w:tcPr>
+            <w:tcW w:type="dxa" w:w="2800"/>
+            <w:tcBorders>
+              <w:top w:val="single" w:color="000000" w:sz="2"/>
+              <w:left w:val="single" w:color="000000" w:sz="2"/>
+              <w:bottom w:val="single" w:color="000000" w:sz="2"/>
+              <w:right w:val="single" w:color="000000" w:sz="2"/>
+            </w:tcBorders>
+            <w:tcMar>
+              <w:top w:type="dxa" w:w="30"/>
+              <w:left w:type="dxa" w:w="60"/>
+              <w:bottom w:type="dxa" w:w="30"/>
+              <w:right w:type="dxa" w:w="60"/>
+            </w:tcMar>
+            <w:vAlign w:val="center"/>
+          </w:tcPr>
+          <w:p>
+            <w:pPr>
+              <w:spacing w:after="0" w:line="208"/>
+              <w:jc w:val="center"/>
+            </w:pPr>
+            <w:r>
+              <w:rPr>
+                <w:rFonts w:ascii="Times New Roman" w:cs="Times New Roman" w:eastAsia="Times New Roman" w:hAnsi="Times New Roman"/>
+                <w:b w:val="false"/>
+                <w:bCs w:val="false"/>
+                <w:sz w:val="16"/>
+                <w:szCs w:val="16"/>
+              </w:rPr>
+              <w:t xml:space="preserve">Ordinal and pronoun rules, then a direct search; the model's flag is the last resort</w:t>
+            </w:r>
+          </w:p>
+        </w:tc>
+        <w:tc>
+          <w:tcPr>
+            <w:tcW w:type="dxa" w:w="2740"/>
+            <w:tcBorders>
+              <w:top w:val="single" w:color="000000" w:sz="2"/>
+              <w:left w:val="single" w:color="000000" w:sz="2"/>
+              <w:bottom w:val="single" w:color="000000" w:sz="2"/>
+              <w:right w:val="single" w:color="000000" w:sz="2"/>
+            </w:tcBorders>
+            <w:tcMar>
+              <w:top w:type="dxa" w:w="30"/>
+              <w:left w:type="dxa" w:w="60"/>
+              <w:bottom w:type="dxa" w:w="30"/>
+              <w:right w:type="dxa" w:w="60"/>
+            </w:tcMar>
+            <w:vAlign w:val="center"/>
+          </w:tcPr>
+          <w:p>
+            <w:pPr>
+              <w:spacing w:after="0" w:line="208"/>
+              <w:jc w:val="center"/>
+            </w:pPr>
+            <w:r>
+              <w:rPr>
+                <w:rFonts w:ascii="Times New Roman" w:cs="Times New Roman" w:eastAsia="Times New Roman" w:hAnsi="Times New Roman"/>
+                <w:b w:val="false"/>
+                <w:bCs w:val="false"/>
+                <w:sz w:val="16"/>
+                <w:szCs w:val="16"/>
+              </w:rPr>
+              <w:t xml:space="preserve">Live failure; regression test fails on the old order (Sec. IV-C)</w:t>
+            </w:r>
+          </w:p>
+        </w:tc>
+      </w:tr>
+      <w:tr>
+        <w:trPr>
+          <w:cantSplit/>
+        </w:trPr>
+        <w:tc>
+          <w:tcPr>
+            <w:tcW w:type="dxa" w:w="2000"/>
+            <w:tcBorders>
+              <w:top w:val="single" w:color="000000" w:sz="2"/>
+              <w:left w:val="single" w:color="000000" w:sz="2"/>
+              <w:bottom w:val="single" w:color="000000" w:sz="2"/>
+              <w:right w:val="single" w:color="000000" w:sz="2"/>
+            </w:tcBorders>
+            <w:tcMar>
+              <w:top w:type="dxa" w:w="30"/>
+              <w:left w:type="dxa" w:w="60"/>
+              <w:bottom w:type="dxa" w:w="30"/>
+              <w:right w:type="dxa" w:w="60"/>
+            </w:tcMar>
+            <w:vAlign w:val="center"/>
+          </w:tcPr>
+          <w:p>
+            <w:pPr>
+              <w:spacing w:after="0" w:line="208"/>
+              <w:jc w:val="left"/>
+            </w:pPr>
+            <w:r>
+              <w:rPr>
+                <w:rFonts w:ascii="Times New Roman" w:cs="Times New Roman" w:eastAsia="Times New Roman" w:hAnsi="Times New Roman"/>
+                <w:b w:val="false"/>
+                <w:bCs w:val="false"/>
+                <w:sz w:val="16"/>
+                <w:szCs w:val="16"/>
+              </w:rPr>
+              <w:t xml:space="preserve">Reversible organisation</w:t>
+            </w:r>
+          </w:p>
+        </w:tc>
+        <w:tc>
+          <w:tcPr>
+            <w:tcW w:type="dxa" w:w="2900"/>
+            <w:tcBorders>
+              <w:top w:val="single" w:color="000000" w:sz="2"/>
+              <w:left w:val="single" w:color="000000" w:sz="2"/>
+              <w:bottom w:val="single" w:color="000000" w:sz="2"/>
+              <w:right w:val="single" w:color="000000" w:sz="2"/>
+            </w:tcBorders>
+            <w:tcMar>
+              <w:top w:type="dxa" w:w="30"/>
+              <w:left w:type="dxa" w:w="60"/>
+              <w:bottom w:type="dxa" w:w="30"/>
+              <w:right w:type="dxa" w:w="60"/>
+            </w:tcMar>
+            <w:vAlign w:val="center"/>
+          </w:tcPr>
+          <w:p>
+            <w:pPr>
+              <w:spacing w:after="0" w:line="208"/>
+              <w:jc w:val="center"/>
+            </w:pPr>
+            <w:r>
+              <w:rPr>
+                <w:rFonts w:ascii="Times New Roman" w:cs="Times New Roman" w:eastAsia="Times New Roman" w:hAnsi="Times New Roman"/>
+                <w:b w:val="false"/>
+                <w:bCs w:val="false"/>
+                <w:sz w:val="16"/>
+                <w:szCs w:val="16"/>
+              </w:rPr>
+              <w:t xml:space="preserve">Irrecoverable moves of files</w:t>
+            </w:r>
+          </w:p>
+        </w:tc>
+        <w:tc>
+          <w:tcPr>
+            <w:tcW w:type="dxa" w:w="2800"/>
+            <w:tcBorders>
+              <w:top w:val="single" w:color="000000" w:sz="2"/>
+              <w:left w:val="single" w:color="000000" w:sz="2"/>
+              <w:bottom w:val="single" w:color="000000" w:sz="2"/>
+              <w:right w:val="single" w:color="000000" w:sz="2"/>
+            </w:tcBorders>
+            <w:tcMar>
+              <w:top w:type="dxa" w:w="30"/>
+              <w:left w:type="dxa" w:w="60"/>
+              <w:bottom w:type="dxa" w:w="30"/>
+              <w:right w:type="dxa" w:w="60"/>
+            </w:tcMar>
+            <w:vAlign w:val="center"/>
+          </w:tcPr>
+          <w:p>
+            <w:pPr>
+              <w:spacing w:after="0" w:line="208"/>
+              <w:jc w:val="center"/>
+            </w:pPr>
+            <w:r>
+              <w:rPr>
+                <w:rFonts w:ascii="Times New Roman" w:cs="Times New Roman" w:eastAsia="Times New Roman" w:hAnsi="Times New Roman"/>
+                <w:b w:val="false"/>
+                <w:bCs w:val="false"/>
+                <w:sz w:val="16"/>
+                <w:szCs w:val="16"/>
+              </w:rPr>
+              <w:t xml:space="preserve">Move only on confirmation; original path stored; revert restores it</w:t>
+            </w:r>
+          </w:p>
+        </w:tc>
+        <w:tc>
+          <w:tcPr>
+            <w:tcW w:type="dxa" w:w="2740"/>
+            <w:tcBorders>
+              <w:top w:val="single" w:color="000000" w:sz="2"/>
+              <w:left w:val="single" w:color="000000" w:sz="2"/>
+              <w:bottom w:val="single" w:color="000000" w:sz="2"/>
+              <w:right w:val="single" w:color="000000" w:sz="2"/>
+            </w:tcBorders>
+            <w:tcMar>
+              <w:top w:type="dxa" w:w="30"/>
+              <w:left w:type="dxa" w:w="60"/>
+              <w:bottom w:type="dxa" w:w="30"/>
+              <w:right w:type="dxa" w:w="60"/>
+            </w:tcMar>
+            <w:vAlign w:val="center"/>
+          </w:tcPr>
+          <w:p>
+            <w:pPr>
+              <w:spacing w:after="0" w:line="208"/>
+              <w:jc w:val="center"/>
+            </w:pPr>
+            <w:r>
+              <w:rPr>
+                <w:rFonts w:ascii="Times New Roman" w:cs="Times New Roman" w:eastAsia="Times New Roman" w:hAnsi="Times New Roman"/>
+                <w:b w:val="false"/>
+                <w:bCs w:val="false"/>
+                <w:sz w:val="16"/>
+                <w:szCs w:val="16"/>
+              </w:rPr>
+              <w:t xml:space="preserve">Apply-and-revert test; ids survive moves (Sec. III-C)</w:t>
+            </w:r>
+          </w:p>
+        </w:tc>
+      </w:tr>
+      <w:tr>
+        <w:trPr>
+          <w:cantSplit/>
+        </w:trPr>
+        <w:tc>
+          <w:tcPr>
+            <w:tcW w:type="dxa" w:w="2000"/>
+            <w:tcBorders>
+              <w:top w:val="single" w:color="000000" w:sz="2"/>
+              <w:left w:val="single" w:color="000000" w:sz="2"/>
+              <w:bottom w:val="single" w:color="000000" w:sz="2"/>
+              <w:right w:val="single" w:color="000000" w:sz="2"/>
+            </w:tcBorders>
+            <w:tcMar>
+              <w:top w:type="dxa" w:w="30"/>
+              <w:left w:type="dxa" w:w="60"/>
+              <w:bottom w:type="dxa" w:w="30"/>
+              <w:right w:type="dxa" w:w="60"/>
+            </w:tcMar>
+            <w:vAlign w:val="center"/>
+          </w:tcPr>
+          <w:p>
+            <w:pPr>
+              <w:spacing w:after="0" w:line="208"/>
+              <w:jc w:val="left"/>
+            </w:pPr>
+            <w:r>
+              <w:rPr>
+                <w:rFonts w:ascii="Times New Roman" w:cs="Times New Roman" w:eastAsia="Times New Roman" w:hAnsi="Times New Roman"/>
+                <w:b w:val="false"/>
+                <w:bCs w:val="false"/>
+                <w:sz w:val="16"/>
+                <w:szCs w:val="16"/>
+              </w:rPr>
+              <w:t xml:space="preserve">Checkable privacy audit</w:t>
+            </w:r>
+          </w:p>
+        </w:tc>
+        <w:tc>
+          <w:tcPr>
+            <w:tcW w:type="dxa" w:w="2900"/>
+            <w:tcBorders>
+              <w:top w:val="single" w:color="000000" w:sz="2"/>
+              <w:left w:val="single" w:color="000000" w:sz="2"/>
+              <w:bottom w:val="single" w:color="000000" w:sz="2"/>
+              <w:right w:val="single" w:color="000000" w:sz="2"/>
+            </w:tcBorders>
+            <w:tcMar>
+              <w:top w:type="dxa" w:w="30"/>
+              <w:left w:type="dxa" w:w="60"/>
+              <w:bottom w:type="dxa" w:w="30"/>
+              <w:right w:type="dxa" w:w="60"/>
+            </w:tcMar>
+            <w:vAlign w:val="center"/>
+          </w:tcPr>
+          <w:p>
+            <w:pPr>
+              <w:spacing w:after="0" w:line="208"/>
+              <w:jc w:val="center"/>
+            </w:pPr>
+            <w:r>
+              <w:rPr>
+                <w:rFonts w:ascii="Times New Roman" w:cs="Times New Roman" w:eastAsia="Times New Roman" w:hAnsi="Times New Roman"/>
+                <w:b w:val="false"/>
+                <w:bCs w:val="false"/>
+                <w:sz w:val="16"/>
+                <w:szCs w:val="16"/>
+              </w:rPr>
+              <w:t xml:space="preserve">An unverified claim that data stays local</w:t>
+            </w:r>
+          </w:p>
+        </w:tc>
+        <w:tc>
+          <w:tcPr>
+            <w:tcW w:type="dxa" w:w="2800"/>
+            <w:tcBorders>
+              <w:top w:val="single" w:color="000000" w:sz="2"/>
+              <w:left w:val="single" w:color="000000" w:sz="2"/>
+              <w:bottom w:val="single" w:color="000000" w:sz="2"/>
+              <w:right w:val="single" w:color="000000" w:sz="2"/>
+            </w:tcBorders>
+            <w:tcMar>
+              <w:top w:type="dxa" w:w="30"/>
+              <w:left w:type="dxa" w:w="60"/>
+              <w:bottom w:type="dxa" w:w="30"/>
+              <w:right w:type="dxa" w:w="60"/>
+            </w:tcMar>
+            <w:vAlign w:val="center"/>
+          </w:tcPr>
+          <w:p>
+            <w:pPr>
+              <w:spacing w:after="0" w:line="208"/>
+              <w:jc w:val="center"/>
+            </w:pPr>
+            <w:r>
+              <w:rPr>
+                <w:rFonts w:ascii="Times New Roman" w:cs="Times New Roman" w:eastAsia="Times New Roman" w:hAnsi="Times New Roman"/>
+                <w:b w:val="false"/>
+                <w:bCs w:val="false"/>
+                <w:sz w:val="16"/>
+                <w:szCs w:val="16"/>
+              </w:rPr>
+              <w:t xml:space="preserve">Lists every endpoint from live configuration; names a netstat check that can falsify it</w:t>
+            </w:r>
+          </w:p>
+        </w:tc>
+        <w:tc>
+          <w:tcPr>
+            <w:tcW w:type="dxa" w:w="2740"/>
+            <w:tcBorders>
+              <w:top w:val="single" w:color="000000" w:sz="2"/>
+              <w:left w:val="single" w:color="000000" w:sz="2"/>
+              <w:bottom w:val="single" w:color="000000" w:sz="2"/>
+              <w:right w:val="single" w:color="000000" w:sz="2"/>
+            </w:tcBorders>
+            <w:tcMar>
+              <w:top w:type="dxa" w:w="30"/>
+              <w:left w:type="dxa" w:w="60"/>
+              <w:bottom w:type="dxa" w:w="30"/>
+              <w:right w:type="dxa" w:w="60"/>
+            </w:tcMar>
+            <w:vAlign w:val="center"/>
+          </w:tcPr>
+          <w:p>
+            <w:pPr>
+              <w:spacing w:after="0" w:line="208"/>
+              <w:jc w:val="center"/>
+            </w:pPr>
+            <w:r>
+              <w:rPr>
+                <w:rFonts w:ascii="Times New Roman" w:cs="Times New Roman" w:eastAsia="Times New Roman" w:hAnsi="Times New Roman"/>
+                <w:b w:val="false"/>
+                <w:bCs w:val="false"/>
+                <w:sz w:val="16"/>
+                <w:szCs w:val="16"/>
+              </w:rPr>
+              <w:t xml:space="preserve">Sec. IV-D; every endpoint is loopback</w:t>
+            </w:r>
+          </w:p>
+        </w:tc>
+      </w:tr>
+    </w:tbl>
+    <w:p>
+      <w:pPr>
+        <w:sectPr>
+          <w:footerReference w:type="default" r:id="rId13"/>
+          <w:type w:val="continuous"/>
+          <w:pgSz w:w="12240" w:h="15840" w:orient="portrait"/>
+          <w:pgMar w:top="1080" w:right="900" w:bottom="1440" w:left="900" w:header="708" w:footer="708" w:gutter="0"/>
+          <w:pgNumType/>
+          <w:docGrid w:linePitch="360"/>
+        </w:sectPr>
+      </w:pPr>
+    </w:p>
+    <w:p>
+      <w:pPr>
+        <w:keepNext/>
+        <w:spacing w:after="70" w:before="140"/>
+        <w:jc w:val="center"/>
+      </w:pPr>
+      <w:r>
+        <w:rPr>
+          <w:rFonts w:ascii="Times New Roman" w:cs="Times New Roman" w:eastAsia="Times New Roman" w:hAnsi="Times New Roman"/>
+          <w:b/>
+          <w:bCs/>
+          <w:sz w:val="20"/>
+          <w:szCs w:val="20"/>
+        </w:rPr>
+        <w:t xml:space="preserve">IV. METHODS</w:t>
+      </w:r>
+    </w:p>
+    <w:p>
+      <w:pPr>
+        <w:keepNext/>
+        <w:spacing w:after="30" w:before="80"/>
+      </w:pPr>
+      <w:r>
+        <w:rPr>
+          <w:rFonts w:ascii="Times New Roman" w:cs="Times New Roman" w:eastAsia="Times New Roman" w:hAnsi="Times New Roman"/>
+          <w:b/>
+          <w:bCs/>
+          <w:i/>
+          <w:iCs/>
+          <w:sz w:val="20"/>
+          <w:szCs w:val="20"/>
+        </w:rPr>
+        <w:t xml:space="preserve">A. Semantic search</w:t>
+      </w:r>
+    </w:p>
+    <w:p>
+      <w:pPr>
+        <w:spacing w:after="0" w:line="230"/>
+        <w:ind w:firstLine="280"/>
+        <w:jc w:val="both"/>
+      </w:pPr>
+      <w:r>
+        <w:rPr>
+          <w:rFonts w:ascii="Times New Roman" w:cs="Times New Roman" w:eastAsia="Times New Roman" w:hAnsi="Times New Roman"/>
+          <w:sz w:val="20"/>
+          <w:szCs w:val="20"/>
+        </w:rPr>
+        <w:t xml:space="preserve">A query q is embedded and compared with every chunk c. A file f takes the score of its best chunk, plus a small boost for literal vocabulary overlap, where Q is the query's content words (stop-words removed, plurals folded) and T_f the words of the file's name and text:</w:t>
+      </w:r>
+    </w:p>
+    <w:p>
+      <w:pPr>
+        <w:spacing w:after="30" w:before="30"/>
+        <w:jc w:val="center"/>
+      </w:pPr>
+      <w:r>
+        <w:rPr>
+          <w:rFonts w:ascii="Times New Roman" w:cs="Times New Roman" w:eastAsia="Times New Roman" w:hAnsi="Times New Roman"/>
+          <w:i/>
+          <w:iCs/>
+          <w:sz w:val="20"/>
+          <w:szCs w:val="20"/>
+        </w:rPr>
+        <w:t xml:space="preserve">s(f) = max_c cos(e_q, e_c) + λ · |Q ∩ T_f| / |Q|</w:t>
+      </w:r>
+      <w:r>
+        <w:rPr>
+          <w:rFonts w:ascii="Times New Roman" w:cs="Times New Roman" w:eastAsia="Times New Roman" w:hAnsi="Times New Roman"/>
+          <w:sz w:val="20"/>
+          <w:szCs w:val="20"/>
+        </w:rPr>
+        <w:t xml:space="preserve">        (1)</w:t>
+      </w:r>
+    </w:p>
+    <w:p>
+      <w:pPr>
+        <w:spacing w:after="30" w:before="30"/>
+        <w:jc w:val="center"/>
+      </w:pPr>
+      <w:r>
+        <w:rPr>
+          <w:rFonts w:ascii="Times New Roman" w:cs="Times New Roman" w:eastAsia="Times New Roman" w:hAnsi="Times New Roman"/>
+          <w:i/>
+          <w:iCs/>
+          <w:sz w:val="20"/>
+          <w:szCs w:val="20"/>
+        </w:rPr>
+        <w:t xml:space="preserve">keep f  iff  s(f) ≥ max(τ, s* − δ)</w:t>
+      </w:r>
+      <w:r>
+        <w:rPr>
+          <w:rFonts w:ascii="Times New Roman" w:cs="Times New Roman" w:eastAsia="Times New Roman" w:hAnsi="Times New Roman"/>
+          <w:sz w:val="20"/>
+          <w:szCs w:val="20"/>
+        </w:rPr>
+        <w:t xml:space="preserve">        (2)</w:t>
+      </w:r>
+    </w:p>
+    <w:p>
+      <w:pPr>
+        <w:spacing w:after="0" w:line="230"/>
+        <w:jc w:val="both"/>
+      </w:pPr>
+      <w:r>
+        <w:rPr>
+          <w:rFonts w:ascii="Times New Roman" w:cs="Times New Roman" w:eastAsia="Times New Roman" w:hAnsi="Times New Roman"/>
+          <w:sz w:val="20"/>
+          <w:szCs w:val="20"/>
+        </w:rPr>
+        <w:t xml:space="preserve">with floor τ = 0.47, margin δ = 0.06 below the best score s*, and λ = 0.08. A fixed cut-off was abandoned because it dropped short-query answers on an earlier 31-query development set over the same vault (the target returned for 20 of its 27 on-topic queries, against 27 of 27 with the relative rule). Results below a confidence bar of 0.55 are labelled low-confidence, and the open action never launches a file from such a result.</w:t>
+      </w:r>
+    </w:p>
+    <w:p>
+      <w:pPr>
+        <w:keepNext/>
+        <w:spacing w:after="30" w:before="80"/>
+      </w:pPr>
+      <w:r>
+        <w:rPr>
+          <w:rFonts w:ascii="Times New Roman" w:cs="Times New Roman" w:eastAsia="Times New Roman" w:hAnsi="Times New Roman"/>
+          <w:b/>
+          <w:bCs/>
+          <w:i/>
+          <w:iCs/>
+          <w:sz w:val="20"/>
+          <w:szCs w:val="20"/>
+        </w:rPr>
+        <w:t xml:space="preserve">B. Knowledge graph</w:t>
+      </w:r>
+    </w:p>
+    <w:p>
+      <w:pPr>
+        <w:spacing w:after="0" w:line="230"/>
+        <w:ind w:firstLine="280"/>
+        <w:jc w:val="both"/>
+      </w:pPr>
+      <w:r>
+        <w:rPr>
+          <w:rFonts w:ascii="Times New Roman" w:cs="Times New Roman" w:eastAsia="Times New Roman" w:hAnsi="Times New Roman"/>
+          <w:sz w:val="20"/>
+          <w:szCs w:val="20"/>
+        </w:rPr>
+        <w:t xml:space="preserve">Three typed, weighted edge kinds connect files: similar (cosine of mean chunk embeddings), references (one file's text names another by file name) and shared_tag (at least two AI-generated tags in common). Raw cosine is compressed by anisotropy, so vectors are first mean-centred, ĥ_f = (h_f − μ) / ‖h_f − μ‖, which spreads unrelated pairs to about 0 and related pairs to 0.25-0.4; the similar-edge threshold is 0.25 on that scale and each file keeps its three strongest neighbours. Clusters use average-linkage merging, joining two groups only while the mean edge weight between their members, counting missing edges as 0, exceeds 0.12. Plain connected components chained unrelated groups through single weak bridges (a 7-file cluster mixing resumes with proposals); average linkage cannot chain.</w:t>
+      </w:r>
+    </w:p>
+    <w:p>
+      <w:pPr>
+        <w:spacing w:after="0" w:line="230"/>
+        <w:ind w:firstLine="280"/>
+        <w:jc w:val="both"/>
+      </w:pPr>
+      <w:r>
+        <w:rPr>
+          <w:rFonts w:ascii="Times New Roman" w:cs="Times New Roman" w:eastAsia="Times New Roman" w:hAnsi="Times New Roman"/>
+          <w:sz w:val="20"/>
+          <w:szCs w:val="20"/>
+        </w:rPr>
+        <w:t xml:space="preserve">The pairwise similarity loop was replaced by one matrix product, S = ĤĤ^T, and two further all-pairs steps by a token index (the reference check, which was 98% of the 5,000-file rebuild) and a heap over per-group adjacency (the clustering). Each was checked against its original definition on random data; ties in clustering are broken by lowest group id (Sec. VI-C).</w:t>
+      </w:r>
+    </w:p>
+    <w:p>
+      <w:pPr>
+        <w:keepNext/>
+        <w:spacing w:after="30" w:before="80"/>
+      </w:pPr>
+      <w:r>
+        <w:rPr>
+          <w:rFonts w:ascii="Times New Roman" w:cs="Times New Roman" w:eastAsia="Times New Roman" w:hAnsi="Times New Roman"/>
+          <w:b/>
+          <w:bCs/>
+          <w:i/>
+          <w:iCs/>
+          <w:sz w:val="20"/>
+          <w:szCs w:val="20"/>
+        </w:rPr>
+        <w:t xml:space="preserve">C. Context memory and evidence-before-model precedence</w:t>
+      </w:r>
+    </w:p>
+    <w:p>
+      <w:pPr>
+        <w:spacing w:after="0" w:line="230"/>
+        <w:ind w:firstLine="280"/>
+        <w:jc w:val="both"/>
+      </w:pPr>
+      <w:r>
+        <w:rPr>
+          <w:rFonts w:ascii="Times New Roman" w:cs="Times New Roman" w:eastAsia="Times New Roman" w:hAnsi="Times New Roman"/>
+          <w:sz w:val="20"/>
+          <w:szCs w:val="20"/>
+        </w:rPr>
+        <w:t xml:space="preserve">Each turn is stored with the identifiers of the files it showed, so follow-ups such as "open the second one" resolve after a restart or a file move. Fig. 3 gives the order: ordinal and bare-pronoun rules, then a direct search on the topic the classifier extracted, and only if that search is below the confidence bar the model's own "refers to previous" flag as a last resort.</w:t>
+      </w:r>
+    </w:p>
+    <w:p>
+      <w:pPr>
+        <w:keepNext/>
+        <w:spacing w:after="0" w:before="80"/>
+        <w:jc w:val="center"/>
+      </w:pPr>
+      <w:r>
+        <w:drawing>
+          <wp:inline distT="0" distB="0" distL="0" distR="0">
+            <wp:extent cx="1724025" cy="1495425"/>
             <wp:effectExtent t="0" r="0" b="0" l="0"/>
             <wp:docPr id="1" name="" descr="" title=""/>
             <wp:cNvGraphicFramePr>
@@ -2637,7 +3862,7 @@
                   <pic:spPr bwMode="auto">
                     <a:xfrm>
                       <a:off x="0" y="0"/>
-                      <a:ext cx="4238625" cy="1847850"/>
+                      <a:ext cx="1724025" cy="1495425"/>
                     </a:xfrm>
                     <a:prstGeom prst="rect">
                       <a:avLst/>
@@ -2663,7 +3888,7 @@
           <w:sz w:val="16"/>
           <w:szCs w:val="16"/>
         </w:rPr>
-        <w:t xml:space="preserve">Fig. 1. </w:t>
+        <w:t xml:space="preserve">Fig. 3. </w:t>
       </w:r>
       <w:r>
         <w:rPr>
@@ -2671,91 +3896,22 @@
           <w:sz w:val="16"/>
           <w:szCs w:val="16"/>
         </w:rPr>
-        <w:t xml:space="preserve">DreamOS architecture. A desktop client talks over loopback HTTP to a local service with eight components (blue: request modules; green: supporting modules). The service calls a local model runtime and three local stores. Nothing in the path leaves the machine.</w:t>
-      </w:r>
-    </w:p>
-    <w:p>
-      <w:pPr>
-        <w:keepNext/>
-        <w:spacing w:after="0" w:before="80"/>
-        <w:jc w:val="center"/>
-      </w:pPr>
-      <w:r>
-        <w:drawing>
-          <wp:inline distT="0" distB="0" distL="0" distR="0">
-            <wp:extent cx="4638675" cy="1295400"/>
-            <wp:effectExtent t="0" r="0" b="0" l="0"/>
-            <wp:docPr id="1" name="" descr="" title=""/>
-            <wp:cNvGraphicFramePr>
-              <a:graphicFrameLocks xmlns:a="http://schemas.openxmlformats.org/drawingml/2006/main" noChangeAspect="1"/>
-            </wp:cNvGraphicFramePr>
-            <a:graphic xmlns:a="http://schemas.openxmlformats.org/drawingml/2006/main">
-              <a:graphicData uri="http://schemas.openxmlformats.org/drawingml/2006/picture">
-                <pic:pic xmlns:pic="http://schemas.openxmlformats.org/drawingml/2006/picture">
-                  <pic:nvPicPr>
-                    <pic:cNvPr id="0" name="" descr=""/>
-                    <pic:cNvPicPr>
-                      <a:picLocks noChangeAspect="1" noChangeArrowheads="1"/>
-                    </pic:cNvPicPr>
-                  </pic:nvPicPr>
-                  <pic:blipFill>
-                    <a:blip r:embed="rId26" cstate="none"/>
-                    <a:srcRect/>
-                    <a:stretch>
-                      <a:fillRect/>
-                    </a:stretch>
-                  </pic:blipFill>
-                  <pic:spPr bwMode="auto">
-                    <a:xfrm>
-                      <a:off x="0" y="0"/>
-                      <a:ext cx="4638675" cy="1295400"/>
-                    </a:xfrm>
-                    <a:prstGeom prst="rect">
-                      <a:avLst/>
-                    </a:prstGeom>
-                  </pic:spPr>
-                </pic:pic>
-              </a:graphicData>
-            </a:graphic>
-          </wp:inline>
-        </w:drawing>
-      </w:r>
-    </w:p>
-    <w:p>
-      <w:pPr>
-        <w:spacing w:after="110" w:before="50" w:line="216"/>
+        <w:t xml:space="preserve">Follow-up resolution flowchart. Amber: decisions, evaluated top to bottom; green: outcomes. Deterministic evidence precedes the language model's own judgement.</w:t>
+      </w:r>
+    </w:p>
+    <w:p>
+      <w:pPr>
+        <w:spacing w:after="0" w:line="230"/>
         <w:jc w:val="both"/>
       </w:pPr>
       <w:r>
         <w:rPr>
           <w:rFonts w:ascii="Times New Roman" w:cs="Times New Roman" w:eastAsia="Times New Roman" w:hAnsi="Times New Roman"/>
-          <w:b/>
-          <w:bCs/>
-          <w:sz w:val="16"/>
-          <w:szCs w:val="16"/>
-        </w:rPr>
-        <w:t xml:space="preserve">Fig. 2. </w:t>
-      </w:r>
-      <w:r>
-        <w:rPr>
-          <w:rFonts w:ascii="Times New Roman" w:cs="Times New Roman" w:eastAsia="Times New Roman" w:hAnsi="Times New Roman"/>
-          <w:sz w:val="16"/>
-          <w:szCs w:val="16"/>
-        </w:rPr>
-        <w:t xml:space="preserve">(a) The indexing pipeline turns files into vectors, summaries, tags and graph edges. (b) The query pipeline classifies a message, resolves references (amber: the step that carries the paper's precedence rule), and routes to one of five actions.</w:t>
-      </w:r>
-    </w:p>
-    <w:p>
-      <w:pPr>
-        <w:sectPr>
-          <w:footerReference w:type="default" r:id="rId11"/>
-          <w:type w:val="continuous"/>
-          <w:pgSz w:w="12240" w:h="15840" w:orient="portrait"/>
-          <w:pgMar w:top="1080" w:right="900" w:bottom="1440" w:left="900" w:header="708" w:footer="708" w:gutter="0"/>
-          <w:pgNumType/>
-          <w:docGrid w:linePitch="360"/>
-        </w:sectPr>
-      </w:pPr>
+          <w:sz w:val="20"/>
+          <w:szCs w:val="20"/>
+        </w:rPr>
+        <w:t xml:space="preserve">The order was fixed after a live rehearsal. Asked "what is related to my resume" after a search for invoices, the system answered about an invoice file: the 3B model set its continuation flag for this sentence while correctly extracting "resume" as the topic, apparently because the sentence matched an example in its own instructions, and the system had trusted the flag unconditionally. A regression test fails on the old precedence and passes on the new.</w:t>
+      </w:r>
     </w:p>
     <w:p>
       <w:pPr>
@@ -2772,7 +3928,7 @@
           <w:sz w:val="20"/>
           <w:szCs w:val="20"/>
         </w:rPr>
-        <w:t xml:space="preserve">C. Data model</w:t>
+        <w:t xml:space="preserve">D. Privacy audit</w:t>
       </w:r>
     </w:p>
     <w:p>
@@ -2787,829 +3943,8 @@
           <w:sz w:val="20"/>
           <w:szCs w:val="20"/>
         </w:rPr>
-        <w:t xml:space="preserve">Table II lists the design tables. Every derived table (edges, turns, usage, workspace membership) is keyed on the file's integer identifier, not its path. The organiser renames files when it moves them, but the identifier survives, so relationships and memory never need re-synchronising after a move, and a move can be reversed from the stored original path.</w:t>
-      </w:r>
-    </w:p>
-    <w:p>
-      <w:pPr>
-        <w:sectPr>
-          <w:footerReference w:type="default" r:id="rId12"/>
-          <w:type w:val="continuous"/>
-          <w:pgSz w:w="12240" w:h="15840" w:orient="portrait"/>
-          <w:pgMar w:top="1080" w:right="900" w:bottom="1440" w:left="900" w:header="708" w:footer="708" w:gutter="0"/>
-          <w:pgNumType/>
-          <w:cols w:space="360" w:num="2"/>
-          <w:docGrid w:linePitch="360"/>
-        </w:sectPr>
-      </w:pPr>
-    </w:p>
-    <w:p>
-      <w:pPr>
-        <w:keepNext/>
-        <w:spacing w:after="50" w:before="90" w:line="216"/>
-        <w:jc w:val="center"/>
-      </w:pPr>
-      <w:r>
-        <w:rPr>
-          <w:rFonts w:ascii="Times New Roman" w:cs="Times New Roman" w:eastAsia="Times New Roman" w:hAnsi="Times New Roman"/>
-          <w:b/>
-          <w:bCs/>
-          <w:sz w:val="16"/>
-          <w:szCs w:val="16"/>
-        </w:rPr>
-        <w:t xml:space="preserve">TABLE II</w:t>
-      </w:r>
-      <w:r>
-        <w:rPr>
-          <w:rFonts w:ascii="Times New Roman" w:cs="Times New Roman" w:eastAsia="Times New Roman" w:hAnsi="Times New Roman"/>
-          <w:sz w:val="16"/>
-          <w:szCs w:val="16"/>
-        </w:rPr>
-        <w:t xml:space="preserve">. Database Design: Tables, Key Fields and Role</w:t>
-      </w:r>
-    </w:p>
-    <w:tbl>
-      <w:tblPr>
-        <w:tblW w:type="dxa" w:w="10080"/>
-        <w:tblBorders>
-          <w:top w:val="single" w:color="auto" w:sz="4"/>
-          <w:left w:val="single" w:color="auto" w:sz="4"/>
-          <w:bottom w:val="single" w:color="auto" w:sz="4"/>
-          <w:right w:val="single" w:color="auto" w:sz="4"/>
-          <w:insideH w:val="single" w:color="auto" w:sz="4"/>
-          <w:insideV w:val="single" w:color="auto" w:sz="4"/>
-        </w:tblBorders>
-      </w:tblPr>
-      <w:tblGrid>
-        <w:gridCol w:w="2200"/>
-        <w:gridCol w:w="4600"/>
-        <w:gridCol w:w="3280"/>
-      </w:tblGrid>
-      <w:tr>
-        <w:trPr>
-          <w:cantSplit/>
-          <w:tblHeader/>
-        </w:trPr>
-        <w:tc>
-          <w:tcPr>
-            <w:tcW w:type="dxa" w:w="2200"/>
-            <w:tcBorders>
-              <w:top w:val="single" w:color="000000" w:sz="2"/>
-              <w:left w:val="single" w:color="000000" w:sz="2"/>
-              <w:bottom w:val="single" w:color="000000" w:sz="2"/>
-              <w:right w:val="single" w:color="000000" w:sz="2"/>
-            </w:tcBorders>
-            <w:shd w:fill="E6E6E6" w:val="clear"/>
-            <w:tcMar>
-              <w:top w:type="dxa" w:w="30"/>
-              <w:left w:type="dxa" w:w="60"/>
-              <w:bottom w:type="dxa" w:w="30"/>
-              <w:right w:type="dxa" w:w="60"/>
-            </w:tcMar>
-            <w:vAlign w:val="center"/>
-          </w:tcPr>
-          <w:p>
-            <w:pPr>
-              <w:spacing w:after="0" w:line="208"/>
-              <w:jc w:val="center"/>
-            </w:pPr>
-            <w:r>
-              <w:rPr>
-                <w:rFonts w:ascii="Times New Roman" w:cs="Times New Roman" w:eastAsia="Times New Roman" w:hAnsi="Times New Roman"/>
-                <w:b/>
-                <w:bCs/>
-                <w:sz w:val="16"/>
-                <w:szCs w:val="16"/>
-              </w:rPr>
-              <w:t xml:space="preserve">Store / table</w:t>
-            </w:r>
-          </w:p>
-        </w:tc>
-        <w:tc>
-          <w:tcPr>
-            <w:tcW w:type="dxa" w:w="4600"/>
-            <w:tcBorders>
-              <w:top w:val="single" w:color="000000" w:sz="2"/>
-              <w:left w:val="single" w:color="000000" w:sz="2"/>
-              <w:bottom w:val="single" w:color="000000" w:sz="2"/>
-              <w:right w:val="single" w:color="000000" w:sz="2"/>
-            </w:tcBorders>
-            <w:shd w:fill="E6E6E6" w:val="clear"/>
-            <w:tcMar>
-              <w:top w:type="dxa" w:w="30"/>
-              <w:left w:type="dxa" w:w="60"/>
-              <w:bottom w:type="dxa" w:w="30"/>
-              <w:right w:type="dxa" w:w="60"/>
-            </w:tcMar>
-            <w:vAlign w:val="center"/>
-          </w:tcPr>
-          <w:p>
-            <w:pPr>
-              <w:spacing w:after="0" w:line="208"/>
-              <w:jc w:val="center"/>
-            </w:pPr>
-            <w:r>
-              <w:rPr>
-                <w:rFonts w:ascii="Times New Roman" w:cs="Times New Roman" w:eastAsia="Times New Roman" w:hAnsi="Times New Roman"/>
-                <w:b/>
-                <w:bCs/>
-                <w:sz w:val="16"/>
-                <w:szCs w:val="16"/>
-              </w:rPr>
-              <w:t xml:space="preserve">Key fields</w:t>
-            </w:r>
-          </w:p>
-        </w:tc>
-        <w:tc>
-          <w:tcPr>
-            <w:tcW w:type="dxa" w:w="3280"/>
-            <w:tcBorders>
-              <w:top w:val="single" w:color="000000" w:sz="2"/>
-              <w:left w:val="single" w:color="000000" w:sz="2"/>
-              <w:bottom w:val="single" w:color="000000" w:sz="2"/>
-              <w:right w:val="single" w:color="000000" w:sz="2"/>
-            </w:tcBorders>
-            <w:shd w:fill="E6E6E6" w:val="clear"/>
-            <w:tcMar>
-              <w:top w:type="dxa" w:w="30"/>
-              <w:left w:type="dxa" w:w="60"/>
-              <w:bottom w:type="dxa" w:w="30"/>
-              <w:right w:type="dxa" w:w="60"/>
-            </w:tcMar>
-            <w:vAlign w:val="center"/>
-          </w:tcPr>
-          <w:p>
-            <w:pPr>
-              <w:spacing w:after="0" w:line="208"/>
-              <w:jc w:val="center"/>
-            </w:pPr>
-            <w:r>
-              <w:rPr>
-                <w:rFonts w:ascii="Times New Roman" w:cs="Times New Roman" w:eastAsia="Times New Roman" w:hAnsi="Times New Roman"/>
-                <w:b/>
-                <w:bCs/>
-                <w:sz w:val="16"/>
-                <w:szCs w:val="16"/>
-              </w:rPr>
-              <w:t xml:space="preserve">Role</w:t>
-            </w:r>
-          </w:p>
-        </w:tc>
-      </w:tr>
-      <w:tr>
-        <w:trPr>
-          <w:cantSplit/>
-        </w:trPr>
-        <w:tc>
-          <w:tcPr>
-            <w:tcW w:type="dxa" w:w="2200"/>
-            <w:tcBorders>
-              <w:top w:val="single" w:color="000000" w:sz="2"/>
-              <w:left w:val="single" w:color="000000" w:sz="2"/>
-              <w:bottom w:val="single" w:color="000000" w:sz="2"/>
-              <w:right w:val="single" w:color="000000" w:sz="2"/>
-            </w:tcBorders>
-            <w:tcMar>
-              <w:top w:type="dxa" w:w="30"/>
-              <w:left w:type="dxa" w:w="60"/>
-              <w:bottom w:type="dxa" w:w="30"/>
-              <w:right w:type="dxa" w:w="60"/>
-            </w:tcMar>
-            <w:vAlign w:val="center"/>
-          </w:tcPr>
-          <w:p>
-            <w:pPr>
-              <w:spacing w:after="0" w:line="208"/>
-              <w:jc w:val="left"/>
-            </w:pPr>
-            <w:r>
-              <w:rPr>
-                <w:rFonts w:ascii="Times New Roman" w:cs="Times New Roman" w:eastAsia="Times New Roman" w:hAnsi="Times New Roman"/>
-                <w:b w:val="false"/>
-                <w:bCs w:val="false"/>
-                <w:sz w:val="16"/>
-                <w:szCs w:val="16"/>
-              </w:rPr>
-              <w:t xml:space="preserve">SQLite / files</w:t>
-            </w:r>
-          </w:p>
-        </w:tc>
-        <w:tc>
-          <w:tcPr>
-            <w:tcW w:type="dxa" w:w="4600"/>
-            <w:tcBorders>
-              <w:top w:val="single" w:color="000000" w:sz="2"/>
-              <w:left w:val="single" w:color="000000" w:sz="2"/>
-              <w:bottom w:val="single" w:color="000000" w:sz="2"/>
-              <w:right w:val="single" w:color="000000" w:sz="2"/>
-            </w:tcBorders>
-            <w:tcMar>
-              <w:top w:type="dxa" w:w="30"/>
-              <w:left w:type="dxa" w:w="60"/>
-              <w:bottom w:type="dxa" w:w="30"/>
-              <w:right w:type="dxa" w:w="60"/>
-            </w:tcMar>
-            <w:vAlign w:val="center"/>
-          </w:tcPr>
-          <w:p>
-            <w:pPr>
-              <w:spacing w:after="0" w:line="208"/>
-              <w:jc w:val="center"/>
-            </w:pPr>
-            <w:r>
-              <w:rPr>
-                <w:rFonts w:ascii="Times New Roman" w:cs="Times New Roman" w:eastAsia="Times New Roman" w:hAnsi="Times New Roman"/>
-                <w:b w:val="false"/>
-                <w:bCs w:val="false"/>
-                <w:sz w:val="16"/>
-                <w:szCs w:val="16"/>
-              </w:rPr>
-              <w:t xml:space="preserve">id (PK), path (unique), original_path, content_hash, summary, tags, category</w:t>
-            </w:r>
-          </w:p>
-        </w:tc>
-        <w:tc>
-          <w:tcPr>
-            <w:tcW w:type="dxa" w:w="3280"/>
-            <w:tcBorders>
-              <w:top w:val="single" w:color="000000" w:sz="2"/>
-              <w:left w:val="single" w:color="000000" w:sz="2"/>
-              <w:bottom w:val="single" w:color="000000" w:sz="2"/>
-              <w:right w:val="single" w:color="000000" w:sz="2"/>
-            </w:tcBorders>
-            <w:tcMar>
-              <w:top w:type="dxa" w:w="30"/>
-              <w:left w:type="dxa" w:w="60"/>
-              <w:bottom w:type="dxa" w:w="30"/>
-              <w:right w:type="dxa" w:w="60"/>
-            </w:tcMar>
-            <w:vAlign w:val="center"/>
-          </w:tcPr>
-          <w:p>
-            <w:pPr>
-              <w:spacing w:after="0" w:line="208"/>
-              <w:jc w:val="center"/>
-            </w:pPr>
-            <w:r>
-              <w:rPr>
-                <w:rFonts w:ascii="Times New Roman" w:cs="Times New Roman" w:eastAsia="Times New Roman" w:hAnsi="Times New Roman"/>
-                <w:b w:val="false"/>
-                <w:bCs w:val="false"/>
-                <w:sz w:val="16"/>
-                <w:szCs w:val="16"/>
-              </w:rPr>
-              <w:t xml:space="preserve">One row per file; stable identity</w:t>
-            </w:r>
-          </w:p>
-        </w:tc>
-      </w:tr>
-      <w:tr>
-        <w:trPr>
-          <w:cantSplit/>
-        </w:trPr>
-        <w:tc>
-          <w:tcPr>
-            <w:tcW w:type="dxa" w:w="2200"/>
-            <w:tcBorders>
-              <w:top w:val="single" w:color="000000" w:sz="2"/>
-              <w:left w:val="single" w:color="000000" w:sz="2"/>
-              <w:bottom w:val="single" w:color="000000" w:sz="2"/>
-              <w:right w:val="single" w:color="000000" w:sz="2"/>
-            </w:tcBorders>
-            <w:tcMar>
-              <w:top w:type="dxa" w:w="30"/>
-              <w:left w:type="dxa" w:w="60"/>
-              <w:bottom w:type="dxa" w:w="30"/>
-              <w:right w:type="dxa" w:w="60"/>
-            </w:tcMar>
-            <w:vAlign w:val="center"/>
-          </w:tcPr>
-          <w:p>
-            <w:pPr>
-              <w:spacing w:after="0" w:line="208"/>
-              <w:jc w:val="left"/>
-            </w:pPr>
-            <w:r>
-              <w:rPr>
-                <w:rFonts w:ascii="Times New Roman" w:cs="Times New Roman" w:eastAsia="Times New Roman" w:hAnsi="Times New Roman"/>
-                <w:b w:val="false"/>
-                <w:bCs w:val="false"/>
-                <w:sz w:val="16"/>
-                <w:szCs w:val="16"/>
-              </w:rPr>
-              <w:t xml:space="preserve">SQLite / file_edges</w:t>
-            </w:r>
-          </w:p>
-        </w:tc>
-        <w:tc>
-          <w:tcPr>
-            <w:tcW w:type="dxa" w:w="4600"/>
-            <w:tcBorders>
-              <w:top w:val="single" w:color="000000" w:sz="2"/>
-              <w:left w:val="single" w:color="000000" w:sz="2"/>
-              <w:bottom w:val="single" w:color="000000" w:sz="2"/>
-              <w:right w:val="single" w:color="000000" w:sz="2"/>
-            </w:tcBorders>
-            <w:tcMar>
-              <w:top w:type="dxa" w:w="30"/>
-              <w:left w:type="dxa" w:w="60"/>
-              <w:bottom w:type="dxa" w:w="30"/>
-              <w:right w:type="dxa" w:w="60"/>
-            </w:tcMar>
-            <w:vAlign w:val="center"/>
-          </w:tcPr>
-          <w:p>
-            <w:pPr>
-              <w:spacing w:after="0" w:line="208"/>
-              <w:jc w:val="center"/>
-            </w:pPr>
-            <w:r>
-              <w:rPr>
-                <w:rFonts w:ascii="Times New Roman" w:cs="Times New Roman" w:eastAsia="Times New Roman" w:hAnsi="Times New Roman"/>
-                <w:b w:val="false"/>
-                <w:bCs w:val="false"/>
-                <w:sz w:val="16"/>
-                <w:szCs w:val="16"/>
-              </w:rPr>
-              <w:t xml:space="preserve">src_id, dst_id, kind, weight</w:t>
-            </w:r>
-          </w:p>
-        </w:tc>
-        <w:tc>
-          <w:tcPr>
-            <w:tcW w:type="dxa" w:w="3280"/>
-            <w:tcBorders>
-              <w:top w:val="single" w:color="000000" w:sz="2"/>
-              <w:left w:val="single" w:color="000000" w:sz="2"/>
-              <w:bottom w:val="single" w:color="000000" w:sz="2"/>
-              <w:right w:val="single" w:color="000000" w:sz="2"/>
-            </w:tcBorders>
-            <w:tcMar>
-              <w:top w:type="dxa" w:w="30"/>
-              <w:left w:type="dxa" w:w="60"/>
-              <w:bottom w:type="dxa" w:w="30"/>
-              <w:right w:type="dxa" w:w="60"/>
-            </w:tcMar>
-            <w:vAlign w:val="center"/>
-          </w:tcPr>
-          <w:p>
-            <w:pPr>
-              <w:spacing w:after="0" w:line="208"/>
-              <w:jc w:val="center"/>
-            </w:pPr>
-            <w:r>
-              <w:rPr>
-                <w:rFonts w:ascii="Times New Roman" w:cs="Times New Roman" w:eastAsia="Times New Roman" w:hAnsi="Times New Roman"/>
-                <w:b w:val="false"/>
-                <w:bCs w:val="false"/>
-                <w:sz w:val="16"/>
-                <w:szCs w:val="16"/>
-              </w:rPr>
-              <w:t xml:space="preserve">similar, references, shared_tag</w:t>
-            </w:r>
-          </w:p>
-        </w:tc>
-      </w:tr>
-      <w:tr>
-        <w:trPr>
-          <w:cantSplit/>
-        </w:trPr>
-        <w:tc>
-          <w:tcPr>
-            <w:tcW w:type="dxa" w:w="2200"/>
-            <w:tcBorders>
-              <w:top w:val="single" w:color="000000" w:sz="2"/>
-              <w:left w:val="single" w:color="000000" w:sz="2"/>
-              <w:bottom w:val="single" w:color="000000" w:sz="2"/>
-              <w:right w:val="single" w:color="000000" w:sz="2"/>
-            </w:tcBorders>
-            <w:tcMar>
-              <w:top w:type="dxa" w:w="30"/>
-              <w:left w:type="dxa" w:w="60"/>
-              <w:bottom w:type="dxa" w:w="30"/>
-              <w:right w:type="dxa" w:w="60"/>
-            </w:tcMar>
-            <w:vAlign w:val="center"/>
-          </w:tcPr>
-          <w:p>
-            <w:pPr>
-              <w:spacing w:after="0" w:line="208"/>
-              <w:jc w:val="left"/>
-            </w:pPr>
-            <w:r>
-              <w:rPr>
-                <w:rFonts w:ascii="Times New Roman" w:cs="Times New Roman" w:eastAsia="Times New Roman" w:hAnsi="Times New Roman"/>
-                <w:b w:val="false"/>
-                <w:bCs w:val="false"/>
-                <w:sz w:val="16"/>
-                <w:szCs w:val="16"/>
-              </w:rPr>
-              <w:t xml:space="preserve">SQLite / conversation_turns</w:t>
-            </w:r>
-          </w:p>
-        </w:tc>
-        <w:tc>
-          <w:tcPr>
-            <w:tcW w:type="dxa" w:w="4600"/>
-            <w:tcBorders>
-              <w:top w:val="single" w:color="000000" w:sz="2"/>
-              <w:left w:val="single" w:color="000000" w:sz="2"/>
-              <w:bottom w:val="single" w:color="000000" w:sz="2"/>
-              <w:right w:val="single" w:color="000000" w:sz="2"/>
-            </w:tcBorders>
-            <w:tcMar>
-              <w:top w:type="dxa" w:w="30"/>
-              <w:left w:type="dxa" w:w="60"/>
-              <w:bottom w:type="dxa" w:w="30"/>
-              <w:right w:type="dxa" w:w="60"/>
-            </w:tcMar>
-            <w:vAlign w:val="center"/>
-          </w:tcPr>
-          <w:p>
-            <w:pPr>
-              <w:spacing w:after="0" w:line="208"/>
-              <w:jc w:val="center"/>
-            </w:pPr>
-            <w:r>
-              <w:rPr>
-                <w:rFonts w:ascii="Times New Roman" w:cs="Times New Roman" w:eastAsia="Times New Roman" w:hAnsi="Times New Roman"/>
-                <w:b w:val="false"/>
-                <w:bCs w:val="false"/>
-                <w:sz w:val="16"/>
-                <w:szCs w:val="16"/>
-              </w:rPr>
-              <w:t xml:space="preserve">session_id, role, message, intent, file_ids</w:t>
-            </w:r>
-          </w:p>
-        </w:tc>
-        <w:tc>
-          <w:tcPr>
-            <w:tcW w:type="dxa" w:w="3280"/>
-            <w:tcBorders>
-              <w:top w:val="single" w:color="000000" w:sz="2"/>
-              <w:left w:val="single" w:color="000000" w:sz="2"/>
-              <w:bottom w:val="single" w:color="000000" w:sz="2"/>
-              <w:right w:val="single" w:color="000000" w:sz="2"/>
-            </w:tcBorders>
-            <w:tcMar>
-              <w:top w:type="dxa" w:w="30"/>
-              <w:left w:type="dxa" w:w="60"/>
-              <w:bottom w:type="dxa" w:w="30"/>
-              <w:right w:type="dxa" w:w="60"/>
-            </w:tcMar>
-            <w:vAlign w:val="center"/>
-          </w:tcPr>
-          <w:p>
-            <w:pPr>
-              <w:spacing w:after="0" w:line="208"/>
-              <w:jc w:val="center"/>
-            </w:pPr>
-            <w:r>
-              <w:rPr>
-                <w:rFonts w:ascii="Times New Roman" w:cs="Times New Roman" w:eastAsia="Times New Roman" w:hAnsi="Times New Roman"/>
-                <w:b w:val="false"/>
-                <w:bCs w:val="false"/>
-                <w:sz w:val="16"/>
-                <w:szCs w:val="16"/>
-              </w:rPr>
-              <w:t xml:space="preserve">Episodic memory of the chat</w:t>
-            </w:r>
-          </w:p>
-        </w:tc>
-      </w:tr>
-      <w:tr>
-        <w:trPr>
-          <w:cantSplit/>
-        </w:trPr>
-        <w:tc>
-          <w:tcPr>
-            <w:tcW w:type="dxa" w:w="2200"/>
-            <w:tcBorders>
-              <w:top w:val="single" w:color="000000" w:sz="2"/>
-              <w:left w:val="single" w:color="000000" w:sz="2"/>
-              <w:bottom w:val="single" w:color="000000" w:sz="2"/>
-              <w:right w:val="single" w:color="000000" w:sz="2"/>
-            </w:tcBorders>
-            <w:tcMar>
-              <w:top w:type="dxa" w:w="30"/>
-              <w:left w:type="dxa" w:w="60"/>
-              <w:bottom w:type="dxa" w:w="30"/>
-              <w:right w:type="dxa" w:w="60"/>
-            </w:tcMar>
-            <w:vAlign w:val="center"/>
-          </w:tcPr>
-          <w:p>
-            <w:pPr>
-              <w:spacing w:after="0" w:line="208"/>
-              <w:jc w:val="left"/>
-            </w:pPr>
-            <w:r>
-              <w:rPr>
-                <w:rFonts w:ascii="Times New Roman" w:cs="Times New Roman" w:eastAsia="Times New Roman" w:hAnsi="Times New Roman"/>
-                <w:b w:val="false"/>
-                <w:bCs w:val="false"/>
-                <w:sz w:val="16"/>
-                <w:szCs w:val="16"/>
-              </w:rPr>
-              <w:t xml:space="preserve">SQLite / usage_events</w:t>
-            </w:r>
-          </w:p>
-        </w:tc>
-        <w:tc>
-          <w:tcPr>
-            <w:tcW w:type="dxa" w:w="4600"/>
-            <w:tcBorders>
-              <w:top w:val="single" w:color="000000" w:sz="2"/>
-              <w:left w:val="single" w:color="000000" w:sz="2"/>
-              <w:bottom w:val="single" w:color="000000" w:sz="2"/>
-              <w:right w:val="single" w:color="000000" w:sz="2"/>
-            </w:tcBorders>
-            <w:tcMar>
-              <w:top w:type="dxa" w:w="30"/>
-              <w:left w:type="dxa" w:w="60"/>
-              <w:bottom w:type="dxa" w:w="30"/>
-              <w:right w:type="dxa" w:w="60"/>
-            </w:tcMar>
-            <w:vAlign w:val="center"/>
-          </w:tcPr>
-          <w:p>
-            <w:pPr>
-              <w:spacing w:after="0" w:line="208"/>
-              <w:jc w:val="center"/>
-            </w:pPr>
-            <w:r>
-              <w:rPr>
-                <w:rFonts w:ascii="Times New Roman" w:cs="Times New Roman" w:eastAsia="Times New Roman" w:hAnsi="Times New Roman"/>
-                <w:b w:val="false"/>
-                <w:bCs w:val="false"/>
-                <w:sz w:val="16"/>
-                <w:szCs w:val="16"/>
-              </w:rPr>
-              <w:t xml:space="preserve">file_id, kind, created_at</w:t>
-            </w:r>
-          </w:p>
-        </w:tc>
-        <w:tc>
-          <w:tcPr>
-            <w:tcW w:type="dxa" w:w="3280"/>
-            <w:tcBorders>
-              <w:top w:val="single" w:color="000000" w:sz="2"/>
-              <w:left w:val="single" w:color="000000" w:sz="2"/>
-              <w:bottom w:val="single" w:color="000000" w:sz="2"/>
-              <w:right w:val="single" w:color="000000" w:sz="2"/>
-            </w:tcBorders>
-            <w:tcMar>
-              <w:top w:type="dxa" w:w="30"/>
-              <w:left w:type="dxa" w:w="60"/>
-              <w:bottom w:type="dxa" w:w="30"/>
-              <w:right w:type="dxa" w:w="60"/>
-            </w:tcMar>
-            <w:vAlign w:val="center"/>
-          </w:tcPr>
-          <w:p>
-            <w:pPr>
-              <w:spacing w:after="0" w:line="208"/>
-              <w:jc w:val="center"/>
-            </w:pPr>
-            <w:r>
-              <w:rPr>
-                <w:rFonts w:ascii="Times New Roman" w:cs="Times New Roman" w:eastAsia="Times New Roman" w:hAnsi="Times New Roman"/>
-                <w:b w:val="false"/>
-                <w:bCs w:val="false"/>
-                <w:sz w:val="16"/>
-                <w:szCs w:val="16"/>
-              </w:rPr>
-              <w:t xml:space="preserve">Open history; tie-break and rules</w:t>
-            </w:r>
-          </w:p>
-        </w:tc>
-      </w:tr>
-      <w:tr>
-        <w:trPr>
-          <w:cantSplit/>
-        </w:trPr>
-        <w:tc>
-          <w:tcPr>
-            <w:tcW w:type="dxa" w:w="2200"/>
-            <w:tcBorders>
-              <w:top w:val="single" w:color="000000" w:sz="2"/>
-              <w:left w:val="single" w:color="000000" w:sz="2"/>
-              <w:bottom w:val="single" w:color="000000" w:sz="2"/>
-              <w:right w:val="single" w:color="000000" w:sz="2"/>
-            </w:tcBorders>
-            <w:tcMar>
-              <w:top w:type="dxa" w:w="30"/>
-              <w:left w:type="dxa" w:w="60"/>
-              <w:bottom w:type="dxa" w:w="30"/>
-              <w:right w:type="dxa" w:w="60"/>
-            </w:tcMar>
-            <w:vAlign w:val="center"/>
-          </w:tcPr>
-          <w:p>
-            <w:pPr>
-              <w:spacing w:after="0" w:line="208"/>
-              <w:jc w:val="left"/>
-            </w:pPr>
-            <w:r>
-              <w:rPr>
-                <w:rFonts w:ascii="Times New Roman" w:cs="Times New Roman" w:eastAsia="Times New Roman" w:hAnsi="Times New Roman"/>
-                <w:b w:val="false"/>
-                <w:bCs w:val="false"/>
-                <w:sz w:val="16"/>
-                <w:szCs w:val="16"/>
-              </w:rPr>
-              <w:t xml:space="preserve">SQLite / workspaces, workspace_files</w:t>
-            </w:r>
-          </w:p>
-        </w:tc>
-        <w:tc>
-          <w:tcPr>
-            <w:tcW w:type="dxa" w:w="4600"/>
-            <w:tcBorders>
-              <w:top w:val="single" w:color="000000" w:sz="2"/>
-              <w:left w:val="single" w:color="000000" w:sz="2"/>
-              <w:bottom w:val="single" w:color="000000" w:sz="2"/>
-              <w:right w:val="single" w:color="000000" w:sz="2"/>
-            </w:tcBorders>
-            <w:tcMar>
-              <w:top w:type="dxa" w:w="30"/>
-              <w:left w:type="dxa" w:w="60"/>
-              <w:bottom w:type="dxa" w:w="30"/>
-              <w:right w:type="dxa" w:w="60"/>
-            </w:tcMar>
-            <w:vAlign w:val="center"/>
-          </w:tcPr>
-          <w:p>
-            <w:pPr>
-              <w:spacing w:after="0" w:line="208"/>
-              <w:jc w:val="center"/>
-            </w:pPr>
-            <w:r>
-              <w:rPr>
-                <w:rFonts w:ascii="Times New Roman" w:cs="Times New Roman" w:eastAsia="Times New Roman" w:hAnsi="Times New Roman"/>
-                <w:b w:val="false"/>
-                <w:bCs w:val="false"/>
-                <w:sz w:val="16"/>
-                <w:szCs w:val="16"/>
-              </w:rPr>
-              <w:t xml:space="preserve">name (unique); workspace_id, file_id</w:t>
-            </w:r>
-          </w:p>
-        </w:tc>
-        <w:tc>
-          <w:tcPr>
-            <w:tcW w:type="dxa" w:w="3280"/>
-            <w:tcBorders>
-              <w:top w:val="single" w:color="000000" w:sz="2"/>
-              <w:left w:val="single" w:color="000000" w:sz="2"/>
-              <w:bottom w:val="single" w:color="000000" w:sz="2"/>
-              <w:right w:val="single" w:color="000000" w:sz="2"/>
-            </w:tcBorders>
-            <w:tcMar>
-              <w:top w:type="dxa" w:w="30"/>
-              <w:left w:type="dxa" w:w="60"/>
-              <w:bottom w:type="dxa" w:w="30"/>
-              <w:right w:type="dxa" w:w="60"/>
-            </w:tcMar>
-            <w:vAlign w:val="center"/>
-          </w:tcPr>
-          <w:p>
-            <w:pPr>
-              <w:spacing w:after="0" w:line="208"/>
-              <w:jc w:val="center"/>
-            </w:pPr>
-            <w:r>
-              <w:rPr>
-                <w:rFonts w:ascii="Times New Roman" w:cs="Times New Roman" w:eastAsia="Times New Roman" w:hAnsi="Times New Roman"/>
-                <w:b w:val="false"/>
-                <w:bCs w:val="false"/>
-                <w:sz w:val="16"/>
-                <w:szCs w:val="16"/>
-              </w:rPr>
-              <w:t xml:space="preserve">Named groups of files</w:t>
-            </w:r>
-          </w:p>
-        </w:tc>
-      </w:tr>
-      <w:tr>
-        <w:trPr>
-          <w:cantSplit/>
-        </w:trPr>
-        <w:tc>
-          <w:tcPr>
-            <w:tcW w:type="dxa" w:w="2200"/>
-            <w:tcBorders>
-              <w:top w:val="single" w:color="000000" w:sz="2"/>
-              <w:left w:val="single" w:color="000000" w:sz="2"/>
-              <w:bottom w:val="single" w:color="000000" w:sz="2"/>
-              <w:right w:val="single" w:color="000000" w:sz="2"/>
-            </w:tcBorders>
-            <w:tcMar>
-              <w:top w:type="dxa" w:w="30"/>
-              <w:left w:type="dxa" w:w="60"/>
-              <w:bottom w:type="dxa" w:w="30"/>
-              <w:right w:type="dxa" w:w="60"/>
-            </w:tcMar>
-            <w:vAlign w:val="center"/>
-          </w:tcPr>
-          <w:p>
-            <w:pPr>
-              <w:spacing w:after="0" w:line="208"/>
-              <w:jc w:val="left"/>
-            </w:pPr>
-            <w:r>
-              <w:rPr>
-                <w:rFonts w:ascii="Times New Roman" w:cs="Times New Roman" w:eastAsia="Times New Roman" w:hAnsi="Times New Roman"/>
-                <w:b w:val="false"/>
-                <w:bCs w:val="false"/>
-                <w:sz w:val="16"/>
-                <w:szCs w:val="16"/>
-              </w:rPr>
-              <w:t xml:space="preserve">ChromaDB / vectors</w:t>
-            </w:r>
-          </w:p>
-        </w:tc>
-        <w:tc>
-          <w:tcPr>
-            <w:tcW w:type="dxa" w:w="4600"/>
-            <w:tcBorders>
-              <w:top w:val="single" w:color="000000" w:sz="2"/>
-              <w:left w:val="single" w:color="000000" w:sz="2"/>
-              <w:bottom w:val="single" w:color="000000" w:sz="2"/>
-              <w:right w:val="single" w:color="000000" w:sz="2"/>
-            </w:tcBorders>
-            <w:tcMar>
-              <w:top w:type="dxa" w:w="30"/>
-              <w:left w:type="dxa" w:w="60"/>
-              <w:bottom w:type="dxa" w:w="30"/>
-              <w:right w:type="dxa" w:w="60"/>
-            </w:tcMar>
-            <w:vAlign w:val="center"/>
-          </w:tcPr>
-          <w:p>
-            <w:pPr>
-              <w:spacing w:after="0" w:line="208"/>
-              <w:jc w:val="center"/>
-            </w:pPr>
-            <w:r>
-              <w:rPr>
-                <w:rFonts w:ascii="Times New Roman" w:cs="Times New Roman" w:eastAsia="Times New Roman" w:hAnsi="Times New Roman"/>
-                <w:b w:val="false"/>
-                <w:bCs w:val="false"/>
-                <w:sz w:val="16"/>
-                <w:szCs w:val="16"/>
-              </w:rPr>
-              <w:t xml:space="preserve">id, document chunk, embedding, metadata (path)</w:t>
-            </w:r>
-          </w:p>
-        </w:tc>
-        <w:tc>
-          <w:tcPr>
-            <w:tcW w:type="dxa" w:w="3280"/>
-            <w:tcBorders>
-              <w:top w:val="single" w:color="000000" w:sz="2"/>
-              <w:left w:val="single" w:color="000000" w:sz="2"/>
-              <w:bottom w:val="single" w:color="000000" w:sz="2"/>
-              <w:right w:val="single" w:color="000000" w:sz="2"/>
-            </w:tcBorders>
-            <w:tcMar>
-              <w:top w:type="dxa" w:w="30"/>
-              <w:left w:type="dxa" w:w="60"/>
-              <w:bottom w:type="dxa" w:w="30"/>
-              <w:right w:type="dxa" w:w="60"/>
-            </w:tcMar>
-            <w:vAlign w:val="center"/>
-          </w:tcPr>
-          <w:p>
-            <w:pPr>
-              <w:spacing w:after="0" w:line="208"/>
-              <w:jc w:val="center"/>
-            </w:pPr>
-            <w:r>
-              <w:rPr>
-                <w:rFonts w:ascii="Times New Roman" w:cs="Times New Roman" w:eastAsia="Times New Roman" w:hAnsi="Times New Roman"/>
-                <w:b w:val="false"/>
-                <w:bCs w:val="false"/>
-                <w:sz w:val="16"/>
-                <w:szCs w:val="16"/>
-              </w:rPr>
-              <w:t xml:space="preserve">Nearest-neighbour retrieval</w:t>
-            </w:r>
-          </w:p>
-        </w:tc>
-      </w:tr>
-    </w:tbl>
-    <w:p>
-      <w:pPr>
-        <w:sectPr>
-          <w:footerReference w:type="default" r:id="rId13"/>
-          <w:type w:val="continuous"/>
-          <w:pgSz w:w="12240" w:h="15840" w:orient="portrait"/>
-          <w:pgMar w:top="1080" w:right="900" w:bottom="1440" w:left="900" w:header="708" w:footer="708" w:gutter="0"/>
-          <w:pgNumType/>
-          <w:docGrid w:linePitch="360"/>
-        </w:sectPr>
-      </w:pPr>
+        <w:t xml:space="preserve">An endpoint reads live configuration and lists every address the service is set to call, whether each is loopback, and what is stored locally. It states that it checks configuration, not traffic, and names the independent check (listing listening sockets with netstat), so the claim can be falsified.</w:t>
+      </w:r>
     </w:p>
     <w:p>
       <w:pPr>
@@ -3626,7 +3961,7 @@
           <w:sz w:val="20"/>
           <w:szCs w:val="20"/>
         </w:rPr>
-        <w:t xml:space="preserve">D. Trust mechanisms</w:t>
+        <w:t xml:space="preserve">E. Organiser and workspaces</w:t>
       </w:r>
     </w:p>
     <w:p>
@@ -3641,7 +3976,105 @@
           <w:sz w:val="20"/>
           <w:szCs w:val="20"/>
         </w:rPr>
-        <w:t xml:space="preserve">A language model sits at four points where an error would cost the user something. Table III names each point, the mechanism that bounds it and the evidence reported in this paper. The mechanisms are deliberately simple and deterministic, so each can be tested on its own and explained to a user: none relies on the model grading itself.</w:t>
+        <w:t xml:space="preserve">For each file the model proposes a summary, tags, a category and a reason; a move is applied only on confirmation and is reversible. Workspace recommendations are rule-based on purpose, so they are reproducible, explainable and cost no model calls.</w:t>
+      </w:r>
+    </w:p>
+    <w:p>
+      <w:pPr>
+        <w:keepNext/>
+        <w:spacing w:after="70" w:before="140"/>
+        <w:jc w:val="center"/>
+      </w:pPr>
+      <w:r>
+        <w:rPr>
+          <w:rFonts w:ascii="Times New Roman" w:cs="Times New Roman" w:eastAsia="Times New Roman" w:hAnsi="Times New Roman"/>
+          <w:b/>
+          <w:bCs/>
+          <w:sz w:val="20"/>
+          <w:szCs w:val="20"/>
+        </w:rPr>
+        <w:t xml:space="preserve">V. EXPERIMENTAL SETUP</w:t>
+      </w:r>
+    </w:p>
+    <w:p>
+      <w:pPr>
+        <w:spacing w:after="0" w:line="230"/>
+        <w:ind w:firstLine="280"/>
+        <w:jc w:val="both"/>
+      </w:pPr>
+      <w:r>
+        <w:rPr>
+          <w:rFonts w:ascii="Times New Roman" w:cs="Times New Roman" w:eastAsia="Times New Roman" w:hAnsi="Times New Roman"/>
+          <w:sz w:val="20"/>
+          <w:szCs w:val="20"/>
+        </w:rPr>
+        <w:t xml:space="preserve">All runs used one laptop (AMD Ryzen 7 6800H, 16 GB RAM, Windows 11, CPU only) with nomic-embed-text and llama3.2 3B on Ollama. The 123 automated tests run offline against fixtures and on every push in continuous integration.</w:t>
+      </w:r>
+    </w:p>
+    <w:p>
+      <w:pPr>
+        <w:keepNext/>
+        <w:spacing w:after="30" w:before="80"/>
+      </w:pPr>
+      <w:r>
+        <w:rPr>
+          <w:rFonts w:ascii="Times New Roman" w:cs="Times New Roman" w:eastAsia="Times New Roman" w:hAnsi="Times New Roman"/>
+          <w:b/>
+          <w:bCs/>
+          <w:i/>
+          <w:iCs/>
+          <w:sz w:val="20"/>
+          <w:szCs w:val="20"/>
+        </w:rPr>
+        <w:t xml:space="preserve">A. Retrieval comparison</w:t>
+      </w:r>
+    </w:p>
+    <w:p>
+      <w:pPr>
+        <w:spacing w:after="0" w:line="230"/>
+        <w:ind w:firstLine="280"/>
+        <w:jc w:val="both"/>
+      </w:pPr>
+      <w:r>
+        <w:rPr>
+          <w:rFonts w:ascii="Times New Roman" w:cs="Times New Roman" w:eastAsia="Times New Roman" w:hAnsi="Times New Roman"/>
+          <w:sz w:val="20"/>
+          <w:szCs w:val="20"/>
+        </w:rPr>
+        <w:t xml:space="preserve">The corpus is the 37-file demonstration vault: deliberately messy text, Markdown and source files (CVs, invoices, meeting notes, a recipe, scripts). We wrote 36 queries and their relevant files while reading the vault and fixed them before running any system; the retrieval parameters of Sec. IV-A had been tuned earlier on a different query set over the same vault, so the comparison is in-sample with respect to the vault. Each query is partitioned automatically by whether any of its content words, after the system's own stop-word and plural folding, occurs in a relevant file's name or text: 26 do, 10 do not. Four systems return at most 8 files: (i) filename match, a lexical match on names only, standing in for name-index tools [7]; (ii) BM25 [12] over name and text, standing in for lexical content indexes [5], [6], [24]: our own implementation with k1 = 1.5, b = 0.75, whole files as documents, the file name prepended to the text and the same tokeniser as the keyword boost (lower-cased words of three or more letters, a 31-word stop list, no stemming beyond plural folding); (iii) embedding only, DreamOS without the keyword boost and cut-off; (iv) DreamOS as shipped. Metrics are Hit@1, Hit@3 and mean reciprocal rank (MRR) [18], with 95% Wilson intervals [17] on Hit@1, a seeded percentile bootstrap over queries [25] (10,000 resamples) on paired Hit@1 differences, and an exact McNemar test on the paired hit-or-miss outcomes.</w:t>
+      </w:r>
+    </w:p>
+    <w:p>
+      <w:pPr>
+        <w:keepNext/>
+        <w:spacing w:after="30" w:before="80"/>
+      </w:pPr>
+      <w:r>
+        <w:rPr>
+          <w:rFonts w:ascii="Times New Roman" w:cs="Times New Roman" w:eastAsia="Times New Roman" w:hAnsi="Times New Roman"/>
+          <w:b/>
+          <w:bCs/>
+          <w:i/>
+          <w:iCs/>
+          <w:sz w:val="20"/>
+          <w:szCs w:val="20"/>
+        </w:rPr>
+        <w:t xml:space="preserve">B. Scale evaluation</w:t>
+      </w:r>
+    </w:p>
+    <w:p>
+      <w:pPr>
+        <w:spacing w:after="0" w:line="230"/>
+        <w:ind w:firstLine="280"/>
+        <w:jc w:val="both"/>
+      </w:pPr>
+      <w:r>
+        <w:rPr>
+          <w:rFonts w:ascii="Times New Roman" w:cs="Times New Roman" w:eastAsia="Times New Roman" w:hAnsi="Times New Roman"/>
+          <w:sz w:val="20"/>
+          <w:szCs w:val="20"/>
+        </w:rPr>
+        <w:t xml:space="preserve">Synthetic vaults of 500, 2,000 and 5,000 text files across twelve topics (half with one distractor sentence from another topic) were each run in a fresh process with a fresh database and the real models, measuring indexing throughput, graph rebuild time, the latency of 36 queries and precision at 5 against the generated topic label. The scripts (bench_scale.py, eval_retrieval.py, bootstrap_ci.py) are in the project repository.</w:t>
       </w:r>
     </w:p>
     <w:p>
@@ -3672,1227 +4105,6 @@
           <w:szCs w:val="16"/>
         </w:rPr>
         <w:t xml:space="preserve">TABLE III</w:t>
-      </w:r>
-      <w:r>
-        <w:rPr>
-          <w:rFonts w:ascii="Times New Roman" w:cs="Times New Roman" w:eastAsia="Times New Roman" w:hAnsi="Times New Roman"/>
-          <w:sz w:val="16"/>
-          <w:szCs w:val="16"/>
-        </w:rPr>
-        <w:t xml:space="preserve">. Trust Mechanisms, the Failure Each Prevents and the Evidence</w:t>
-      </w:r>
-    </w:p>
-    <w:tbl>
-      <w:tblPr>
-        <w:tblW w:type="dxa" w:w="10440"/>
-        <w:tblBorders>
-          <w:top w:val="single" w:color="auto" w:sz="4"/>
-          <w:left w:val="single" w:color="auto" w:sz="4"/>
-          <w:bottom w:val="single" w:color="auto" w:sz="4"/>
-          <w:right w:val="single" w:color="auto" w:sz="4"/>
-          <w:insideH w:val="single" w:color="auto" w:sz="4"/>
-          <w:insideV w:val="single" w:color="auto" w:sz="4"/>
-        </w:tblBorders>
-      </w:tblPr>
-      <w:tblGrid>
-        <w:gridCol w:w="2000"/>
-        <w:gridCol w:w="2900"/>
-        <w:gridCol w:w="2800"/>
-        <w:gridCol w:w="2740"/>
-      </w:tblGrid>
-      <w:tr>
-        <w:trPr>
-          <w:cantSplit/>
-          <w:tblHeader/>
-        </w:trPr>
-        <w:tc>
-          <w:tcPr>
-            <w:tcW w:type="dxa" w:w="2000"/>
-            <w:tcBorders>
-              <w:top w:val="single" w:color="000000" w:sz="2"/>
-              <w:left w:val="single" w:color="000000" w:sz="2"/>
-              <w:bottom w:val="single" w:color="000000" w:sz="2"/>
-              <w:right w:val="single" w:color="000000" w:sz="2"/>
-            </w:tcBorders>
-            <w:shd w:fill="E6E6E6" w:val="clear"/>
-            <w:tcMar>
-              <w:top w:type="dxa" w:w="30"/>
-              <w:left w:type="dxa" w:w="60"/>
-              <w:bottom w:type="dxa" w:w="30"/>
-              <w:right w:type="dxa" w:w="60"/>
-            </w:tcMar>
-            <w:vAlign w:val="center"/>
-          </w:tcPr>
-          <w:p>
-            <w:pPr>
-              <w:spacing w:after="0" w:line="208"/>
-              <w:jc w:val="center"/>
-            </w:pPr>
-            <w:r>
-              <w:rPr>
-                <w:rFonts w:ascii="Times New Roman" w:cs="Times New Roman" w:eastAsia="Times New Roman" w:hAnsi="Times New Roman"/>
-                <w:b/>
-                <w:bCs/>
-                <w:sz w:val="16"/>
-                <w:szCs w:val="16"/>
-              </w:rPr>
-              <w:t xml:space="preserve">Mechanism</w:t>
-            </w:r>
-          </w:p>
-        </w:tc>
-        <w:tc>
-          <w:tcPr>
-            <w:tcW w:type="dxa" w:w="2900"/>
-            <w:tcBorders>
-              <w:top w:val="single" w:color="000000" w:sz="2"/>
-              <w:left w:val="single" w:color="000000" w:sz="2"/>
-              <w:bottom w:val="single" w:color="000000" w:sz="2"/>
-              <w:right w:val="single" w:color="000000" w:sz="2"/>
-            </w:tcBorders>
-            <w:shd w:fill="E6E6E6" w:val="clear"/>
-            <w:tcMar>
-              <w:top w:type="dxa" w:w="30"/>
-              <w:left w:type="dxa" w:w="60"/>
-              <w:bottom w:type="dxa" w:w="30"/>
-              <w:right w:type="dxa" w:w="60"/>
-            </w:tcMar>
-            <w:vAlign w:val="center"/>
-          </w:tcPr>
-          <w:p>
-            <w:pPr>
-              <w:spacing w:after="0" w:line="208"/>
-              <w:jc w:val="center"/>
-            </w:pPr>
-            <w:r>
-              <w:rPr>
-                <w:rFonts w:ascii="Times New Roman" w:cs="Times New Roman" w:eastAsia="Times New Roman" w:hAnsi="Times New Roman"/>
-                <w:b/>
-                <w:bCs/>
-                <w:sz w:val="16"/>
-                <w:szCs w:val="16"/>
-              </w:rPr>
-              <w:t xml:space="preserve">Failure it prevents</w:t>
-            </w:r>
-          </w:p>
-        </w:tc>
-        <w:tc>
-          <w:tcPr>
-            <w:tcW w:type="dxa" w:w="2800"/>
-            <w:tcBorders>
-              <w:top w:val="single" w:color="000000" w:sz="2"/>
-              <w:left w:val="single" w:color="000000" w:sz="2"/>
-              <w:bottom w:val="single" w:color="000000" w:sz="2"/>
-              <w:right w:val="single" w:color="000000" w:sz="2"/>
-            </w:tcBorders>
-            <w:shd w:fill="E6E6E6" w:val="clear"/>
-            <w:tcMar>
-              <w:top w:type="dxa" w:w="30"/>
-              <w:left w:type="dxa" w:w="60"/>
-              <w:bottom w:type="dxa" w:w="30"/>
-              <w:right w:type="dxa" w:w="60"/>
-            </w:tcMar>
-            <w:vAlign w:val="center"/>
-          </w:tcPr>
-          <w:p>
-            <w:pPr>
-              <w:spacing w:after="0" w:line="208"/>
-              <w:jc w:val="center"/>
-            </w:pPr>
-            <w:r>
-              <w:rPr>
-                <w:rFonts w:ascii="Times New Roman" w:cs="Times New Roman" w:eastAsia="Times New Roman" w:hAnsi="Times New Roman"/>
-                <w:b/>
-                <w:bCs/>
-                <w:sz w:val="16"/>
-                <w:szCs w:val="16"/>
-              </w:rPr>
-              <w:t xml:space="preserve">How it works</w:t>
-            </w:r>
-          </w:p>
-        </w:tc>
-        <w:tc>
-          <w:tcPr>
-            <w:tcW w:type="dxa" w:w="2740"/>
-            <w:tcBorders>
-              <w:top w:val="single" w:color="000000" w:sz="2"/>
-              <w:left w:val="single" w:color="000000" w:sz="2"/>
-              <w:bottom w:val="single" w:color="000000" w:sz="2"/>
-              <w:right w:val="single" w:color="000000" w:sz="2"/>
-            </w:tcBorders>
-            <w:shd w:fill="E6E6E6" w:val="clear"/>
-            <w:tcMar>
-              <w:top w:type="dxa" w:w="30"/>
-              <w:left w:type="dxa" w:w="60"/>
-              <w:bottom w:type="dxa" w:w="30"/>
-              <w:right w:type="dxa" w:w="60"/>
-            </w:tcMar>
-            <w:vAlign w:val="center"/>
-          </w:tcPr>
-          <w:p>
-            <w:pPr>
-              <w:spacing w:after="0" w:line="208"/>
-              <w:jc w:val="center"/>
-            </w:pPr>
-            <w:r>
-              <w:rPr>
-                <w:rFonts w:ascii="Times New Roman" w:cs="Times New Roman" w:eastAsia="Times New Roman" w:hAnsi="Times New Roman"/>
-                <w:b/>
-                <w:bCs/>
-                <w:sz w:val="16"/>
-                <w:szCs w:val="16"/>
-              </w:rPr>
-              <w:t xml:space="preserve">Evidence</w:t>
-            </w:r>
-          </w:p>
-        </w:tc>
-      </w:tr>
-      <w:tr>
-        <w:trPr>
-          <w:cantSplit/>
-        </w:trPr>
-        <w:tc>
-          <w:tcPr>
-            <w:tcW w:type="dxa" w:w="2000"/>
-            <w:tcBorders>
-              <w:top w:val="single" w:color="000000" w:sz="2"/>
-              <w:left w:val="single" w:color="000000" w:sz="2"/>
-              <w:bottom w:val="single" w:color="000000" w:sz="2"/>
-              <w:right w:val="single" w:color="000000" w:sz="2"/>
-            </w:tcBorders>
-            <w:tcMar>
-              <w:top w:type="dxa" w:w="30"/>
-              <w:left w:type="dxa" w:w="60"/>
-              <w:bottom w:type="dxa" w:w="30"/>
-              <w:right w:type="dxa" w:w="60"/>
-            </w:tcMar>
-            <w:vAlign w:val="center"/>
-          </w:tcPr>
-          <w:p>
-            <w:pPr>
-              <w:spacing w:after="0" w:line="208"/>
-              <w:jc w:val="left"/>
-            </w:pPr>
-            <w:r>
-              <w:rPr>
-                <w:rFonts w:ascii="Times New Roman" w:cs="Times New Roman" w:eastAsia="Times New Roman" w:hAnsi="Times New Roman"/>
-                <w:b w:val="false"/>
-                <w:bCs w:val="false"/>
-                <w:sz w:val="16"/>
-                <w:szCs w:val="16"/>
-              </w:rPr>
-              <w:t xml:space="preserve">Confidence guard on open</w:t>
-            </w:r>
-          </w:p>
-        </w:tc>
-        <w:tc>
-          <w:tcPr>
-            <w:tcW w:type="dxa" w:w="2900"/>
-            <w:tcBorders>
-              <w:top w:val="single" w:color="000000" w:sz="2"/>
-              <w:left w:val="single" w:color="000000" w:sz="2"/>
-              <w:bottom w:val="single" w:color="000000" w:sz="2"/>
-              <w:right w:val="single" w:color="000000" w:sz="2"/>
-            </w:tcBorders>
-            <w:tcMar>
-              <w:top w:type="dxa" w:w="30"/>
-              <w:left w:type="dxa" w:w="60"/>
-              <w:bottom w:type="dxa" w:w="30"/>
-              <w:right w:type="dxa" w:w="60"/>
-            </w:tcMar>
-            <w:vAlign w:val="center"/>
-          </w:tcPr>
-          <w:p>
-            <w:pPr>
-              <w:spacing w:after="0" w:line="208"/>
-              <w:jc w:val="center"/>
-            </w:pPr>
-            <w:r>
-              <w:rPr>
-                <w:rFonts w:ascii="Times New Roman" w:cs="Times New Roman" w:eastAsia="Times New Roman" w:hAnsi="Times New Roman"/>
-                <w:b w:val="false"/>
-                <w:bCs w:val="false"/>
-                <w:sz w:val="16"/>
-                <w:szCs w:val="16"/>
-              </w:rPr>
-              <w:t xml:space="preserve">Launching a wrong file on a weak or ambiguous match</w:t>
-            </w:r>
-          </w:p>
-        </w:tc>
-        <w:tc>
-          <w:tcPr>
-            <w:tcW w:type="dxa" w:w="2800"/>
-            <w:tcBorders>
-              <w:top w:val="single" w:color="000000" w:sz="2"/>
-              <w:left w:val="single" w:color="000000" w:sz="2"/>
-              <w:bottom w:val="single" w:color="000000" w:sz="2"/>
-              <w:right w:val="single" w:color="000000" w:sz="2"/>
-            </w:tcBorders>
-            <w:tcMar>
-              <w:top w:type="dxa" w:w="30"/>
-              <w:left w:type="dxa" w:w="60"/>
-              <w:bottom w:type="dxa" w:w="30"/>
-              <w:right w:type="dxa" w:w="60"/>
-            </w:tcMar>
-            <w:vAlign w:val="center"/>
-          </w:tcPr>
-          <w:p>
-            <w:pPr>
-              <w:spacing w:after="0" w:line="208"/>
-              <w:jc w:val="center"/>
-            </w:pPr>
-            <w:r>
-              <w:rPr>
-                <w:rFonts w:ascii="Times New Roman" w:cs="Times New Roman" w:eastAsia="Times New Roman" w:hAnsi="Times New Roman"/>
-                <w:b w:val="false"/>
-                <w:bCs w:val="false"/>
-                <w:sz w:val="16"/>
-                <w:szCs w:val="16"/>
-              </w:rPr>
-              <w:t xml:space="preserve">Opens only at similarity 0.55 or above with no runner-up within 0.05; otherwise shows candidates</w:t>
-            </w:r>
-          </w:p>
-        </w:tc>
-        <w:tc>
-          <w:tcPr>
-            <w:tcW w:type="dxa" w:w="2740"/>
-            <w:tcBorders>
-              <w:top w:val="single" w:color="000000" w:sz="2"/>
-              <w:left w:val="single" w:color="000000" w:sz="2"/>
-              <w:bottom w:val="single" w:color="000000" w:sz="2"/>
-              <w:right w:val="single" w:color="000000" w:sz="2"/>
-            </w:tcBorders>
-            <w:tcMar>
-              <w:top w:type="dxa" w:w="30"/>
-              <w:left w:type="dxa" w:w="60"/>
-              <w:bottom w:type="dxa" w:w="30"/>
-              <w:right w:type="dxa" w:w="60"/>
-            </w:tcMar>
-            <w:vAlign w:val="center"/>
-          </w:tcPr>
-          <w:p>
-            <w:pPr>
-              <w:spacing w:after="0" w:line="208"/>
-              <w:jc w:val="center"/>
-            </w:pPr>
-            <w:r>
-              <w:rPr>
-                <w:rFonts w:ascii="Times New Roman" w:cs="Times New Roman" w:eastAsia="Times New Roman" w:hAnsi="Times New Roman"/>
-                <w:b w:val="false"/>
-                <w:bCs w:val="false"/>
-                <w:sz w:val="16"/>
-                <w:szCs w:val="16"/>
-              </w:rPr>
-              <w:t xml:space="preserve">Sec. VI-B: 29 opens, 0 wrong, against 2 wrong without it</w:t>
-            </w:r>
-          </w:p>
-        </w:tc>
-      </w:tr>
-      <w:tr>
-        <w:trPr>
-          <w:cantSplit/>
-        </w:trPr>
-        <w:tc>
-          <w:tcPr>
-            <w:tcW w:type="dxa" w:w="2000"/>
-            <w:tcBorders>
-              <w:top w:val="single" w:color="000000" w:sz="2"/>
-              <w:left w:val="single" w:color="000000" w:sz="2"/>
-              <w:bottom w:val="single" w:color="000000" w:sz="2"/>
-              <w:right w:val="single" w:color="000000" w:sz="2"/>
-            </w:tcBorders>
-            <w:tcMar>
-              <w:top w:type="dxa" w:w="30"/>
-              <w:left w:type="dxa" w:w="60"/>
-              <w:bottom w:type="dxa" w:w="30"/>
-              <w:right w:type="dxa" w:w="60"/>
-            </w:tcMar>
-            <w:vAlign w:val="center"/>
-          </w:tcPr>
-          <w:p>
-            <w:pPr>
-              <w:spacing w:after="0" w:line="208"/>
-              <w:jc w:val="left"/>
-            </w:pPr>
-            <w:r>
-              <w:rPr>
-                <w:rFonts w:ascii="Times New Roman" w:cs="Times New Roman" w:eastAsia="Times New Roman" w:hAnsi="Times New Roman"/>
-                <w:b w:val="false"/>
-                <w:bCs w:val="false"/>
-                <w:sz w:val="16"/>
-                <w:szCs w:val="16"/>
-              </w:rPr>
-              <w:t xml:space="preserve">Evidence before model</w:t>
-            </w:r>
-          </w:p>
-        </w:tc>
-        <w:tc>
-          <w:tcPr>
-            <w:tcW w:type="dxa" w:w="2900"/>
-            <w:tcBorders>
-              <w:top w:val="single" w:color="000000" w:sz="2"/>
-              <w:left w:val="single" w:color="000000" w:sz="2"/>
-              <w:bottom w:val="single" w:color="000000" w:sz="2"/>
-              <w:right w:val="single" w:color="000000" w:sz="2"/>
-            </w:tcBorders>
-            <w:tcMar>
-              <w:top w:type="dxa" w:w="30"/>
-              <w:left w:type="dxa" w:w="60"/>
-              <w:bottom w:type="dxa" w:w="30"/>
-              <w:right w:type="dxa" w:w="60"/>
-            </w:tcMar>
-            <w:vAlign w:val="center"/>
-          </w:tcPr>
-          <w:p>
-            <w:pPr>
-              <w:spacing w:after="0" w:line="208"/>
-              <w:jc w:val="center"/>
-            </w:pPr>
-            <w:r>
-              <w:rPr>
-                <w:rFonts w:ascii="Times New Roman" w:cs="Times New Roman" w:eastAsia="Times New Roman" w:hAnsi="Times New Roman"/>
-                <w:b w:val="false"/>
-                <w:bCs w:val="false"/>
-                <w:sz w:val="16"/>
-                <w:szCs w:val="16"/>
-              </w:rPr>
-              <w:t xml:space="preserve">A stale or guessed reference overriding a clear request</w:t>
-            </w:r>
-          </w:p>
-        </w:tc>
-        <w:tc>
-          <w:tcPr>
-            <w:tcW w:type="dxa" w:w="2800"/>
-            <w:tcBorders>
-              <w:top w:val="single" w:color="000000" w:sz="2"/>
-              <w:left w:val="single" w:color="000000" w:sz="2"/>
-              <w:bottom w:val="single" w:color="000000" w:sz="2"/>
-              <w:right w:val="single" w:color="000000" w:sz="2"/>
-            </w:tcBorders>
-            <w:tcMar>
-              <w:top w:type="dxa" w:w="30"/>
-              <w:left w:type="dxa" w:w="60"/>
-              <w:bottom w:type="dxa" w:w="30"/>
-              <w:right w:type="dxa" w:w="60"/>
-            </w:tcMar>
-            <w:vAlign w:val="center"/>
-          </w:tcPr>
-          <w:p>
-            <w:pPr>
-              <w:spacing w:after="0" w:line="208"/>
-              <w:jc w:val="center"/>
-            </w:pPr>
-            <w:r>
-              <w:rPr>
-                <w:rFonts w:ascii="Times New Roman" w:cs="Times New Roman" w:eastAsia="Times New Roman" w:hAnsi="Times New Roman"/>
-                <w:b w:val="false"/>
-                <w:bCs w:val="false"/>
-                <w:sz w:val="16"/>
-                <w:szCs w:val="16"/>
-              </w:rPr>
-              <w:t xml:space="preserve">Ordinal and pronoun rules, then a direct search; the model's flag is the last resort</w:t>
-            </w:r>
-          </w:p>
-        </w:tc>
-        <w:tc>
-          <w:tcPr>
-            <w:tcW w:type="dxa" w:w="2740"/>
-            <w:tcBorders>
-              <w:top w:val="single" w:color="000000" w:sz="2"/>
-              <w:left w:val="single" w:color="000000" w:sz="2"/>
-              <w:bottom w:val="single" w:color="000000" w:sz="2"/>
-              <w:right w:val="single" w:color="000000" w:sz="2"/>
-            </w:tcBorders>
-            <w:tcMar>
-              <w:top w:type="dxa" w:w="30"/>
-              <w:left w:type="dxa" w:w="60"/>
-              <w:bottom w:type="dxa" w:w="30"/>
-              <w:right w:type="dxa" w:w="60"/>
-            </w:tcMar>
-            <w:vAlign w:val="center"/>
-          </w:tcPr>
-          <w:p>
-            <w:pPr>
-              <w:spacing w:after="0" w:line="208"/>
-              <w:jc w:val="center"/>
-            </w:pPr>
-            <w:r>
-              <w:rPr>
-                <w:rFonts w:ascii="Times New Roman" w:cs="Times New Roman" w:eastAsia="Times New Roman" w:hAnsi="Times New Roman"/>
-                <w:b w:val="false"/>
-                <w:bCs w:val="false"/>
-                <w:sz w:val="16"/>
-                <w:szCs w:val="16"/>
-              </w:rPr>
-              <w:t xml:space="preserve">Live failure; regression test fails on the old order (Sec. IV-C)</w:t>
-            </w:r>
-          </w:p>
-        </w:tc>
-      </w:tr>
-      <w:tr>
-        <w:trPr>
-          <w:cantSplit/>
-        </w:trPr>
-        <w:tc>
-          <w:tcPr>
-            <w:tcW w:type="dxa" w:w="2000"/>
-            <w:tcBorders>
-              <w:top w:val="single" w:color="000000" w:sz="2"/>
-              <w:left w:val="single" w:color="000000" w:sz="2"/>
-              <w:bottom w:val="single" w:color="000000" w:sz="2"/>
-              <w:right w:val="single" w:color="000000" w:sz="2"/>
-            </w:tcBorders>
-            <w:tcMar>
-              <w:top w:type="dxa" w:w="30"/>
-              <w:left w:type="dxa" w:w="60"/>
-              <w:bottom w:type="dxa" w:w="30"/>
-              <w:right w:type="dxa" w:w="60"/>
-            </w:tcMar>
-            <w:vAlign w:val="center"/>
-          </w:tcPr>
-          <w:p>
-            <w:pPr>
-              <w:spacing w:after="0" w:line="208"/>
-              <w:jc w:val="left"/>
-            </w:pPr>
-            <w:r>
-              <w:rPr>
-                <w:rFonts w:ascii="Times New Roman" w:cs="Times New Roman" w:eastAsia="Times New Roman" w:hAnsi="Times New Roman"/>
-                <w:b w:val="false"/>
-                <w:bCs w:val="false"/>
-                <w:sz w:val="16"/>
-                <w:szCs w:val="16"/>
-              </w:rPr>
-              <w:t xml:space="preserve">Reversible organisation</w:t>
-            </w:r>
-          </w:p>
-        </w:tc>
-        <w:tc>
-          <w:tcPr>
-            <w:tcW w:type="dxa" w:w="2900"/>
-            <w:tcBorders>
-              <w:top w:val="single" w:color="000000" w:sz="2"/>
-              <w:left w:val="single" w:color="000000" w:sz="2"/>
-              <w:bottom w:val="single" w:color="000000" w:sz="2"/>
-              <w:right w:val="single" w:color="000000" w:sz="2"/>
-            </w:tcBorders>
-            <w:tcMar>
-              <w:top w:type="dxa" w:w="30"/>
-              <w:left w:type="dxa" w:w="60"/>
-              <w:bottom w:type="dxa" w:w="30"/>
-              <w:right w:type="dxa" w:w="60"/>
-            </w:tcMar>
-            <w:vAlign w:val="center"/>
-          </w:tcPr>
-          <w:p>
-            <w:pPr>
-              <w:spacing w:after="0" w:line="208"/>
-              <w:jc w:val="center"/>
-            </w:pPr>
-            <w:r>
-              <w:rPr>
-                <w:rFonts w:ascii="Times New Roman" w:cs="Times New Roman" w:eastAsia="Times New Roman" w:hAnsi="Times New Roman"/>
-                <w:b w:val="false"/>
-                <w:bCs w:val="false"/>
-                <w:sz w:val="16"/>
-                <w:szCs w:val="16"/>
-              </w:rPr>
-              <w:t xml:space="preserve">Irrecoverable moves of files</w:t>
-            </w:r>
-          </w:p>
-        </w:tc>
-        <w:tc>
-          <w:tcPr>
-            <w:tcW w:type="dxa" w:w="2800"/>
-            <w:tcBorders>
-              <w:top w:val="single" w:color="000000" w:sz="2"/>
-              <w:left w:val="single" w:color="000000" w:sz="2"/>
-              <w:bottom w:val="single" w:color="000000" w:sz="2"/>
-              <w:right w:val="single" w:color="000000" w:sz="2"/>
-            </w:tcBorders>
-            <w:tcMar>
-              <w:top w:type="dxa" w:w="30"/>
-              <w:left w:type="dxa" w:w="60"/>
-              <w:bottom w:type="dxa" w:w="30"/>
-              <w:right w:type="dxa" w:w="60"/>
-            </w:tcMar>
-            <w:vAlign w:val="center"/>
-          </w:tcPr>
-          <w:p>
-            <w:pPr>
-              <w:spacing w:after="0" w:line="208"/>
-              <w:jc w:val="center"/>
-            </w:pPr>
-            <w:r>
-              <w:rPr>
-                <w:rFonts w:ascii="Times New Roman" w:cs="Times New Roman" w:eastAsia="Times New Roman" w:hAnsi="Times New Roman"/>
-                <w:b w:val="false"/>
-                <w:bCs w:val="false"/>
-                <w:sz w:val="16"/>
-                <w:szCs w:val="16"/>
-              </w:rPr>
-              <w:t xml:space="preserve">Move only on confirmation; original path stored; revert restores it</w:t>
-            </w:r>
-          </w:p>
-        </w:tc>
-        <w:tc>
-          <w:tcPr>
-            <w:tcW w:type="dxa" w:w="2740"/>
-            <w:tcBorders>
-              <w:top w:val="single" w:color="000000" w:sz="2"/>
-              <w:left w:val="single" w:color="000000" w:sz="2"/>
-              <w:bottom w:val="single" w:color="000000" w:sz="2"/>
-              <w:right w:val="single" w:color="000000" w:sz="2"/>
-            </w:tcBorders>
-            <w:tcMar>
-              <w:top w:type="dxa" w:w="30"/>
-              <w:left w:type="dxa" w:w="60"/>
-              <w:bottom w:type="dxa" w:w="30"/>
-              <w:right w:type="dxa" w:w="60"/>
-            </w:tcMar>
-            <w:vAlign w:val="center"/>
-          </w:tcPr>
-          <w:p>
-            <w:pPr>
-              <w:spacing w:after="0" w:line="208"/>
-              <w:jc w:val="center"/>
-            </w:pPr>
-            <w:r>
-              <w:rPr>
-                <w:rFonts w:ascii="Times New Roman" w:cs="Times New Roman" w:eastAsia="Times New Roman" w:hAnsi="Times New Roman"/>
-                <w:b w:val="false"/>
-                <w:bCs w:val="false"/>
-                <w:sz w:val="16"/>
-                <w:szCs w:val="16"/>
-              </w:rPr>
-              <w:t xml:space="preserve">Apply-and-revert test; ids survive moves (Sec. III-C)</w:t>
-            </w:r>
-          </w:p>
-        </w:tc>
-      </w:tr>
-      <w:tr>
-        <w:trPr>
-          <w:cantSplit/>
-        </w:trPr>
-        <w:tc>
-          <w:tcPr>
-            <w:tcW w:type="dxa" w:w="2000"/>
-            <w:tcBorders>
-              <w:top w:val="single" w:color="000000" w:sz="2"/>
-              <w:left w:val="single" w:color="000000" w:sz="2"/>
-              <w:bottom w:val="single" w:color="000000" w:sz="2"/>
-              <w:right w:val="single" w:color="000000" w:sz="2"/>
-            </w:tcBorders>
-            <w:tcMar>
-              <w:top w:type="dxa" w:w="30"/>
-              <w:left w:type="dxa" w:w="60"/>
-              <w:bottom w:type="dxa" w:w="30"/>
-              <w:right w:type="dxa" w:w="60"/>
-            </w:tcMar>
-            <w:vAlign w:val="center"/>
-          </w:tcPr>
-          <w:p>
-            <w:pPr>
-              <w:spacing w:after="0" w:line="208"/>
-              <w:jc w:val="left"/>
-            </w:pPr>
-            <w:r>
-              <w:rPr>
-                <w:rFonts w:ascii="Times New Roman" w:cs="Times New Roman" w:eastAsia="Times New Roman" w:hAnsi="Times New Roman"/>
-                <w:b w:val="false"/>
-                <w:bCs w:val="false"/>
-                <w:sz w:val="16"/>
-                <w:szCs w:val="16"/>
-              </w:rPr>
-              <w:t xml:space="preserve">Checkable privacy audit</w:t>
-            </w:r>
-          </w:p>
-        </w:tc>
-        <w:tc>
-          <w:tcPr>
-            <w:tcW w:type="dxa" w:w="2900"/>
-            <w:tcBorders>
-              <w:top w:val="single" w:color="000000" w:sz="2"/>
-              <w:left w:val="single" w:color="000000" w:sz="2"/>
-              <w:bottom w:val="single" w:color="000000" w:sz="2"/>
-              <w:right w:val="single" w:color="000000" w:sz="2"/>
-            </w:tcBorders>
-            <w:tcMar>
-              <w:top w:type="dxa" w:w="30"/>
-              <w:left w:type="dxa" w:w="60"/>
-              <w:bottom w:type="dxa" w:w="30"/>
-              <w:right w:type="dxa" w:w="60"/>
-            </w:tcMar>
-            <w:vAlign w:val="center"/>
-          </w:tcPr>
-          <w:p>
-            <w:pPr>
-              <w:spacing w:after="0" w:line="208"/>
-              <w:jc w:val="center"/>
-            </w:pPr>
-            <w:r>
-              <w:rPr>
-                <w:rFonts w:ascii="Times New Roman" w:cs="Times New Roman" w:eastAsia="Times New Roman" w:hAnsi="Times New Roman"/>
-                <w:b w:val="false"/>
-                <w:bCs w:val="false"/>
-                <w:sz w:val="16"/>
-                <w:szCs w:val="16"/>
-              </w:rPr>
-              <w:t xml:space="preserve">An unverified claim that data stays local</w:t>
-            </w:r>
-          </w:p>
-        </w:tc>
-        <w:tc>
-          <w:tcPr>
-            <w:tcW w:type="dxa" w:w="2800"/>
-            <w:tcBorders>
-              <w:top w:val="single" w:color="000000" w:sz="2"/>
-              <w:left w:val="single" w:color="000000" w:sz="2"/>
-              <w:bottom w:val="single" w:color="000000" w:sz="2"/>
-              <w:right w:val="single" w:color="000000" w:sz="2"/>
-            </w:tcBorders>
-            <w:tcMar>
-              <w:top w:type="dxa" w:w="30"/>
-              <w:left w:type="dxa" w:w="60"/>
-              <w:bottom w:type="dxa" w:w="30"/>
-              <w:right w:type="dxa" w:w="60"/>
-            </w:tcMar>
-            <w:vAlign w:val="center"/>
-          </w:tcPr>
-          <w:p>
-            <w:pPr>
-              <w:spacing w:after="0" w:line="208"/>
-              <w:jc w:val="center"/>
-            </w:pPr>
-            <w:r>
-              <w:rPr>
-                <w:rFonts w:ascii="Times New Roman" w:cs="Times New Roman" w:eastAsia="Times New Roman" w:hAnsi="Times New Roman"/>
-                <w:b w:val="false"/>
-                <w:bCs w:val="false"/>
-                <w:sz w:val="16"/>
-                <w:szCs w:val="16"/>
-              </w:rPr>
-              <w:t xml:space="preserve">Lists every endpoint from live configuration; names a netstat check that can falsify it</w:t>
-            </w:r>
-          </w:p>
-        </w:tc>
-        <w:tc>
-          <w:tcPr>
-            <w:tcW w:type="dxa" w:w="2740"/>
-            <w:tcBorders>
-              <w:top w:val="single" w:color="000000" w:sz="2"/>
-              <w:left w:val="single" w:color="000000" w:sz="2"/>
-              <w:bottom w:val="single" w:color="000000" w:sz="2"/>
-              <w:right w:val="single" w:color="000000" w:sz="2"/>
-            </w:tcBorders>
-            <w:tcMar>
-              <w:top w:type="dxa" w:w="30"/>
-              <w:left w:type="dxa" w:w="60"/>
-              <w:bottom w:type="dxa" w:w="30"/>
-              <w:right w:type="dxa" w:w="60"/>
-            </w:tcMar>
-            <w:vAlign w:val="center"/>
-          </w:tcPr>
-          <w:p>
-            <w:pPr>
-              <w:spacing w:after="0" w:line="208"/>
-              <w:jc w:val="center"/>
-            </w:pPr>
-            <w:r>
-              <w:rPr>
-                <w:rFonts w:ascii="Times New Roman" w:cs="Times New Roman" w:eastAsia="Times New Roman" w:hAnsi="Times New Roman"/>
-                <w:b w:val="false"/>
-                <w:bCs w:val="false"/>
-                <w:sz w:val="16"/>
-                <w:szCs w:val="16"/>
-              </w:rPr>
-              <w:t xml:space="preserve">Sec. IV-D; every endpoint is loopback</w:t>
-            </w:r>
-          </w:p>
-        </w:tc>
-      </w:tr>
-    </w:tbl>
-    <w:p>
-      <w:pPr>
-        <w:sectPr>
-          <w:footerReference w:type="default" r:id="rId15"/>
-          <w:type w:val="continuous"/>
-          <w:pgSz w:w="12240" w:h="15840" w:orient="portrait"/>
-          <w:pgMar w:top="1080" w:right="900" w:bottom="1440" w:left="900" w:header="708" w:footer="708" w:gutter="0"/>
-          <w:pgNumType/>
-          <w:docGrid w:linePitch="360"/>
-        </w:sectPr>
-      </w:pPr>
-    </w:p>
-    <w:p>
-      <w:pPr>
-        <w:keepNext/>
-        <w:spacing w:after="70" w:before="140"/>
-        <w:jc w:val="center"/>
-      </w:pPr>
-      <w:r>
-        <w:rPr>
-          <w:rFonts w:ascii="Times New Roman" w:cs="Times New Roman" w:eastAsia="Times New Roman" w:hAnsi="Times New Roman"/>
-          <w:b/>
-          <w:bCs/>
-          <w:sz w:val="20"/>
-          <w:szCs w:val="20"/>
-        </w:rPr>
-        <w:t xml:space="preserve">IV. METHODS</w:t>
-      </w:r>
-    </w:p>
-    <w:p>
-      <w:pPr>
-        <w:keepNext/>
-        <w:spacing w:after="30" w:before="80"/>
-      </w:pPr>
-      <w:r>
-        <w:rPr>
-          <w:rFonts w:ascii="Times New Roman" w:cs="Times New Roman" w:eastAsia="Times New Roman" w:hAnsi="Times New Roman"/>
-          <w:b/>
-          <w:bCs/>
-          <w:i/>
-          <w:iCs/>
-          <w:sz w:val="20"/>
-          <w:szCs w:val="20"/>
-        </w:rPr>
-        <w:t xml:space="preserve">A. Semantic search</w:t>
-      </w:r>
-    </w:p>
-    <w:p>
-      <w:pPr>
-        <w:spacing w:after="0" w:line="230"/>
-        <w:ind w:firstLine="280"/>
-        <w:jc w:val="both"/>
-      </w:pPr>
-      <w:r>
-        <w:rPr>
-          <w:rFonts w:ascii="Times New Roman" w:cs="Times New Roman" w:eastAsia="Times New Roman" w:hAnsi="Times New Roman"/>
-          <w:sz w:val="20"/>
-          <w:szCs w:val="20"/>
-        </w:rPr>
-        <w:t xml:space="preserve">A query q is embedded and compared with every chunk c. A file f takes the score of its best chunk, plus a small boost for literal vocabulary overlap, where Q is the query's content words (stop-words removed, plurals folded) and T_f the words of the file's name and text:</w:t>
-      </w:r>
-    </w:p>
-    <w:p>
-      <w:pPr>
-        <w:spacing w:after="30" w:before="30"/>
-        <w:jc w:val="center"/>
-      </w:pPr>
-      <w:r>
-        <w:rPr>
-          <w:rFonts w:ascii="Times New Roman" w:cs="Times New Roman" w:eastAsia="Times New Roman" w:hAnsi="Times New Roman"/>
-          <w:i/>
-          <w:iCs/>
-          <w:sz w:val="20"/>
-          <w:szCs w:val="20"/>
-        </w:rPr>
-        <w:t xml:space="preserve">s(f) = max_c cos(e_q, e_c) + λ · |Q ∩ T_f| / |Q|</w:t>
-      </w:r>
-      <w:r>
-        <w:rPr>
-          <w:rFonts w:ascii="Times New Roman" w:cs="Times New Roman" w:eastAsia="Times New Roman" w:hAnsi="Times New Roman"/>
-          <w:sz w:val="20"/>
-          <w:szCs w:val="20"/>
-        </w:rPr>
-        <w:t xml:space="preserve">        (1)</w:t>
-      </w:r>
-    </w:p>
-    <w:p>
-      <w:pPr>
-        <w:spacing w:after="30" w:before="30"/>
-        <w:jc w:val="center"/>
-      </w:pPr>
-      <w:r>
-        <w:rPr>
-          <w:rFonts w:ascii="Times New Roman" w:cs="Times New Roman" w:eastAsia="Times New Roman" w:hAnsi="Times New Roman"/>
-          <w:i/>
-          <w:iCs/>
-          <w:sz w:val="20"/>
-          <w:szCs w:val="20"/>
-        </w:rPr>
-        <w:t xml:space="preserve">keep f  iff  s(f) ≥ max(τ, s* − δ)</w:t>
-      </w:r>
-      <w:r>
-        <w:rPr>
-          <w:rFonts w:ascii="Times New Roman" w:cs="Times New Roman" w:eastAsia="Times New Roman" w:hAnsi="Times New Roman"/>
-          <w:sz w:val="20"/>
-          <w:szCs w:val="20"/>
-        </w:rPr>
-        <w:t xml:space="preserve">        (2)</w:t>
-      </w:r>
-    </w:p>
-    <w:p>
-      <w:pPr>
-        <w:spacing w:after="0" w:line="230"/>
-        <w:jc w:val="both"/>
-      </w:pPr>
-      <w:r>
-        <w:rPr>
-          <w:rFonts w:ascii="Times New Roman" w:cs="Times New Roman" w:eastAsia="Times New Roman" w:hAnsi="Times New Roman"/>
-          <w:sz w:val="20"/>
-          <w:szCs w:val="20"/>
-        </w:rPr>
-        <w:t xml:space="preserve">with floor τ = 0.47, margin δ = 0.06 below the best score s*, and λ = 0.08. A fixed cut-off was abandoned because it dropped correct answers to short queries (20 of 27 on the tuning set, against 27 of 27 with the relative rule). Results below a confidence bar of 0.55 are labelled low-confidence, and the open action never launches a file from such a result.</w:t>
-      </w:r>
-    </w:p>
-    <w:p>
-      <w:pPr>
-        <w:keepNext/>
-        <w:spacing w:after="30" w:before="80"/>
-      </w:pPr>
-      <w:r>
-        <w:rPr>
-          <w:rFonts w:ascii="Times New Roman" w:cs="Times New Roman" w:eastAsia="Times New Roman" w:hAnsi="Times New Roman"/>
-          <w:b/>
-          <w:bCs/>
-          <w:i/>
-          <w:iCs/>
-          <w:sz w:val="20"/>
-          <w:szCs w:val="20"/>
-        </w:rPr>
-        <w:t xml:space="preserve">B. Knowledge graph</w:t>
-      </w:r>
-    </w:p>
-    <w:p>
-      <w:pPr>
-        <w:spacing w:after="0" w:line="230"/>
-        <w:ind w:firstLine="280"/>
-        <w:jc w:val="both"/>
-      </w:pPr>
-      <w:r>
-        <w:rPr>
-          <w:rFonts w:ascii="Times New Roman" w:cs="Times New Roman" w:eastAsia="Times New Roman" w:hAnsi="Times New Roman"/>
-          <w:sz w:val="20"/>
-          <w:szCs w:val="20"/>
-        </w:rPr>
-        <w:t xml:space="preserve">Three typed, weighted edge kinds connect files: similar (cosine of mean chunk embeddings), references (one file's text names another by file name) and shared_tag (at least two AI-generated tags in common). Raw cosine is compressed by anisotropy, so vectors are first mean-centred, ĥ_f = (h_f − μ) / ‖h_f − μ‖, which spreads unrelated pairs to about 0 and related pairs to 0.25-0.4; the similar-edge threshold is 0.25 on that scale and each file keeps its three strongest neighbours. Clusters use average-linkage merging, joining two groups only while the mean edge weight between their members, counting missing edges as 0, exceeds 0.12. Plain connected components chained unrelated groups through single weak bridges (a 7-file cluster mixing resumes with proposals); average linkage cannot chain.</w:t>
-      </w:r>
-    </w:p>
-    <w:p>
-      <w:pPr>
-        <w:spacing w:after="0" w:line="230"/>
-        <w:ind w:firstLine="280"/>
-        <w:jc w:val="both"/>
-      </w:pPr>
-      <w:r>
-        <w:rPr>
-          <w:rFonts w:ascii="Times New Roman" w:cs="Times New Roman" w:eastAsia="Times New Roman" w:hAnsi="Times New Roman"/>
-          <w:sz w:val="20"/>
-          <w:szCs w:val="20"/>
-        </w:rPr>
-        <w:t xml:space="preserve">The pairwise similarity loop was replaced by one matrix product, S = ĤĤ^T, and two further all-pairs steps by a token index (the reference check, which was 98% of the 5,000-file rebuild) and a heap over per-group adjacency (the clustering). Each was checked against its original definition on random data; ties in clustering are broken by lowest group id (Sec. VI-C).</w:t>
-      </w:r>
-    </w:p>
-    <w:p>
-      <w:pPr>
-        <w:keepNext/>
-        <w:spacing w:after="30" w:before="80"/>
-      </w:pPr>
-      <w:r>
-        <w:rPr>
-          <w:rFonts w:ascii="Times New Roman" w:cs="Times New Roman" w:eastAsia="Times New Roman" w:hAnsi="Times New Roman"/>
-          <w:b/>
-          <w:bCs/>
-          <w:i/>
-          <w:iCs/>
-          <w:sz w:val="20"/>
-          <w:szCs w:val="20"/>
-        </w:rPr>
-        <w:t xml:space="preserve">C. Context memory and deterministic precedence</w:t>
-      </w:r>
-    </w:p>
-    <w:p>
-      <w:pPr>
-        <w:spacing w:after="0" w:line="230"/>
-        <w:ind w:firstLine="280"/>
-        <w:jc w:val="both"/>
-      </w:pPr>
-      <w:r>
-        <w:rPr>
-          <w:rFonts w:ascii="Times New Roman" w:cs="Times New Roman" w:eastAsia="Times New Roman" w:hAnsi="Times New Roman"/>
-          <w:sz w:val="20"/>
-          <w:szCs w:val="20"/>
-        </w:rPr>
-        <w:t xml:space="preserve">Each turn is stored with the identifiers of the files it showed, so follow-ups such as "open the second one" resolve after a restart or a file move. Fig. 3 gives the order: ordinal and bare-pronoun rules, then a direct search on the topic the classifier extracted, and only if that search is below the confidence bar the model's own "refers to previous" flag as a last resort.</w:t>
-      </w:r>
-    </w:p>
-    <w:p>
-      <w:pPr>
-        <w:keepNext/>
-        <w:spacing w:after="0" w:before="80"/>
-        <w:jc w:val="center"/>
-      </w:pPr>
-      <w:r>
-        <w:drawing>
-          <wp:inline distT="0" distB="0" distL="0" distR="0">
-            <wp:extent cx="2171700" cy="1885950"/>
-            <wp:effectExtent t="0" r="0" b="0" l="0"/>
-            <wp:docPr id="1" name="" descr="" title=""/>
-            <wp:cNvGraphicFramePr>
-              <a:graphicFrameLocks xmlns:a="http://schemas.openxmlformats.org/drawingml/2006/main" noChangeAspect="1"/>
-            </wp:cNvGraphicFramePr>
-            <a:graphic xmlns:a="http://schemas.openxmlformats.org/drawingml/2006/main">
-              <a:graphicData uri="http://schemas.openxmlformats.org/drawingml/2006/picture">
-                <pic:pic xmlns:pic="http://schemas.openxmlformats.org/drawingml/2006/picture">
-                  <pic:nvPicPr>
-                    <pic:cNvPr id="0" name="" descr=""/>
-                    <pic:cNvPicPr>
-                      <a:picLocks noChangeAspect="1" noChangeArrowheads="1"/>
-                    </pic:cNvPicPr>
-                  </pic:nvPicPr>
-                  <pic:blipFill>
-                    <a:blip r:embed="rId27" cstate="none"/>
-                    <a:srcRect/>
-                    <a:stretch>
-                      <a:fillRect/>
-                    </a:stretch>
-                  </pic:blipFill>
-                  <pic:spPr bwMode="auto">
-                    <a:xfrm>
-                      <a:off x="0" y="0"/>
-                      <a:ext cx="2171700" cy="1885950"/>
-                    </a:xfrm>
-                    <a:prstGeom prst="rect">
-                      <a:avLst/>
-                    </a:prstGeom>
-                  </pic:spPr>
-                </pic:pic>
-              </a:graphicData>
-            </a:graphic>
-          </wp:inline>
-        </w:drawing>
-      </w:r>
-    </w:p>
-    <w:p>
-      <w:pPr>
-        <w:spacing w:after="110" w:before="50" w:line="216"/>
-        <w:jc w:val="both"/>
-      </w:pPr>
-      <w:r>
-        <w:rPr>
-          <w:rFonts w:ascii="Times New Roman" w:cs="Times New Roman" w:eastAsia="Times New Roman" w:hAnsi="Times New Roman"/>
-          <w:b/>
-          <w:bCs/>
-          <w:sz w:val="16"/>
-          <w:szCs w:val="16"/>
-        </w:rPr>
-        <w:t xml:space="preserve">Fig. 3. </w:t>
-      </w:r>
-      <w:r>
-        <w:rPr>
-          <w:rFonts w:ascii="Times New Roman" w:cs="Times New Roman" w:eastAsia="Times New Roman" w:hAnsi="Times New Roman"/>
-          <w:sz w:val="16"/>
-          <w:szCs w:val="16"/>
-        </w:rPr>
-        <w:t xml:space="preserve">Follow-up resolution flowchart. Amber: decisions, evaluated top to bottom; green: outcomes. Deterministic evidence precedes the language model's own judgement.</w:t>
-      </w:r>
-    </w:p>
-    <w:p>
-      <w:pPr>
-        <w:spacing w:after="0" w:line="230"/>
-        <w:jc w:val="both"/>
-      </w:pPr>
-      <w:r>
-        <w:rPr>
-          <w:rFonts w:ascii="Times New Roman" w:cs="Times New Roman" w:eastAsia="Times New Roman" w:hAnsi="Times New Roman"/>
-          <w:sz w:val="20"/>
-          <w:szCs w:val="20"/>
-        </w:rPr>
-        <w:t xml:space="preserve">The order was fixed after a live rehearsal. Asked "what is related to my resume" after a search for invoices, the system answered about an invoice file. The 3B model set its continuation flag to true for this sentence while correctly extracting "resume" as the topic, apparently because the sentence matched an example in its own instructions; the system had trusted the flag unconditionally. A regression test that fails on the old precedence and passes on the new guards it.</w:t>
-      </w:r>
-    </w:p>
-    <w:p>
-      <w:pPr>
-        <w:keepNext/>
-        <w:spacing w:after="30" w:before="80"/>
-      </w:pPr>
-      <w:r>
-        <w:rPr>
-          <w:rFonts w:ascii="Times New Roman" w:cs="Times New Roman" w:eastAsia="Times New Roman" w:hAnsi="Times New Roman"/>
-          <w:b/>
-          <w:bCs/>
-          <w:i/>
-          <w:iCs/>
-          <w:sz w:val="20"/>
-          <w:szCs w:val="20"/>
-        </w:rPr>
-        <w:t xml:space="preserve">D. Privacy audit</w:t>
-      </w:r>
-    </w:p>
-    <w:p>
-      <w:pPr>
-        <w:spacing w:after="0" w:line="230"/>
-        <w:ind w:firstLine="280"/>
-        <w:jc w:val="both"/>
-      </w:pPr>
-      <w:r>
-        <w:rPr>
-          <w:rFonts w:ascii="Times New Roman" w:cs="Times New Roman" w:eastAsia="Times New Roman" w:hAnsi="Times New Roman"/>
-          <w:sz w:val="20"/>
-          <w:szCs w:val="20"/>
-        </w:rPr>
-        <w:t xml:space="preserve">An endpoint reads live configuration and lists every address the service is set to call, whether each is loopback, and what is stored locally. It states that it checks configuration, not traffic, and names the independent check (listing listening sockets with netstat), so the claim can be falsified.</w:t>
-      </w:r>
-    </w:p>
-    <w:p>
-      <w:pPr>
-        <w:keepNext/>
-        <w:spacing w:after="30" w:before="80"/>
-      </w:pPr>
-      <w:r>
-        <w:rPr>
-          <w:rFonts w:ascii="Times New Roman" w:cs="Times New Roman" w:eastAsia="Times New Roman" w:hAnsi="Times New Roman"/>
-          <w:b/>
-          <w:bCs/>
-          <w:i/>
-          <w:iCs/>
-          <w:sz w:val="20"/>
-          <w:szCs w:val="20"/>
-        </w:rPr>
-        <w:t xml:space="preserve">E. Organiser and workspaces</w:t>
-      </w:r>
-    </w:p>
-    <w:p>
-      <w:pPr>
-        <w:spacing w:after="0" w:line="230"/>
-        <w:ind w:firstLine="280"/>
-        <w:jc w:val="both"/>
-      </w:pPr>
-      <w:r>
-        <w:rPr>
-          <w:rFonts w:ascii="Times New Roman" w:cs="Times New Roman" w:eastAsia="Times New Roman" w:hAnsi="Times New Roman"/>
-          <w:sz w:val="20"/>
-          <w:szCs w:val="20"/>
-        </w:rPr>
-        <w:t xml:space="preserve">For each file the model proposes a summary, tags, a category and a reason; a move is applied only on confirmation and is reversible. Workspace recommendations are rule-based on purpose, so they are reproducible, explainable and cost no model calls.</w:t>
-      </w:r>
-    </w:p>
-    <w:p>
-      <w:pPr>
-        <w:keepNext/>
-        <w:spacing w:after="70" w:before="140"/>
-        <w:jc w:val="center"/>
-      </w:pPr>
-      <w:r>
-        <w:rPr>
-          <w:rFonts w:ascii="Times New Roman" w:cs="Times New Roman" w:eastAsia="Times New Roman" w:hAnsi="Times New Roman"/>
-          <w:b/>
-          <w:bCs/>
-          <w:sz w:val="20"/>
-          <w:szCs w:val="20"/>
-        </w:rPr>
-        <w:t xml:space="preserve">V. EXPERIMENTAL SETUP</w:t>
-      </w:r>
-    </w:p>
-    <w:p>
-      <w:pPr>
-        <w:spacing w:after="0" w:line="230"/>
-        <w:ind w:firstLine="280"/>
-        <w:jc w:val="both"/>
-      </w:pPr>
-      <w:r>
-        <w:rPr>
-          <w:rFonts w:ascii="Times New Roman" w:cs="Times New Roman" w:eastAsia="Times New Roman" w:hAnsi="Times New Roman"/>
-          <w:sz w:val="20"/>
-          <w:szCs w:val="20"/>
-        </w:rPr>
-        <w:t xml:space="preserve">All runs used one laptop (AMD Ryzen 7 6800H, 16 GB RAM, Windows 11, CPU only) with nomic-embed-text and llama3.2 3B on Ollama. The 123 automated tests run offline against fixtures and on every push in continuous integration.</w:t>
-      </w:r>
-    </w:p>
-    <w:p>
-      <w:pPr>
-        <w:keepNext/>
-        <w:spacing w:after="30" w:before="80"/>
-      </w:pPr>
-      <w:r>
-        <w:rPr>
-          <w:rFonts w:ascii="Times New Roman" w:cs="Times New Roman" w:eastAsia="Times New Roman" w:hAnsi="Times New Roman"/>
-          <w:b/>
-          <w:bCs/>
-          <w:i/>
-          <w:iCs/>
-          <w:sz w:val="20"/>
-          <w:szCs w:val="20"/>
-        </w:rPr>
-        <w:t xml:space="preserve">A. Retrieval comparison</w:t>
-      </w:r>
-    </w:p>
-    <w:p>
-      <w:pPr>
-        <w:spacing w:after="0" w:line="230"/>
-        <w:ind w:firstLine="280"/>
-        <w:jc w:val="both"/>
-      </w:pPr>
-      <w:r>
-        <w:rPr>
-          <w:rFonts w:ascii="Times New Roman" w:cs="Times New Roman" w:eastAsia="Times New Roman" w:hAnsi="Times New Roman"/>
-          <w:sz w:val="20"/>
-          <w:szCs w:val="20"/>
-        </w:rPr>
-        <w:t xml:space="preserve">The corpus is the 37-file demonstration vault: deliberately messy text, Markdown and source files (CVs, invoices, meeting notes, a recipe, scripts). We wrote 36 queries with their relevant files before running any system. Each query is partitioned automatically by whether any of its content words, after the system's own stop-word and plural folding, occurs in a relevant file's name or text: 26 do, 10 do not. Four systems return at most 8 files: (i) filename match, a lexical match on names only, standing in for name-index tools [7]; (ii) BM25 [12] over name and text, standing in for lexical content indexes [5], [6]; (iii) embedding only, DreamOS without the keyword boost and cut-off; (iv) DreamOS as shipped. Metrics are Hit@1, Hit@3 and mean reciprocal rank (MRR), with 95% Wilson intervals [17] on Hit@1, following standard information-retrieval evaluation practice [18].</w:t>
-      </w:r>
-    </w:p>
-    <w:p>
-      <w:pPr>
-        <w:keepNext/>
-        <w:spacing w:after="30" w:before="80"/>
-      </w:pPr>
-      <w:r>
-        <w:rPr>
-          <w:rFonts w:ascii="Times New Roman" w:cs="Times New Roman" w:eastAsia="Times New Roman" w:hAnsi="Times New Roman"/>
-          <w:b/>
-          <w:bCs/>
-          <w:i/>
-          <w:iCs/>
-          <w:sz w:val="20"/>
-          <w:szCs w:val="20"/>
-        </w:rPr>
-        <w:t xml:space="preserve">B. Scale evaluation</w:t>
-      </w:r>
-    </w:p>
-    <w:p>
-      <w:pPr>
-        <w:spacing w:after="0" w:line="230"/>
-        <w:ind w:firstLine="280"/>
-        <w:jc w:val="both"/>
-      </w:pPr>
-      <w:r>
-        <w:rPr>
-          <w:rFonts w:ascii="Times New Roman" w:cs="Times New Roman" w:eastAsia="Times New Roman" w:hAnsi="Times New Roman"/>
-          <w:sz w:val="20"/>
-          <w:szCs w:val="20"/>
-        </w:rPr>
-        <w:t xml:space="preserve">Synthetic vaults of 500, 2,000 and 5,000 text files across twelve topics (half with one distractor sentence from another topic) were each run in a fresh process with a fresh database and the real models, measuring indexing throughput, graph rebuild time, the latency of 36 queries and precision at 5 against the generated topic label. The scripts (bench_scale.py, eval_retrieval.py) are in the project repository.</w:t>
-      </w:r>
-    </w:p>
-    <w:p>
-      <w:pPr>
-        <w:sectPr>
-          <w:footerReference w:type="default" r:id="rId16"/>
-          <w:type w:val="continuous"/>
-          <w:pgSz w:w="12240" w:h="15840" w:orient="portrait"/>
-          <w:pgMar w:top="1080" w:right="900" w:bottom="1440" w:left="900" w:header="708" w:footer="708" w:gutter="0"/>
-          <w:pgNumType/>
-          <w:cols w:space="360" w:num="2"/>
-          <w:docGrid w:linePitch="360"/>
-        </w:sectPr>
-      </w:pPr>
-    </w:p>
-    <w:p>
-      <w:pPr>
-        <w:keepNext/>
-        <w:spacing w:after="50" w:before="90" w:line="216"/>
-        <w:jc w:val="center"/>
-      </w:pPr>
-      <w:r>
-        <w:rPr>
-          <w:rFonts w:ascii="Times New Roman" w:cs="Times New Roman" w:eastAsia="Times New Roman" w:hAnsi="Times New Roman"/>
-          <w:b/>
-          <w:bCs/>
-          <w:sz w:val="16"/>
-          <w:szCs w:val="16"/>
-        </w:rPr>
-        <w:t xml:space="preserve">TABLE IV</w:t>
       </w:r>
       <w:r>
         <w:rPr>
@@ -6151,7 +5363,7 @@
     <w:p>
       <w:pPr>
         <w:sectPr>
-          <w:footerReference w:type="default" r:id="rId17"/>
+          <w:footerReference w:type="default" r:id="rId15"/>
           <w:type w:val="continuous"/>
           <w:pgSz w:w="12240" w:h="15840" w:orient="portrait"/>
           <w:pgMar w:top="1080" w:right="900" w:bottom="1440" w:left="900" w:header="708" w:footer="708" w:gutter="0"/>
@@ -6207,7 +5419,7 @@
           <w:sz w:val="20"/>
           <w:szCs w:val="20"/>
         </w:rPr>
-        <w:t xml:space="preserve">Table IV and Fig. 4 show the comparison. DreamOS places a relevant file first for 94% of all queries and within the first three for 100%, against 56% and 67% for BM25. The partition explains the gap: when a query shares a word with its target, BM25 reaches Hit@1 0.77 and DreamOS 1.00; when it shares none, both lexical baselines score exactly 0.00 by construction, while DreamOS scores 0.80 with all 10 targets inside the top three. Examples are "present for my mother" finding the gift list that says "Mom's birthday", and "how to brew a hot drink with spices" finding the chai recipe.</w:t>
+        <w:t xml:space="preserve">Table III and Fig. 4 show the comparison. DreamOS places a relevant file first for 94% of all queries and within the first three for 100%, against 56% and 67% for BM25. The partition explains the gap: when a query shares a word with its target, BM25 reaches Hit@1 0.77 and DreamOS 1.00; when it shares none, both lexical baselines score exactly 0.00 by construction, while DreamOS scores 0.80 with all 10 targets inside the top three. Examples are "present for my mother" finding the gift list that says "Mom's birthday", and "how to brew a hot drink with spices" finding the chai recipe.</w:t>
       </w:r>
     </w:p>
     <w:p>
@@ -6219,7 +5431,7 @@
       <w:r>
         <w:drawing>
           <wp:inline distT="0" distB="0" distL="0" distR="0">
-            <wp:extent cx="2819400" cy="1695450"/>
+            <wp:extent cx="2371725" cy="1428750"/>
             <wp:effectExtent t="0" r="0" b="0" l="0"/>
             <wp:docPr id="1" name="" descr="" title=""/>
             <wp:cNvGraphicFramePr>
@@ -6235,7 +5447,7 @@
                     </pic:cNvPicPr>
                   </pic:nvPicPr>
                   <pic:blipFill>
-                    <a:blip r:embed="rId28" cstate="none"/>
+                    <a:blip r:embed="rId26" cstate="none"/>
                     <a:srcRect/>
                     <a:stretch>
                       <a:fillRect/>
@@ -6244,7 +5456,7 @@
                   <pic:spPr bwMode="auto">
                     <a:xfrm>
                       <a:off x="0" y="0"/>
-                      <a:ext cx="2819400" cy="1695450"/>
+                      <a:ext cx="2371725" cy="1428750"/>
                     </a:xfrm>
                     <a:prstGeom prst="rect">
                       <a:avLst/>
@@ -6292,7 +5504,7 @@
           <w:sz w:val="20"/>
           <w:szCs w:val="20"/>
         </w:rPr>
-        <w:t xml:space="preserve">Two findings are less favourable and are reported as measured. First, the keyword boost helps queries that share words (Hit@1 0.92 to 1.00) but costs one of the 10 paraphrase queries (0.90 to 0.80); the intervals overlap, so the data cannot separate the two configurations. Second, DreamOS missed rank 1 on two queries ("remarks from our mentor about what to improve" and "spending breakdown for the semester"), both of which placed an unrelated quotes file first with the correct file second. With 36 queries the Hit@1 interval for DreamOS is wide (about 0.82 to 0.99), so differences of a few points between the embedding systems should not be over-read.</w:t>
+        <w:t xml:space="preserve">Two findings are less favourable and are reported as measured. First, the keyword boost helps queries that share words (Hit@1 0.92 to 1.00) but costs one of the 10 paraphrase queries (0.90 to 0.80); the intervals overlap, so the data cannot separate the two configurations. Second, DreamOS missed rank 1 on two queries ("remarks from our mentor about what to improve" and "spending breakdown for the semester"), both of which placed an unrelated quotes file first with the correct file second. The paired tests separate the two classes but not the two embedding systems: DreamOS answers 14 queries at rank 1 that BM25 misses and none the other way (exact McNemar p &lt; 0.001; bootstrap 95% interval on the Hit@1 difference +0.22 to +0.56), whereas against embedding only it wins 2 and loses 1 (p = 1.00; interval −0.06 to +0.11). With 36 queries the Hit@1 Wilson interval for DreamOS alone is 0.82 to 0.98, so differences of a few points between the embedding systems should not be over-read.</w:t>
       </w:r>
     </w:p>
     <w:p>
@@ -6325,7 +5537,7 @@
           <w:sz w:val="20"/>
           <w:szCs w:val="20"/>
         </w:rPr>
-        <w:t xml:space="preserve">The open action is the one place where a retrieval error becomes an action on the user's computer, so we measured the confidence guard on the same 36 queries. Following the rule in Table III, a file is launched only when its similarity is at least 0.55 and no runner-up lies within 0.05. Opening the top result unconditionally would launch 36 files, 2 of them wrong. The guard launches 29 files, all 29 correct, and holds back 7 queries (2 below the bar, 5 with a close runner-up), showing candidates instead. Of the held-back queries, 5 would have opened the right file, so the price of the guard is 5 extra confirmations and the benefit is that both wrong opens are prevented. Two caveats apply: the bar of 0.55 was tuned earlier on this vault, so this is a measurement of the policy, not a held-out estimate; and the real application also resolves some close calls by the file the user opens most, which this offline evaluation does not model.</w:t>
+        <w:t xml:space="preserve">The open action is the one place where a retrieval error becomes an action on the user's computer, so we measured the confidence guard on the same 36 queries. Following the rule in Table II, a file is launched only when its similarity is at least 0.55 and no runner-up lies within 0.05. Opening the top result unconditionally would launch 36 files, 2 of them wrong. The guard launches 29 files, all 29 correct, and holds back 7 queries (2 below the bar, 5 with a close runner-up), showing candidates instead. Of the held-back queries, 5 would have opened the right file, so the price of the guard is 5 extra confirmations and the benefit is that both wrong opens are prevented. Two caveats apply: the bar of 0.55 was tuned earlier on this vault, so this is a measurement of the policy, not a held-out estimate; and the real application also resolves some close calls by the file the user opens most, which this offline evaluation does not model.</w:t>
       </w:r>
     </w:p>
     <w:p>
@@ -6358,13 +5570,13 @@
           <w:sz w:val="20"/>
           <w:szCs w:val="20"/>
         </w:rPr>
-        <w:t xml:space="preserve">Table V and Fig. 5 report the scale runs. Indexing stays above 18.1 files per second up to 5,000 files and median search latency grows from 34.5 ms to 204.7 ms. Graph construction was sped up in two stages. Vectorising the similarity step cut the 500-file rebuild from 17.0 s to 1.7 s and the 2,000-file rebuild from 246.1 s to 24.8 s, but profiling the 5,000-file rebuild (143.3 s) showed that 98% of it was the reference check, an all-pairs regular-expression search. Replacing that with a token index, and the clustering with a heap over per-group adjacency, brought the rebuilds to 0.4 s, 1.3 s and 3.2 s at 500, 2,000 and 5,000 files, with the same edge set. Indexing is now dominated by embedding: at 5,000 files the graph is 1% of the 276.3 s index pass. Precision at 5 is 1.00 at every size, which shows only that the twelve synthetic topics separate; it is not a quality claim for real documents.</w:t>
+        <w:t xml:space="preserve">Table IV and Fig. 5 report the scale runs. Indexing runs at 18.1 to 23.2 files per second across the three sizes and median search latency grows from 34.5 ms to 204.7 ms. Graph construction was sped up in two stages. Vectorising the similarity step cut the 500-file rebuild from 17.0 s to 1.7 s and the 2,000-file rebuild from 246.1 s to 24.8 s, but profiling the 5,000-file rebuild (143.3 s) showed that 98% of it was the reference check, an all-pairs regular-expression search. Replacing that with a token index, and the clustering with a heap over per-group adjacency, brought the rebuilds to 0.4 s, 1.3 s and 3.2 s at 500, 2,000 and 5,000 files, with the same edge set. Indexing is now dominated by embedding: at 5,000 files the graph is 1% of the 276.3 s index pass. Precision at 5 is 1.00 at every size, which shows only that the twelve synthetic topics separate; it is not a quality claim for real documents.</w:t>
       </w:r>
     </w:p>
     <w:p>
       <w:pPr>
         <w:sectPr>
-          <w:footerReference w:type="default" r:id="rId18"/>
+          <w:footerReference w:type="default" r:id="rId16"/>
           <w:type w:val="continuous"/>
           <w:pgSz w:w="12240" w:h="15840" w:orient="portrait"/>
           <w:pgMar w:top="1080" w:right="900" w:bottom="1440" w:left="900" w:header="708" w:footer="708" w:gutter="0"/>
@@ -6388,7 +5600,7 @@
           <w:sz w:val="16"/>
           <w:szCs w:val="16"/>
         </w:rPr>
-        <w:t xml:space="preserve">TABLE V</w:t>
+        <w:t xml:space="preserve">TABLE IV</w:t>
       </w:r>
       <w:r>
         <w:rPr>
@@ -7404,7 +6616,7 @@
     <w:p>
       <w:pPr>
         <w:sectPr>
-          <w:footerReference w:type="default" r:id="rId19"/>
+          <w:footerReference w:type="default" r:id="rId17"/>
           <w:type w:val="continuous"/>
           <w:pgSz w:w="12240" w:h="15840" w:orient="portrait"/>
           <w:pgMar w:top="1080" w:right="900" w:bottom="1440" w:left="900" w:header="708" w:footer="708" w:gutter="0"/>
@@ -7422,7 +6634,7 @@
       <w:r>
         <w:drawing>
           <wp:inline distT="0" distB="0" distL="0" distR="0">
-            <wp:extent cx="5572125" cy="1676400"/>
+            <wp:extent cx="4638675" cy="1390650"/>
             <wp:effectExtent t="0" r="0" b="0" l="0"/>
             <wp:docPr id="1" name="" descr="" title=""/>
             <wp:cNvGraphicFramePr>
@@ -7438,7 +6650,7 @@
                     </pic:cNvPicPr>
                   </pic:nvPicPr>
                   <pic:blipFill>
-                    <a:blip r:embed="rId29" cstate="none"/>
+                    <a:blip r:embed="rId27" cstate="none"/>
                     <a:srcRect/>
                     <a:stretch>
                       <a:fillRect/>
@@ -7447,7 +6659,7 @@
                   <pic:spPr bwMode="auto">
                     <a:xfrm>
                       <a:off x="0" y="0"/>
-                      <a:ext cx="5572125" cy="1676400"/>
+                      <a:ext cx="4638675" cy="1390650"/>
                     </a:xfrm>
                     <a:prstGeom prst="rect">
                       <a:avLst/>
@@ -7481,13 +6693,13 @@
           <w:sz w:val="16"/>
           <w:szCs w:val="16"/>
         </w:rPr>
-        <w:t xml:space="preserve">Scale results from the same runs as Table V. (a) Graph rebuild time on a log scale at three stages: the original pairwise loop, vectorised similarity only, and the final version (token-indexed reference check, heap clustering). (b) Indexing throughput, which includes the graph rebuild. (c) Median and 95th-percentile search latency, which grows with the number of stored vectors.</w:t>
+        <w:t xml:space="preserve">Scale results from the same runs as Table IV. (a) Graph rebuild time on a log scale at three stages: the original pairwise loop, vectorised similarity only, and the final version (token-indexed reference check, heap clustering). (b) Indexing throughput, which includes the graph rebuild. (c) Median and 95th-percentile search latency, which grows with the number of stored vectors.</w:t>
       </w:r>
     </w:p>
     <w:p>
       <w:pPr>
         <w:sectPr>
-          <w:footerReference w:type="default" r:id="rId20"/>
+          <w:footerReference w:type="default" r:id="rId18"/>
           <w:type w:val="continuous"/>
           <w:pgSz w:w="12240" w:h="15840" w:orient="portrait"/>
           <w:pgMar w:top="1080" w:right="900" w:bottom="1440" w:left="900" w:header="708" w:footer="708" w:gutter="0"/>
@@ -7526,7 +6738,7 @@
           <w:sz w:val="20"/>
           <w:szCs w:val="20"/>
         </w:rPr>
-        <w:t xml:space="preserve">Table VI lists the three defects that testing exposed. Each was found by measurement: the first by profiling, the second by scaling the input and observing super-linear growth, the third by a live rehearsal the unit tests had not anticipated. Each fix has a test that fails against the prior code.</w:t>
+        <w:t xml:space="preserve">Table V lists the three defects that testing exposed: one by profiling, one by scaling the input and observing super-linear growth, one by a live rehearsal the unit tests had not anticipated. Each fix has a test that fails against the prior code.</w:t>
       </w:r>
     </w:p>
     <w:p>
@@ -7564,41 +6776,8 @@
     </w:p>
     <w:p>
       <w:pPr>
-        <w:keepNext/>
-        <w:spacing w:after="30" w:before="80"/>
-      </w:pPr>
-      <w:r>
-        <w:rPr>
-          <w:rFonts w:ascii="Times New Roman" w:cs="Times New Roman" w:eastAsia="Times New Roman" w:hAnsi="Times New Roman"/>
-          <w:b/>
-          <w:bCs/>
-          <w:i/>
-          <w:iCs/>
-          <w:sz w:val="20"/>
-          <w:szCs w:val="20"/>
-        </w:rPr>
-        <w:t xml:space="preserve">F. Interface</w:t>
-      </w:r>
-    </w:p>
-    <w:p>
-      <w:pPr>
-        <w:spacing w:after="0" w:line="230"/>
-        <w:ind w:firstLine="280"/>
-        <w:jc w:val="both"/>
-      </w:pPr>
-      <w:r>
-        <w:rPr>
-          <w:rFonts w:ascii="Times New Roman" w:cs="Times New Roman" w:eastAsia="Times New Roman" w:hAnsi="Times New Roman"/>
-          <w:sz w:val="20"/>
-          <w:szCs w:val="20"/>
-        </w:rPr>
-        <w:t xml:space="preserve">Fig. 6 shows three of the four views. Result cards carry an action and, for related files, the reason they are linked; the graph view is a force-directed layout of files and edges; the workspace view lists each recommendation with the rule that produced it.</w:t>
-      </w:r>
-    </w:p>
-    <w:p>
-      <w:pPr>
         <w:sectPr>
-          <w:footerReference w:type="default" r:id="rId21"/>
+          <w:footerReference w:type="default" r:id="rId19"/>
           <w:type w:val="continuous"/>
           <w:pgSz w:w="12240" w:h="15840" w:orient="portrait"/>
           <w:pgMar w:top="1080" w:right="900" w:bottom="1440" w:left="900" w:header="708" w:footer="708" w:gutter="0"/>
@@ -7622,7 +6801,7 @@
           <w:sz w:val="16"/>
           <w:szCs w:val="16"/>
         </w:rPr>
-        <w:t xml:space="preserve">TABLE VI</w:t>
+        <w:t xml:space="preserve">TABLE V</w:t>
       </w:r>
       <w:r>
         <w:rPr>
@@ -7933,7 +7112,7 @@
                 <w:sz w:val="16"/>
                 <w:szCs w:val="16"/>
               </w:rPr>
-              <w:t xml:space="preserve">Use 127.0.0.1; call about 15 ms; 100-file index 0.41 to 19.6 files/s</w:t>
+              <w:t xml:space="preserve">Use 127.0.0.1; embedding call about 15 ms; demo-vault search p50 about 2 s to 50 ms</w:t>
             </w:r>
           </w:p>
         </w:tc>
@@ -8224,7 +7403,7 @@
     <w:p>
       <w:pPr>
         <w:sectPr>
-          <w:footerReference w:type="default" r:id="rId22"/>
+          <w:footerReference w:type="default" r:id="rId20"/>
           <w:type w:val="continuous"/>
           <w:pgSz w:w="12240" w:h="15840" w:orient="portrait"/>
           <w:pgMar w:top="1080" w:right="900" w:bottom="1440" w:left="900" w:header="708" w:footer="708" w:gutter="0"/>
@@ -8242,7 +7421,7 @@
       <w:r>
         <w:drawing>
           <wp:inline distT="0" distB="0" distL="0" distR="0">
-            <wp:extent cx="4772025" cy="1333500"/>
+            <wp:extent cx="3314700" cy="923925"/>
             <wp:effectExtent t="0" r="0" b="0" l="0"/>
             <wp:docPr id="1" name="" descr="" title=""/>
             <wp:cNvGraphicFramePr>
@@ -8258,7 +7437,7 @@
                     </pic:cNvPicPr>
                   </pic:nvPicPr>
                   <pic:blipFill>
-                    <a:blip r:embed="rId30" cstate="none"/>
+                    <a:blip r:embed="rId28" cstate="none"/>
                     <a:srcRect/>
                     <a:stretch>
                       <a:fillRect/>
@@ -8267,7 +7446,7 @@
                   <pic:spPr bwMode="auto">
                     <a:xfrm>
                       <a:off x="0" y="0"/>
-                      <a:ext cx="4772025" cy="1333500"/>
+                      <a:ext cx="3314700" cy="923925"/>
                     </a:xfrm>
                     <a:prstGeom prst="rect">
                       <a:avLst/>
@@ -8301,13 +7480,13 @@
           <w:sz w:val="16"/>
           <w:szCs w:val="16"/>
         </w:rPr>
-        <w:t xml:space="preserve">Screenshots of the desktop client: (a) chat results with the reason each related file is linked, (b) the knowledge-graph view, (c) workspaces with rule-based suggestions.</w:t>
+        <w:t xml:space="preserve">Three of the four views of the desktop client: (a) chat results, where each card carries an action and, for related files, the reason it is linked; (b) the knowledge-graph view, a force-directed layout of files and typed edges; (c) the workspace view, which lists each recommendation with the rule that produced it.</w:t>
       </w:r>
     </w:p>
     <w:p>
       <w:pPr>
         <w:sectPr>
-          <w:footerReference w:type="default" r:id="rId23"/>
+          <w:footerReference w:type="default" r:id="rId21"/>
           <w:type w:val="continuous"/>
           <w:pgSz w:w="12240" w:h="15840" w:orient="portrait"/>
           <w:pgMar w:top="1080" w:right="900" w:bottom="1440" w:left="900" w:header="708" w:footer="708" w:gutter="0"/>
@@ -8345,7 +7524,7 @@
           <w:sz w:val="20"/>
           <w:szCs w:val="20"/>
         </w:rPr>
-        <w:t xml:space="preserve">Meaning-based matching comes from the embedding model, not from the surrounding engineering; what DreamOS adds is one interface over retrieval, action and memory, and four trust mechanisms that are small enough to test and explain. Human-AI interaction guidelines [20] ask a system to make clear what it can do and how well, and to support efficient correction; the confidence labels, the guarded open action and the reversible moves implement those requirements in a way that can be measured (Tables III and IV, Section VI-B). The negative results matter as much: the keyword boost trades one paraphrase query for several shared-word ones, and the dense similarity matrix grows with the square of the file count (about 200 MB at 5,000 files), so beyond roughly ten thousand files an approximate index such as FAISS [19] or HNSW [15] would replace it.</w:t>
+        <w:t xml:space="preserve">Meaning-based matching comes from the embedding model, not from the surrounding engineering; what DreamOS adds is one interface over retrieval, action and memory, and four trust mechanisms that are small enough to test and explain. Human-AI interaction guidelines [20] ask a system to make clear what it can do and how well, and to support efficient correction; the confidence labels, the guarded open action and the reversible moves implement those requirements in a way that can be measured (Tables II and III, Section VI-B). The negative results matter as much: the keyword boost trades one paraphrase query for several shared-word ones, and the dense similarity matrix grows with the square of the file count (about 200 MB at 5,000 files), so beyond roughly ten thousand files an approximate index such as FAISS [19] or HNSW [15] would replace it.</w:t>
       </w:r>
     </w:p>
     <w:p>
@@ -8360,7 +7539,7 @@
           <w:sz w:val="20"/>
           <w:szCs w:val="20"/>
         </w:rPr>
-        <w:t xml:space="preserve">Threats to validity. Internal: the authors wrote and labelled the queries; labels were fixed before the run, the partition is computed rather than judged, and failures are listed. The baselines are reference implementations of the lexical class, not the Windows Search, Spotlight or Everything products, so Table IV supports a claim about lexical versus embedding retrieval, not about any named product. Construct: precision on synthetic topic labels measures topic separation, not usefulness. External: 37 files, 36 queries, one vault, one machine, one pair of small models; intent routing is 88% correct on held-out phrasings. All numbers in this paper are read from committed result files produced by the two scripts above.</w:t>
+        <w:t xml:space="preserve">Threats to validity. Internal: the authors wrote and labelled the queries while reading the vault, and the retrieval parameters and the 0.55 bar were tuned on the same vault, so Table III is an in-sample measurement; labels were fixed before the run, the partition is computed rather than judged, and failures are listed. The baselines are reference implementations of the lexical class, not the Windows Search, Spotlight or Everything products, so Table III supports a claim about lexical versus embedding retrieval, not about any named product. Construct: precision on synthetic topic labels measures topic separation, not usefulness. External: 37 files, 36 queries, one vault, one machine, one pair of small models; intent routing is 88% correct on held-out phrasings. Every benchmark number (Tables III and IV, Figs. 2 to 6, the intervals in Sec. VI) is read from committed result files produced by the scripts named in Sec. V; the development-time figures in Sec. III and the lessons table (the 98% profile share, the intent accuracies, the 2 s to 50 ms latency) come from the project log and were not re-measured for this paper.</w:t>
       </w:r>
     </w:p>
     <w:p>
@@ -8444,7 +7623,7 @@
     </w:p>
     <w:p>
       <w:pPr>
-        <w:spacing w:after="30" w:line="216"/>
+        <w:spacing w:after="20" w:line="204"/>
         <w:ind w:left="260" w:hanging="260"/>
       </w:pPr>
       <w:r>
@@ -8458,7 +7637,7 @@
     </w:p>
     <w:p>
       <w:pPr>
-        <w:spacing w:after="30" w:line="216"/>
+        <w:spacing w:after="20" w:line="204"/>
         <w:ind w:left="260" w:hanging="260"/>
       </w:pPr>
       <w:r>
@@ -8472,7 +7651,7 @@
     </w:p>
     <w:p>
       <w:pPr>
-        <w:spacing w:after="30" w:line="216"/>
+        <w:spacing w:after="20" w:line="204"/>
         <w:ind w:left="260" w:hanging="260"/>
       </w:pPr>
       <w:r>
@@ -8486,7 +7665,7 @@
     </w:p>
     <w:p>
       <w:pPr>
-        <w:spacing w:after="30" w:line="216"/>
+        <w:spacing w:after="20" w:line="204"/>
         <w:ind w:left="260" w:hanging="260"/>
       </w:pPr>
       <w:r>
@@ -8495,12 +7674,12 @@
           <w:sz w:val="16"/>
           <w:szCs w:val="16"/>
         </w:rPr>
-        <w:t xml:space="preserve">[4] Chroma, “Chroma: the open-source embedding database,” github.com/chroma-core/chroma.</w:t>
-      </w:r>
-    </w:p>
-    <w:p>
-      <w:pPr>
-        <w:spacing w:after="30" w:line="216"/>
+        <w:t xml:space="preserve">[4] Chroma, “Chroma: the open-source embedding database,” github.com/chroma-core/chroma (accessed Oct. 2026).</w:t>
+      </w:r>
+    </w:p>
+    <w:p>
+      <w:pPr>
+        <w:spacing w:after="20" w:line="204"/>
         <w:ind w:left="260" w:hanging="260"/>
       </w:pPr>
       <w:r>
@@ -8509,12 +7688,12 @@
           <w:sz w:val="16"/>
           <w:szCs w:val="16"/>
         </w:rPr>
-        <w:t xml:space="preserve">[5] Microsoft, “Windows Search overview,” Microsoft Learn documentation.</w:t>
-      </w:r>
-    </w:p>
-    <w:p>
-      <w:pPr>
-        <w:spacing w:after="30" w:line="216"/>
+        <w:t xml:space="preserve">[5] Microsoft, “Windows Search overview,” Microsoft Learn documentation (accessed Oct. 2026).</w:t>
+      </w:r>
+    </w:p>
+    <w:p>
+      <w:pPr>
+        <w:spacing w:after="20" w:line="204"/>
         <w:ind w:left="260" w:hanging="260"/>
       </w:pPr>
       <w:r>
@@ -8523,12 +7702,12 @@
           <w:sz w:val="16"/>
           <w:szCs w:val="16"/>
         </w:rPr>
-        <w:t xml:space="preserve">[6] Apple Inc., “Spotlight User Guide,” support.apple.com.</w:t>
-      </w:r>
-    </w:p>
-    <w:p>
-      <w:pPr>
-        <w:spacing w:after="30" w:line="216"/>
+        <w:t xml:space="preserve">[6] Apple Inc., “Spotlight User Guide,” support.apple.com (accessed Oct. 2026).</w:t>
+      </w:r>
+    </w:p>
+    <w:p>
+      <w:pPr>
+        <w:spacing w:after="20" w:line="204"/>
         <w:ind w:left="260" w:hanging="260"/>
       </w:pPr>
       <w:r>
@@ -8537,12 +7716,12 @@
           <w:sz w:val="16"/>
           <w:szCs w:val="16"/>
         </w:rPr>
-        <w:t xml:space="preserve">[7] voidtools, “Everything: locate files and folders by name instantly,” voidtools.com.</w:t>
-      </w:r>
-    </w:p>
-    <w:p>
-      <w:pPr>
-        <w:spacing w:after="30" w:line="216"/>
+        <w:t xml:space="preserve">[7] voidtools, “Everything: locate files and folders by name instantly,” voidtools.com (accessed Oct. 2026).</w:t>
+      </w:r>
+    </w:p>
+    <w:p>
+      <w:pPr>
+        <w:spacing w:after="20" w:line="204"/>
         <w:ind w:left="260" w:hanging="260"/>
       </w:pPr>
       <w:r>
@@ -8556,7 +7735,7 @@
     </w:p>
     <w:p>
       <w:pPr>
-        <w:spacing w:after="30" w:line="216"/>
+        <w:spacing w:after="20" w:line="204"/>
         <w:ind w:left="260" w:hanging="260"/>
       </w:pPr>
       <w:r>
@@ -8570,7 +7749,7 @@
     </w:p>
     <w:p>
       <w:pPr>
-        <w:spacing w:after="30" w:line="216"/>
+        <w:spacing w:after="20" w:line="204"/>
         <w:ind w:left="260" w:hanging="260"/>
       </w:pPr>
       <w:r>
@@ -8584,7 +7763,7 @@
     </w:p>
     <w:p>
       <w:pPr>
-        <w:spacing w:after="30" w:line="216"/>
+        <w:spacing w:after="20" w:line="204"/>
         <w:ind w:left="260" w:hanging="260"/>
       </w:pPr>
       <w:r>
@@ -8598,7 +7777,7 @@
     </w:p>
     <w:p>
       <w:pPr>
-        <w:spacing w:after="30" w:line="216"/>
+        <w:spacing w:after="20" w:line="204"/>
         <w:ind w:left="260" w:hanging="260"/>
       </w:pPr>
       <w:r>
@@ -8612,7 +7791,7 @@
     </w:p>
     <w:p>
       <w:pPr>
-        <w:spacing w:after="30" w:line="216"/>
+        <w:spacing w:after="20" w:line="204"/>
         <w:ind w:left="260" w:hanging="260"/>
       </w:pPr>
       <w:r>
@@ -8626,7 +7805,7 @@
     </w:p>
     <w:p>
       <w:pPr>
-        <w:spacing w:after="30" w:line="216"/>
+        <w:spacing w:after="20" w:line="204"/>
         <w:ind w:left="260" w:hanging="260"/>
       </w:pPr>
       <w:r>
@@ -8640,7 +7819,7 @@
     </w:p>
     <w:p>
       <w:pPr>
-        <w:spacing w:after="30" w:line="216"/>
+        <w:spacing w:after="20" w:line="204"/>
         <w:ind w:left="260" w:hanging="260"/>
       </w:pPr>
       <w:r>
@@ -8649,12 +7828,12 @@
           <w:sz w:val="16"/>
           <w:szCs w:val="16"/>
         </w:rPr>
-        <w:t xml:space="preserve">[15] Y. A. Malkov and D. A. Yashunin, “Efficient and Robust Approximate Nearest Neighbor Search Using Hierarchical Navigable Small World Graphs,” IEEE Trans. Pattern Anal. Mach. Intell., vol. 42, no. 4, 2020.</w:t>
-      </w:r>
-    </w:p>
-    <w:p>
-      <w:pPr>
-        <w:spacing w:after="30" w:line="216"/>
+        <w:t xml:space="preserve">[15] Y. A. Malkov and D. A. Yashunin, “Efficient and Robust Approximate Nearest Neighbor Search Using Hierarchical Navigable Small World Graphs,” IEEE Trans. Pattern Anal. Mach. Intell., vol. 42, no. 4, pp. 824-836, 2020.</w:t>
+      </w:r>
+    </w:p>
+    <w:p>
+      <w:pPr>
+        <w:spacing w:after="20" w:line="204"/>
         <w:ind w:left="260" w:hanging="260"/>
       </w:pPr>
       <w:r>
@@ -8668,7 +7847,7 @@
     </w:p>
     <w:p>
       <w:pPr>
-        <w:spacing w:after="30" w:line="216"/>
+        <w:spacing w:after="20" w:line="204"/>
         <w:ind w:left="260" w:hanging="260"/>
       </w:pPr>
       <w:r>
@@ -8677,12 +7856,12 @@
           <w:sz w:val="16"/>
           <w:szCs w:val="16"/>
         </w:rPr>
-        <w:t xml:space="preserve">[17] E. B. Wilson, “Probable inference, the law of succession, and statistical inference,” J. Amer. Statist. Assoc., vol. 22, no. 158, 1927.</w:t>
-      </w:r>
-    </w:p>
-    <w:p>
-      <w:pPr>
-        <w:spacing w:after="30" w:line="216"/>
+        <w:t xml:space="preserve">[17] E. B. Wilson, “Probable inference, the law of succession, and statistical inference,” J. Amer. Statist. Assoc., vol. 22, no. 158, pp. 209-212, 1927.</w:t>
+      </w:r>
+    </w:p>
+    <w:p>
+      <w:pPr>
+        <w:spacing w:after="20" w:line="204"/>
         <w:ind w:left="260" w:hanging="260"/>
       </w:pPr>
       <w:r>
@@ -8696,7 +7875,7 @@
     </w:p>
     <w:p>
       <w:pPr>
-        <w:spacing w:after="30" w:line="216"/>
+        <w:spacing w:after="20" w:line="204"/>
         <w:ind w:left="260" w:hanging="260"/>
       </w:pPr>
       <w:r>
@@ -8705,12 +7884,12 @@
           <w:sz w:val="16"/>
           <w:szCs w:val="16"/>
         </w:rPr>
-        <w:t xml:space="preserve">[19] J. Johnson, M. Douze and H. Jégou, “Billion-scale similarity search with GPUs,” IEEE Trans. Big Data, vol. 7, no. 3, 2021.</w:t>
-      </w:r>
-    </w:p>
-    <w:p>
-      <w:pPr>
-        <w:spacing w:after="30" w:line="216"/>
+        <w:t xml:space="preserve">[19] J. Johnson, M. Douze and H. Jégou, “Billion-scale similarity search with GPUs,” IEEE Trans. Big Data, vol. 7, no. 3, pp. 535-547, 2021.</w:t>
+      </w:r>
+    </w:p>
+    <w:p>
+      <w:pPr>
+        <w:spacing w:after="20" w:line="204"/>
         <w:ind w:left="260" w:hanging="260"/>
       </w:pPr>
       <w:r>
@@ -8722,8 +7901,78 @@
         <w:t xml:space="preserve">[20] S. Amershi et al., “Guidelines for Human-AI Interaction,” in Proc. ACM CHI Conf. on Human Factors in Computing Systems, 2019.</w:t>
       </w:r>
     </w:p>
+    <w:p>
+      <w:pPr>
+        <w:spacing w:after="20" w:line="204"/>
+        <w:ind w:left="260" w:hanging="260"/>
+      </w:pPr>
+      <w:r>
+        <w:rPr>
+          <w:rFonts w:ascii="Times New Roman" w:cs="Times New Roman" w:eastAsia="Times New Roman" w:hAnsi="Times New Roman"/>
+          <w:sz w:val="16"/>
+          <w:szCs w:val="16"/>
+        </w:rPr>
+        <w:t xml:space="preserve">[21] P. Lewis et al., “Retrieval-Augmented Generation for Knowledge-Intensive NLP Tasks,” in Advances in Neural Information Processing Systems 33 (NeurIPS), 2020.</w:t>
+      </w:r>
+    </w:p>
+    <w:p>
+      <w:pPr>
+        <w:spacing w:after="20" w:line="204"/>
+        <w:ind w:left="260" w:hanging="260"/>
+      </w:pPr>
+      <w:r>
+        <w:rPr>
+          <w:rFonts w:ascii="Times New Roman" w:cs="Times New Roman" w:eastAsia="Times New Roman" w:hAnsi="Times New Roman"/>
+          <w:sz w:val="16"/>
+          <w:szCs w:val="16"/>
+        </w:rPr>
+        <w:t xml:space="preserve">[22] Microsoft, “Update on Recall security and privacy architecture,” Windows Experience Blog, Sep. 27, 2024. blogs.windows.com (accessed Oct. 2026).</w:t>
+      </w:r>
+    </w:p>
+    <w:p>
+      <w:pPr>
+        <w:spacing w:after="20" w:line="204"/>
+        <w:ind w:left="260" w:hanging="260"/>
+      </w:pPr>
+      <w:r>
+        <w:rPr>
+          <w:rFonts w:ascii="Times New Roman" w:cs="Times New Roman" w:eastAsia="Times New Roman" w:hAnsi="Times New Roman"/>
+          <w:sz w:val="16"/>
+          <w:szCs w:val="16"/>
+        </w:rPr>
+        <w:t xml:space="preserve">[23] Khoj AI, “Khoj: your AI second brain,” github.com/khoj-ai/khoj (accessed Oct. 2026).</w:t>
+      </w:r>
+    </w:p>
+    <w:p>
+      <w:pPr>
+        <w:spacing w:after="20" w:line="204"/>
+        <w:ind w:left="260" w:hanging="260"/>
+      </w:pPr>
+      <w:r>
+        <w:rPr>
+          <w:rFonts w:ascii="Times New Roman" w:cs="Times New Roman" w:eastAsia="Times New Roman" w:hAnsi="Times New Roman"/>
+          <w:sz w:val="16"/>
+          <w:szCs w:val="16"/>
+        </w:rPr>
+        <w:t xml:space="preserve">[24] J.-F. Dockes, “Recoll: a personal full text search tool,” recoll.org (accessed Oct. 2026).</w:t>
+      </w:r>
+    </w:p>
+    <w:p>
+      <w:pPr>
+        <w:spacing w:after="20" w:line="204"/>
+        <w:ind w:left="260" w:hanging="260"/>
+      </w:pPr>
+      <w:r>
+        <w:rPr>
+          <w:rFonts w:ascii="Times New Roman" w:cs="Times New Roman" w:eastAsia="Times New Roman" w:hAnsi="Times New Roman"/>
+          <w:sz w:val="16"/>
+          <w:szCs w:val="16"/>
+        </w:rPr>
+        <w:t xml:space="preserve">[25] B. Efron and R. J. Tibshirani, An Introduction to the Bootstrap. New York, NY, USA: Chapman and Hall, 1993.</w:t>
+      </w:r>
+    </w:p>
     <w:sectPr>
-      <w:footerReference w:type="default" r:id="rId24"/>
+      <w:footerReference w:type="default" r:id="rId22"/>
       <w:type w:val="continuous"/>
       <w:pgSz w:w="12240" w:h="15840" w:orient="portrait"/>
       <w:pgMar w:top="1080" w:right="900" w:bottom="1440" w:left="900" w:header="708" w:footer="708" w:gutter="0"/>
@@ -8924,48 +8173,6 @@
 </file>
 
 <file path=word/footer16.xml><?xml version="1.0" encoding="utf-8"?>
-<w:ftr xmlns:wpc="http://schemas.microsoft.com/office/word/2010/wordprocessingCanvas" xmlns:mc="http://schemas.openxmlformats.org/markup-compatibility/2006" xmlns:o="urn:schemas-microsoft-com:office:office" xmlns:r="http://schemas.openxmlformats.org/officeDocument/2006/relationships" xmlns:m="http://schemas.openxmlformats.org/officeDocument/2006/math" xmlns:v="urn:schemas-microsoft-com:vml" xmlns:wp14="http://schemas.microsoft.com/office/word/2010/wordprocessingDrawing" xmlns:wp="http://schemas.openxmlformats.org/drawingml/2006/wordprocessingDrawing" xmlns:w10="urn:schemas-microsoft-com:office:word" xmlns:w="http://schemas.openxmlformats.org/wordprocessingml/2006/main" xmlns:w14="http://schemas.microsoft.com/office/word/2010/wordml" xmlns:w15="http://schemas.microsoft.com/office/word/2012/wordml" xmlns:wpg="http://schemas.microsoft.com/office/word/2010/wordprocessingGroup" xmlns:wpi="http://schemas.microsoft.com/office/word/2010/wordprocessingInk" xmlns:wne="http://schemas.microsoft.com/office/word/2006/wordml" xmlns:wps="http://schemas.microsoft.com/office/word/2010/wordprocessingShape">
-  <w:p>
-    <w:pPr>
-      <w:jc w:val="center"/>
-    </w:pPr>
-    <w:r>
-      <w:rPr>
-        <w:rFonts w:ascii="Times New Roman" w:cs="Times New Roman" w:eastAsia="Times New Roman" w:hAnsi="Times New Roman"/>
-        <w:sz w:val="18"/>
-        <w:szCs w:val="18"/>
-      </w:rPr>
-      <w:fldChar w:fldCharType="begin"/>
-      <w:instrText xml:space="preserve">PAGE</w:instrText>
-      <w:fldChar w:fldCharType="separate"/>
-      <w:fldChar w:fldCharType="end"/>
-    </w:r>
-  </w:p>
-</w:ftr>
-</file>
-
-<file path=word/footer17.xml><?xml version="1.0" encoding="utf-8"?>
-<w:ftr xmlns:wpc="http://schemas.microsoft.com/office/word/2010/wordprocessingCanvas" xmlns:mc="http://schemas.openxmlformats.org/markup-compatibility/2006" xmlns:o="urn:schemas-microsoft-com:office:office" xmlns:r="http://schemas.openxmlformats.org/officeDocument/2006/relationships" xmlns:m="http://schemas.openxmlformats.org/officeDocument/2006/math" xmlns:v="urn:schemas-microsoft-com:vml" xmlns:wp14="http://schemas.microsoft.com/office/word/2010/wordprocessingDrawing" xmlns:wp="http://schemas.openxmlformats.org/drawingml/2006/wordprocessingDrawing" xmlns:w10="urn:schemas-microsoft-com:office:word" xmlns:w="http://schemas.openxmlformats.org/wordprocessingml/2006/main" xmlns:w14="http://schemas.microsoft.com/office/word/2010/wordml" xmlns:w15="http://schemas.microsoft.com/office/word/2012/wordml" xmlns:wpg="http://schemas.microsoft.com/office/word/2010/wordprocessingGroup" xmlns:wpi="http://schemas.microsoft.com/office/word/2010/wordprocessingInk" xmlns:wne="http://schemas.microsoft.com/office/word/2006/wordml" xmlns:wps="http://schemas.microsoft.com/office/word/2010/wordprocessingShape">
-  <w:p>
-    <w:pPr>
-      <w:jc w:val="center"/>
-    </w:pPr>
-    <w:r>
-      <w:rPr>
-        <w:rFonts w:ascii="Times New Roman" w:cs="Times New Roman" w:eastAsia="Times New Roman" w:hAnsi="Times New Roman"/>
-        <w:sz w:val="18"/>
-        <w:szCs w:val="18"/>
-      </w:rPr>
-      <w:fldChar w:fldCharType="begin"/>
-      <w:instrText xml:space="preserve">PAGE</w:instrText>
-      <w:fldChar w:fldCharType="separate"/>
-      <w:fldChar w:fldCharType="end"/>
-    </w:r>
-  </w:p>
-</w:ftr>
-</file>
-
-<file path=word/footer18.xml><?xml version="1.0" encoding="utf-8"?>
 <w:ftr xmlns:wpc="http://schemas.microsoft.com/office/word/2010/wordprocessingCanvas" xmlns:mc="http://schemas.openxmlformats.org/markup-compatibility/2006" xmlns:o="urn:schemas-microsoft-com:office:office" xmlns:r="http://schemas.openxmlformats.org/officeDocument/2006/relationships" xmlns:m="http://schemas.openxmlformats.org/officeDocument/2006/math" xmlns:v="urn:schemas-microsoft-com:vml" xmlns:wp14="http://schemas.microsoft.com/office/word/2010/wordprocessingDrawing" xmlns:wp="http://schemas.openxmlformats.org/drawingml/2006/wordprocessingDrawing" xmlns:w10="urn:schemas-microsoft-com:office:word" xmlns:w="http://schemas.openxmlformats.org/wordprocessingml/2006/main" xmlns:w14="http://schemas.microsoft.com/office/word/2010/wordml" xmlns:w15="http://schemas.microsoft.com/office/word/2012/wordml" xmlns:wpg="http://schemas.microsoft.com/office/word/2010/wordprocessingGroup" xmlns:wpi="http://schemas.microsoft.com/office/word/2010/wordprocessingInk" xmlns:wne="http://schemas.microsoft.com/office/word/2006/wordml" xmlns:wps="http://schemas.microsoft.com/office/word/2010/wordprocessingShape">
   <w:p>
     <w:pPr>

</xml_diff>

<commit_message>
Paper: IEEE author block with four authors and e-mails (guide as co-author), acknowledgment updated; all variants rebuilt at 6 pages
</commit_message>
<xml_diff>
--- a/docs/paper/DreamOS-IEEE-Paper-AI-disclosed.docx
+++ b/docs/paper/DreamOS-IEEE-Paper-AI-disclosed.docx
@@ -31,14 +31,15 @@
         </w:tblBorders>
       </w:tblPr>
       <w:tblGrid>
-        <w:gridCol w:w="3480"/>
-        <w:gridCol w:w="3480"/>
-        <w:gridCol w:w="3480"/>
+        <w:gridCol w:w="2610"/>
+        <w:gridCol w:w="2610"/>
+        <w:gridCol w:w="2610"/>
+        <w:gridCol w:w="2610"/>
       </w:tblGrid>
       <w:tr>
         <w:tc>
           <w:tcPr>
-            <w:tcW w:type="dxa" w:w="3480"/>
+            <w:tcW w:type="dxa" w:w="2610"/>
             <w:tcBorders>
               <w:top w:val="none" w:color="FFFFFF" w:sz="0"/>
               <w:left w:val="none" w:color="FFFFFF" w:sz="0"/>
@@ -79,13 +80,13 @@
                 <w:sz w:val="18"/>
                 <w:szCs w:val="18"/>
               </w:rPr>
-              <w:t xml:space="preserve">Roll No. 2305139</w:t>
-            </w:r>
-          </w:p>
-        </w:tc>
-        <w:tc>
-          <w:tcPr>
-            <w:tcW w:type="dxa" w:w="3480"/>
+              <w:t xml:space="preserve">sidzaid72@gmail.com</w:t>
+            </w:r>
+          </w:p>
+        </w:tc>
+        <w:tc>
+          <w:tcPr>
+            <w:tcW w:type="dxa" w:w="2610"/>
             <w:tcBorders>
               <w:top w:val="none" w:color="FFFFFF" w:sz="0"/>
               <w:left w:val="none" w:color="FFFFFF" w:sz="0"/>
@@ -126,13 +127,13 @@
                 <w:sz w:val="18"/>
                 <w:szCs w:val="18"/>
               </w:rPr>
-              <w:t xml:space="preserve">Roll No. 2305170</w:t>
-            </w:r>
-          </w:p>
-        </w:tc>
-        <w:tc>
-          <w:tcPr>
-            <w:tcW w:type="dxa" w:w="3480"/>
+              <w:t xml:space="preserve">vyasom100@gmail.com</w:t>
+            </w:r>
+          </w:p>
+        </w:tc>
+        <w:tc>
+          <w:tcPr>
+            <w:tcW w:type="dxa" w:w="2610"/>
             <w:tcBorders>
               <w:top w:val="none" w:color="FFFFFF" w:sz="0"/>
               <w:left w:val="none" w:color="FFFFFF" w:sz="0"/>
@@ -173,38 +174,59 @@
                 <w:sz w:val="18"/>
                 <w:szCs w:val="18"/>
               </w:rPr>
-              <w:t xml:space="preserve">Roll No. 2305165</w:t>
+              <w:t xml:space="preserve">kadamkrushna412005@gmail.com</w:t>
+            </w:r>
+          </w:p>
+        </w:tc>
+        <w:tc>
+          <w:tcPr>
+            <w:tcW w:type="dxa" w:w="2610"/>
+            <w:tcBorders>
+              <w:top w:val="none" w:color="FFFFFF" w:sz="0"/>
+              <w:left w:val="none" w:color="FFFFFF" w:sz="0"/>
+              <w:bottom w:val="none" w:color="FFFFFF" w:sz="0"/>
+              <w:right w:val="none" w:color="FFFFFF" w:sz="0"/>
+            </w:tcBorders>
+            <w:tcMar>
+              <w:top w:type="dxa" w:w="20"/>
+              <w:left w:type="dxa" w:w="60"/>
+              <w:bottom w:type="dxa" w:w="20"/>
+              <w:right w:type="dxa" w:w="60"/>
+            </w:tcMar>
+          </w:tcPr>
+          <w:p>
+            <w:pPr>
+              <w:spacing w:after="0"/>
+              <w:jc w:val="center"/>
+            </w:pPr>
+            <w:r>
+              <w:rPr>
+                <w:rFonts w:ascii="Times New Roman" w:cs="Times New Roman" w:eastAsia="Times New Roman" w:hAnsi="Times New Roman"/>
+                <w:b/>
+                <w:bCs/>
+                <w:sz w:val="24"/>
+                <w:szCs w:val="24"/>
+              </w:rPr>
+              <w:t xml:space="preserve">Minakshi R. Rajput</w:t>
+            </w:r>
+          </w:p>
+          <w:p>
+            <w:pPr>
+              <w:spacing w:after="0"/>
+              <w:jc w:val="center"/>
+            </w:pPr>
+            <w:r>
+              <w:rPr>
+                <w:rFonts w:ascii="Times New Roman" w:cs="Times New Roman" w:eastAsia="Times New Roman" w:hAnsi="Times New Roman"/>
+                <w:sz w:val="18"/>
+                <w:szCs w:val="18"/>
+              </w:rPr>
+              <w:t xml:space="preserve">mrajput@mgmu.ac.in</w:t>
             </w:r>
           </w:p>
         </w:tc>
       </w:tr>
     </w:tbl>
-    <w:p>
-      <w:pPr>
-        <w:spacing w:after="10" w:before="40"/>
-        <w:jc w:val="center"/>
-      </w:pPr>
-      <w:r>
-        <w:rPr>
-          <w:rFonts w:ascii="Times New Roman" w:cs="Times New Roman" w:eastAsia="Times New Roman" w:hAnsi="Times New Roman"/>
-          <w:i/>
-          <w:iCs/>
-          <w:sz w:val="20"/>
-          <w:szCs w:val="20"/>
-        </w:rPr>
-        <w:t xml:space="preserve">Under the guidance of </w:t>
-      </w:r>
-      <w:r>
-        <w:rPr>
-          <w:rFonts w:ascii="Times New Roman" w:cs="Times New Roman" w:eastAsia="Times New Roman" w:hAnsi="Times New Roman"/>
-          <w:b/>
-          <w:bCs/>
-          <w:sz w:val="20"/>
-          <w:szCs w:val="20"/>
-        </w:rPr>
-        <w:t xml:space="preserve">Dr. Minakshi R. Rajput</w:t>
-      </w:r>
-    </w:p>
     <w:p>
       <w:pPr>
         <w:spacing w:after="10" w:before="40"/>
@@ -234,7 +256,7 @@
           <w:sz w:val="18"/>
           <w:szCs w:val="18"/>
         </w:rPr>
-        <w:t xml:space="preserve">MGM University, Chhatrapati Sambhajinagar, India  |  sidzaid72@gmail.com</w:t>
+        <w:t xml:space="preserve">MGM University, Chhatrapati Sambhajinagar, India</w:t>
       </w:r>
     </w:p>
     <w:p>
@@ -7602,7 +7624,7 @@
           <w:sz w:val="20"/>
           <w:szCs w:val="20"/>
         </w:rPr>
-        <w:t xml:space="preserve">The authors thank their project guide, Dr. Minakshi R. Rajput, and IICT, MGM University, for the Project Monitoring structure under which this work was reviewed. Generative AI (Claude, Anthropic) assisted with drafting text and with figure and analysis code; the authors checked all content and results and are responsible for them.</w:t>
+        <w:t xml:space="preserve">The authors thank IICT, MGM University, for the Project Monitoring structure under which this work was reviewed. Generative AI (Claude, Anthropic) assisted with drafting text and with figure and analysis code; the authors checked all content and results and are responsible for them.</w:t>
       </w:r>
     </w:p>
     <w:p>

</xml_diff>

<commit_message>
Paper: IEEE conference typography (title 24 pt, authors 11 pt, bold abstract, small-caps headings, no page numbers); PDFs re-exported
</commit_message>
<xml_diff>
--- a/docs/paper/DreamOS-IEEE-Paper-AI-disclosed.docx
+++ b/docs/paper/DreamOS-IEEE-Paper-AI-disclosed.docx
@@ -10,10 +10,8 @@
       <w:r>
         <w:rPr>
           <w:rFonts w:ascii="Times New Roman" w:cs="Times New Roman" w:eastAsia="Times New Roman" w:hAnsi="Times New Roman"/>
-          <w:b/>
-          <w:bCs/>
-          <w:sz w:val="40"/>
-          <w:szCs w:val="40"/>
+          <w:sz w:val="48"/>
+          <w:szCs w:val="48"/>
         </w:rPr>
         <w:t xml:space="preserve">DreamOS: Trustworthy Semantic File Management with Local Models and a Checkable Privacy Audit</w:t>
       </w:r>
@@ -61,10 +59,8 @@
             <w:r>
               <w:rPr>
                 <w:rFonts w:ascii="Times New Roman" w:cs="Times New Roman" w:eastAsia="Times New Roman" w:hAnsi="Times New Roman"/>
-                <w:b/>
-                <w:bCs/>
-                <w:sz w:val="24"/>
-                <w:szCs w:val="24"/>
+                <w:sz w:val="22"/>
+                <w:szCs w:val="22"/>
               </w:rPr>
               <w:t xml:space="preserve">Zaid Ali Syed</w:t>
             </w:r>
@@ -108,10 +104,8 @@
             <w:r>
               <w:rPr>
                 <w:rFonts w:ascii="Times New Roman" w:cs="Times New Roman" w:eastAsia="Times New Roman" w:hAnsi="Times New Roman"/>
-                <w:b/>
-                <w:bCs/>
-                <w:sz w:val="24"/>
-                <w:szCs w:val="24"/>
+                <w:sz w:val="22"/>
+                <w:szCs w:val="22"/>
               </w:rPr>
               <w:t xml:space="preserve">Om Vyas</w:t>
             </w:r>
@@ -155,10 +149,8 @@
             <w:r>
               <w:rPr>
                 <w:rFonts w:ascii="Times New Roman" w:cs="Times New Roman" w:eastAsia="Times New Roman" w:hAnsi="Times New Roman"/>
-                <w:b/>
-                <w:bCs/>
-                <w:sz w:val="24"/>
-                <w:szCs w:val="24"/>
+                <w:sz w:val="22"/>
+                <w:szCs w:val="22"/>
               </w:rPr>
               <w:t xml:space="preserve">Krushna Kadam</w:t>
             </w:r>
@@ -202,10 +194,8 @@
             <w:r>
               <w:rPr>
                 <w:rFonts w:ascii="Times New Roman" w:cs="Times New Roman" w:eastAsia="Times New Roman" w:hAnsi="Times New Roman"/>
-                <w:b/>
-                <w:bCs/>
-                <w:sz w:val="24"/>
-                <w:szCs w:val="24"/>
+                <w:sz w:val="22"/>
+                <w:szCs w:val="22"/>
               </w:rPr>
               <w:t xml:space="preserve">Minakshi R. Rajput</w:t>
             </w:r>
@@ -262,7 +252,6 @@
     <w:p>
       <w:pPr>
         <w:sectPr>
-          <w:footerReference w:type="default" r:id="rId7"/>
           <w:type w:val="continuous"/>
           <w:pgSz w:w="12240" w:h="15840" w:orient="portrait"/>
           <w:pgMar w:top="1080" w:right="900" w:bottom="1440" w:left="900" w:header="708" w:footer="708" w:gutter="0"/>
@@ -291,6 +280,8 @@
       <w:r>
         <w:rPr>
           <w:rFonts w:ascii="Times New Roman" w:cs="Times New Roman" w:eastAsia="Times New Roman" w:hAnsi="Times New Roman"/>
+          <w:b/>
+          <w:bCs/>
           <w:sz w:val="18"/>
           <w:szCs w:val="18"/>
         </w:rPr>
@@ -317,6 +308,8 @@
       <w:r>
         <w:rPr>
           <w:rFonts w:ascii="Times New Roman" w:cs="Times New Roman" w:eastAsia="Times New Roman" w:hAnsi="Times New Roman"/>
+          <w:b/>
+          <w:bCs/>
           <w:sz w:val="18"/>
           <w:szCs w:val="18"/>
         </w:rPr>
@@ -332,12 +325,11 @@
       <w:r>
         <w:rPr>
           <w:rFonts w:ascii="Times New Roman" w:cs="Times New Roman" w:eastAsia="Times New Roman" w:hAnsi="Times New Roman"/>
-          <w:b/>
-          <w:bCs/>
+          <w:smallCaps/>
           <w:sz w:val="20"/>
           <w:szCs w:val="20"/>
         </w:rPr>
-        <w:t xml:space="preserve">I. INTRODUCTION</w:t>
+        <w:t xml:space="preserve">I. Introduction</w:t>
       </w:r>
     </w:p>
     <w:p>
@@ -449,12 +441,11 @@
       <w:r>
         <w:rPr>
           <w:rFonts w:ascii="Times New Roman" w:cs="Times New Roman" w:eastAsia="Times New Roman" w:hAnsi="Times New Roman"/>
-          <w:b/>
-          <w:bCs/>
+          <w:smallCaps/>
           <w:sz w:val="20"/>
           <w:szCs w:val="20"/>
         </w:rPr>
-        <w:t xml:space="preserve">II. RELATED WORK</w:t>
+        <w:t xml:space="preserve">II. Related Work</w:t>
       </w:r>
     </w:p>
     <w:p>
@@ -465,8 +456,6 @@
       <w:r>
         <w:rPr>
           <w:rFonts w:ascii="Times New Roman" w:cs="Times New Roman" w:eastAsia="Times New Roman" w:hAnsi="Times New Roman"/>
-          <w:b/>
-          <w:bCs/>
           <w:i/>
           <w:iCs/>
           <w:sz w:val="20"/>
@@ -498,8 +487,6 @@
       <w:r>
         <w:rPr>
           <w:rFonts w:ascii="Times New Roman" w:cs="Times New Roman" w:eastAsia="Times New Roman" w:hAnsi="Times New Roman"/>
-          <w:b/>
-          <w:bCs/>
           <w:i/>
           <w:iCs/>
           <w:sz w:val="20"/>
@@ -531,8 +518,6 @@
       <w:r>
         <w:rPr>
           <w:rFonts w:ascii="Times New Roman" w:cs="Times New Roman" w:eastAsia="Times New Roman" w:hAnsi="Times New Roman"/>
-          <w:b/>
-          <w:bCs/>
           <w:i/>
           <w:iCs/>
           <w:sz w:val="20"/>
@@ -564,8 +549,6 @@
       <w:r>
         <w:rPr>
           <w:rFonts w:ascii="Times New Roman" w:cs="Times New Roman" w:eastAsia="Times New Roman" w:hAnsi="Times New Roman"/>
-          <w:b/>
-          <w:bCs/>
           <w:i/>
           <w:iCs/>
           <w:sz w:val="20"/>
@@ -592,7 +575,6 @@
     <w:p>
       <w:pPr>
         <w:sectPr>
-          <w:footerReference w:type="default" r:id="rId8"/>
           <w:type w:val="continuous"/>
           <w:pgSz w:w="12240" w:h="15840" w:orient="portrait"/>
           <w:pgMar w:top="1080" w:right="900" w:bottom="1440" w:left="900" w:header="708" w:footer="708" w:gutter="0"/>
@@ -2553,7 +2535,6 @@
     <w:p>
       <w:pPr>
         <w:sectPr>
-          <w:footerReference w:type="default" r:id="rId9"/>
           <w:type w:val="continuous"/>
           <w:pgSz w:w="12240" w:h="15840" w:orient="portrait"/>
           <w:pgMar w:top="1080" w:right="900" w:bottom="1440" w:left="900" w:header="708" w:footer="708" w:gutter="0"/>
@@ -2571,12 +2552,11 @@
       <w:r>
         <w:rPr>
           <w:rFonts w:ascii="Times New Roman" w:cs="Times New Roman" w:eastAsia="Times New Roman" w:hAnsi="Times New Roman"/>
-          <w:b/>
-          <w:bCs/>
+          <w:smallCaps/>
           <w:sz w:val="20"/>
           <w:szCs w:val="20"/>
         </w:rPr>
-        <w:t xml:space="preserve">III. SYSTEM DESIGN</w:t>
+        <w:t xml:space="preserve">III. System Design</w:t>
       </w:r>
     </w:p>
     <w:p>
@@ -2587,8 +2567,6 @@
       <w:r>
         <w:rPr>
           <w:rFonts w:ascii="Times New Roman" w:cs="Times New Roman" w:eastAsia="Times New Roman" w:hAnsi="Times New Roman"/>
-          <w:b/>
-          <w:bCs/>
           <w:i/>
           <w:iCs/>
           <w:sz w:val="20"/>
@@ -2620,8 +2598,6 @@
       <w:r>
         <w:rPr>
           <w:rFonts w:ascii="Times New Roman" w:cs="Times New Roman" w:eastAsia="Times New Roman" w:hAnsi="Times New Roman"/>
-          <w:b/>
-          <w:bCs/>
           <w:i/>
           <w:iCs/>
           <w:sz w:val="20"/>
@@ -2648,7 +2624,6 @@
     <w:p>
       <w:pPr>
         <w:sectPr>
-          <w:footerReference w:type="default" r:id="rId10"/>
           <w:type w:val="continuous"/>
           <w:pgSz w:w="12240" w:h="15840" w:orient="portrait"/>
           <w:pgMar w:top="1080" w:right="900" w:bottom="1440" w:left="900" w:header="708" w:footer="708" w:gutter="0"/>
@@ -2683,7 +2658,7 @@
                     </pic:cNvPicPr>
                   </pic:nvPicPr>
                   <pic:blipFill>
-                    <a:blip r:embed="rId23" cstate="none"/>
+                    <a:blip r:embed="rId7" cstate="none"/>
                     <a:srcRect/>
                     <a:stretch>
                       <a:fillRect/>
@@ -2754,7 +2729,7 @@
                     </pic:cNvPicPr>
                   </pic:nvPicPr>
                   <pic:blipFill>
-                    <a:blip r:embed="rId24" cstate="none"/>
+                    <a:blip r:embed="rId8" cstate="none"/>
                     <a:srcRect/>
                     <a:stretch>
                       <a:fillRect/>
@@ -2803,7 +2778,6 @@
     <w:p>
       <w:pPr>
         <w:sectPr>
-          <w:footerReference w:type="default" r:id="rId11"/>
           <w:type w:val="continuous"/>
           <w:pgSz w:w="12240" w:h="15840" w:orient="portrait"/>
           <w:pgMar w:top="1080" w:right="900" w:bottom="1440" w:left="900" w:header="708" w:footer="708" w:gutter="0"/>
@@ -2820,8 +2794,6 @@
       <w:r>
         <w:rPr>
           <w:rFonts w:ascii="Times New Roman" w:cs="Times New Roman" w:eastAsia="Times New Roman" w:hAnsi="Times New Roman"/>
-          <w:b/>
-          <w:bCs/>
           <w:i/>
           <w:iCs/>
           <w:sz w:val="20"/>
@@ -2853,8 +2825,6 @@
       <w:r>
         <w:rPr>
           <w:rFonts w:ascii="Times New Roman" w:cs="Times New Roman" w:eastAsia="Times New Roman" w:hAnsi="Times New Roman"/>
-          <w:b/>
-          <w:bCs/>
           <w:i/>
           <w:iCs/>
           <w:sz w:val="20"/>
@@ -2881,7 +2851,6 @@
     <w:p>
       <w:pPr>
         <w:sectPr>
-          <w:footerReference w:type="default" r:id="rId12"/>
           <w:type w:val="continuous"/>
           <w:pgSz w:w="12240" w:h="15840" w:orient="portrait"/>
           <w:pgMar w:top="1080" w:right="900" w:bottom="1440" w:left="900" w:header="708" w:footer="708" w:gutter="0"/>
@@ -3648,7 +3617,6 @@
     <w:p>
       <w:pPr>
         <w:sectPr>
-          <w:footerReference w:type="default" r:id="rId13"/>
           <w:type w:val="continuous"/>
           <w:pgSz w:w="12240" w:h="15840" w:orient="portrait"/>
           <w:pgMar w:top="1080" w:right="900" w:bottom="1440" w:left="900" w:header="708" w:footer="708" w:gutter="0"/>
@@ -3666,12 +3634,11 @@
       <w:r>
         <w:rPr>
           <w:rFonts w:ascii="Times New Roman" w:cs="Times New Roman" w:eastAsia="Times New Roman" w:hAnsi="Times New Roman"/>
-          <w:b/>
-          <w:bCs/>
+          <w:smallCaps/>
           <w:sz w:val="20"/>
           <w:szCs w:val="20"/>
         </w:rPr>
-        <w:t xml:space="preserve">IV. METHODS</w:t>
+        <w:t xml:space="preserve">IV. Methods</w:t>
       </w:r>
     </w:p>
     <w:p>
@@ -3682,8 +3649,6 @@
       <w:r>
         <w:rPr>
           <w:rFonts w:ascii="Times New Roman" w:cs="Times New Roman" w:eastAsia="Times New Roman" w:hAnsi="Times New Roman"/>
-          <w:b/>
-          <w:bCs/>
           <w:i/>
           <w:iCs/>
           <w:sz w:val="20"/>
@@ -3777,8 +3742,6 @@
       <w:r>
         <w:rPr>
           <w:rFonts w:ascii="Times New Roman" w:cs="Times New Roman" w:eastAsia="Times New Roman" w:hAnsi="Times New Roman"/>
-          <w:b/>
-          <w:bCs/>
           <w:i/>
           <w:iCs/>
           <w:sz w:val="20"/>
@@ -3825,8 +3788,6 @@
       <w:r>
         <w:rPr>
           <w:rFonts w:ascii="Times New Roman" w:cs="Times New Roman" w:eastAsia="Times New Roman" w:hAnsi="Times New Roman"/>
-          <w:b/>
-          <w:bCs/>
           <w:i/>
           <w:iCs/>
           <w:sz w:val="20"/>
@@ -3875,7 +3836,7 @@
                     </pic:cNvPicPr>
                   </pic:nvPicPr>
                   <pic:blipFill>
-                    <a:blip r:embed="rId25" cstate="none"/>
+                    <a:blip r:embed="rId9" cstate="none"/>
                     <a:srcRect/>
                     <a:stretch>
                       <a:fillRect/>
@@ -3943,8 +3904,6 @@
       <w:r>
         <w:rPr>
           <w:rFonts w:ascii="Times New Roman" w:cs="Times New Roman" w:eastAsia="Times New Roman" w:hAnsi="Times New Roman"/>
-          <w:b/>
-          <w:bCs/>
           <w:i/>
           <w:iCs/>
           <w:sz w:val="20"/>
@@ -3976,8 +3935,6 @@
       <w:r>
         <w:rPr>
           <w:rFonts w:ascii="Times New Roman" w:cs="Times New Roman" w:eastAsia="Times New Roman" w:hAnsi="Times New Roman"/>
-          <w:b/>
-          <w:bCs/>
           <w:i/>
           <w:iCs/>
           <w:sz w:val="20"/>
@@ -4010,12 +3967,11 @@
       <w:r>
         <w:rPr>
           <w:rFonts w:ascii="Times New Roman" w:cs="Times New Roman" w:eastAsia="Times New Roman" w:hAnsi="Times New Roman"/>
-          <w:b/>
-          <w:bCs/>
+          <w:smallCaps/>
           <w:sz w:val="20"/>
           <w:szCs w:val="20"/>
         </w:rPr>
-        <w:t xml:space="preserve">V. EXPERIMENTAL SETUP</w:t>
+        <w:t xml:space="preserve">V. Experimental Setup</w:t>
       </w:r>
     </w:p>
     <w:p>
@@ -4041,8 +3997,6 @@
       <w:r>
         <w:rPr>
           <w:rFonts w:ascii="Times New Roman" w:cs="Times New Roman" w:eastAsia="Times New Roman" w:hAnsi="Times New Roman"/>
-          <w:b/>
-          <w:bCs/>
           <w:i/>
           <w:iCs/>
           <w:sz w:val="20"/>
@@ -4074,8 +4028,6 @@
       <w:r>
         <w:rPr>
           <w:rFonts w:ascii="Times New Roman" w:cs="Times New Roman" w:eastAsia="Times New Roman" w:hAnsi="Times New Roman"/>
-          <w:b/>
-          <w:bCs/>
           <w:i/>
           <w:iCs/>
           <w:sz w:val="20"/>
@@ -4102,7 +4054,6 @@
     <w:p>
       <w:pPr>
         <w:sectPr>
-          <w:footerReference w:type="default" r:id="rId14"/>
           <w:type w:val="continuous"/>
           <w:pgSz w:w="12240" w:h="15840" w:orient="portrait"/>
           <w:pgMar w:top="1080" w:right="900" w:bottom="1440" w:left="900" w:header="708" w:footer="708" w:gutter="0"/>
@@ -5385,7 +5336,6 @@
     <w:p>
       <w:pPr>
         <w:sectPr>
-          <w:footerReference w:type="default" r:id="rId15"/>
           <w:type w:val="continuous"/>
           <w:pgSz w:w="12240" w:h="15840" w:orient="portrait"/>
           <w:pgMar w:top="1080" w:right="900" w:bottom="1440" w:left="900" w:header="708" w:footer="708" w:gutter="0"/>
@@ -5403,12 +5353,11 @@
       <w:r>
         <w:rPr>
           <w:rFonts w:ascii="Times New Roman" w:cs="Times New Roman" w:eastAsia="Times New Roman" w:hAnsi="Times New Roman"/>
-          <w:b/>
-          <w:bCs/>
+          <w:smallCaps/>
           <w:sz w:val="20"/>
           <w:szCs w:val="20"/>
         </w:rPr>
-        <w:t xml:space="preserve">VI. RESULTS</w:t>
+        <w:t xml:space="preserve">VI. Results</w:t>
       </w:r>
     </w:p>
     <w:p>
@@ -5419,8 +5368,6 @@
       <w:r>
         <w:rPr>
           <w:rFonts w:ascii="Times New Roman" w:cs="Times New Roman" w:eastAsia="Times New Roman" w:hAnsi="Times New Roman"/>
-          <w:b/>
-          <w:bCs/>
           <w:i/>
           <w:iCs/>
           <w:sz w:val="20"/>
@@ -5469,7 +5416,7 @@
                     </pic:cNvPicPr>
                   </pic:nvPicPr>
                   <pic:blipFill>
-                    <a:blip r:embed="rId26" cstate="none"/>
+                    <a:blip r:embed="rId10" cstate="none"/>
                     <a:srcRect/>
                     <a:stretch>
                       <a:fillRect/>
@@ -5537,8 +5484,6 @@
       <w:r>
         <w:rPr>
           <w:rFonts w:ascii="Times New Roman" w:cs="Times New Roman" w:eastAsia="Times New Roman" w:hAnsi="Times New Roman"/>
-          <w:b/>
-          <w:bCs/>
           <w:i/>
           <w:iCs/>
           <w:sz w:val="20"/>
@@ -5570,8 +5515,6 @@
       <w:r>
         <w:rPr>
           <w:rFonts w:ascii="Times New Roman" w:cs="Times New Roman" w:eastAsia="Times New Roman" w:hAnsi="Times New Roman"/>
-          <w:b/>
-          <w:bCs/>
           <w:i/>
           <w:iCs/>
           <w:sz w:val="20"/>
@@ -5598,7 +5541,6 @@
     <w:p>
       <w:pPr>
         <w:sectPr>
-          <w:footerReference w:type="default" r:id="rId16"/>
           <w:type w:val="continuous"/>
           <w:pgSz w:w="12240" w:h="15840" w:orient="portrait"/>
           <w:pgMar w:top="1080" w:right="900" w:bottom="1440" w:left="900" w:header="708" w:footer="708" w:gutter="0"/>
@@ -6638,7 +6580,6 @@
     <w:p>
       <w:pPr>
         <w:sectPr>
-          <w:footerReference w:type="default" r:id="rId17"/>
           <w:type w:val="continuous"/>
           <w:pgSz w:w="12240" w:h="15840" w:orient="portrait"/>
           <w:pgMar w:top="1080" w:right="900" w:bottom="1440" w:left="900" w:header="708" w:footer="708" w:gutter="0"/>
@@ -6672,7 +6613,7 @@
                     </pic:cNvPicPr>
                   </pic:nvPicPr>
                   <pic:blipFill>
-                    <a:blip r:embed="rId27" cstate="none"/>
+                    <a:blip r:embed="rId11" cstate="none"/>
                     <a:srcRect/>
                     <a:stretch>
                       <a:fillRect/>
@@ -6721,7 +6662,6 @@
     <w:p>
       <w:pPr>
         <w:sectPr>
-          <w:footerReference w:type="default" r:id="rId18"/>
           <w:type w:val="continuous"/>
           <w:pgSz w:w="12240" w:h="15840" w:orient="portrait"/>
           <w:pgMar w:top="1080" w:right="900" w:bottom="1440" w:left="900" w:header="708" w:footer="708" w:gutter="0"/>
@@ -6738,8 +6678,6 @@
       <w:r>
         <w:rPr>
           <w:rFonts w:ascii="Times New Roman" w:cs="Times New Roman" w:eastAsia="Times New Roman" w:hAnsi="Times New Roman"/>
-          <w:b/>
-          <w:bCs/>
           <w:i/>
           <w:iCs/>
           <w:sz w:val="20"/>
@@ -6771,8 +6709,6 @@
       <w:r>
         <w:rPr>
           <w:rFonts w:ascii="Times New Roman" w:cs="Times New Roman" w:eastAsia="Times New Roman" w:hAnsi="Times New Roman"/>
-          <w:b/>
-          <w:bCs/>
           <w:i/>
           <w:iCs/>
           <w:sz w:val="20"/>
@@ -6799,7 +6735,6 @@
     <w:p>
       <w:pPr>
         <w:sectPr>
-          <w:footerReference w:type="default" r:id="rId19"/>
           <w:type w:val="continuous"/>
           <w:pgSz w:w="12240" w:h="15840" w:orient="portrait"/>
           <w:pgMar w:top="1080" w:right="900" w:bottom="1440" w:left="900" w:header="708" w:footer="708" w:gutter="0"/>
@@ -7425,7 +7360,6 @@
     <w:p>
       <w:pPr>
         <w:sectPr>
-          <w:footerReference w:type="default" r:id="rId20"/>
           <w:type w:val="continuous"/>
           <w:pgSz w:w="12240" w:h="15840" w:orient="portrait"/>
           <w:pgMar w:top="1080" w:right="900" w:bottom="1440" w:left="900" w:header="708" w:footer="708" w:gutter="0"/>
@@ -7459,7 +7393,7 @@
                     </pic:cNvPicPr>
                   </pic:nvPicPr>
                   <pic:blipFill>
-                    <a:blip r:embed="rId28" cstate="none"/>
+                    <a:blip r:embed="rId12" cstate="none"/>
                     <a:srcRect/>
                     <a:stretch>
                       <a:fillRect/>
@@ -7508,7 +7442,6 @@
     <w:p>
       <w:pPr>
         <w:sectPr>
-          <w:footerReference w:type="default" r:id="rId21"/>
           <w:type w:val="continuous"/>
           <w:pgSz w:w="12240" w:h="15840" w:orient="portrait"/>
           <w:pgMar w:top="1080" w:right="900" w:bottom="1440" w:left="900" w:header="708" w:footer="708" w:gutter="0"/>
@@ -7526,12 +7459,11 @@
       <w:r>
         <w:rPr>
           <w:rFonts w:ascii="Times New Roman" w:cs="Times New Roman" w:eastAsia="Times New Roman" w:hAnsi="Times New Roman"/>
-          <w:b/>
-          <w:bCs/>
+          <w:smallCaps/>
           <w:sz w:val="20"/>
           <w:szCs w:val="20"/>
         </w:rPr>
-        <w:t xml:space="preserve">VII. DISCUSSION AND THREATS TO VALIDITY</w:t>
+        <w:t xml:space="preserve">VII. Discussion and Threats to Validity</w:t>
       </w:r>
     </w:p>
     <w:p>
@@ -7573,12 +7505,11 @@
       <w:r>
         <w:rPr>
           <w:rFonts w:ascii="Times New Roman" w:cs="Times New Roman" w:eastAsia="Times New Roman" w:hAnsi="Times New Roman"/>
-          <w:b/>
-          <w:bCs/>
+          <w:smallCaps/>
           <w:sz w:val="20"/>
           <w:szCs w:val="20"/>
         </w:rPr>
-        <w:t xml:space="preserve">VIII. CONCLUSION</w:t>
+        <w:t xml:space="preserve">VIII. Conclusion</w:t>
       </w:r>
     </w:p>
     <w:p>
@@ -7604,12 +7535,11 @@
       <w:r>
         <w:rPr>
           <w:rFonts w:ascii="Times New Roman" w:cs="Times New Roman" w:eastAsia="Times New Roman" w:hAnsi="Times New Roman"/>
-          <w:b/>
-          <w:bCs/>
+          <w:smallCaps/>
           <w:sz w:val="20"/>
           <w:szCs w:val="20"/>
         </w:rPr>
-        <w:t xml:space="preserve">ACKNOWLEDGMENT</w:t>
+        <w:t xml:space="preserve">Acknowledgment</w:t>
       </w:r>
     </w:p>
     <w:p>
@@ -7635,12 +7565,11 @@
       <w:r>
         <w:rPr>
           <w:rFonts w:ascii="Times New Roman" w:cs="Times New Roman" w:eastAsia="Times New Roman" w:hAnsi="Times New Roman"/>
-          <w:b/>
-          <w:bCs/>
+          <w:smallCaps/>
           <w:sz w:val="20"/>
           <w:szCs w:val="20"/>
         </w:rPr>
-        <w:t xml:space="preserve">REFERENCES</w:t>
+        <w:t xml:space="preserve">References</w:t>
       </w:r>
     </w:p>
     <w:p>
@@ -7994,7 +7923,6 @@
       </w:r>
     </w:p>
     <w:sectPr>
-      <w:footerReference w:type="default" r:id="rId22"/>
       <w:type w:val="continuous"/>
       <w:pgSz w:w="12240" w:h="15840" w:orient="portrait"/>
       <w:pgMar w:top="1080" w:right="900" w:bottom="1440" w:left="900" w:header="708" w:footer="708" w:gutter="0"/>
@@ -8045,342 +7973,6 @@
     </w:p>
   </w:endnote>
 </w:endnotes>
-</file>
-
-<file path=word/footer1.xml><?xml version="1.0" encoding="utf-8"?>
-<w:ftr xmlns:wpc="http://schemas.microsoft.com/office/word/2010/wordprocessingCanvas" xmlns:mc="http://schemas.openxmlformats.org/markup-compatibility/2006" xmlns:o="urn:schemas-microsoft-com:office:office" xmlns:r="http://schemas.openxmlformats.org/officeDocument/2006/relationships" xmlns:m="http://schemas.openxmlformats.org/officeDocument/2006/math" xmlns:v="urn:schemas-microsoft-com:vml" xmlns:wp14="http://schemas.microsoft.com/office/word/2010/wordprocessingDrawing" xmlns:wp="http://schemas.openxmlformats.org/drawingml/2006/wordprocessingDrawing" xmlns:w10="urn:schemas-microsoft-com:office:word" xmlns:w="http://schemas.openxmlformats.org/wordprocessingml/2006/main" xmlns:w14="http://schemas.microsoft.com/office/word/2010/wordml" xmlns:w15="http://schemas.microsoft.com/office/word/2012/wordml" xmlns:wpg="http://schemas.microsoft.com/office/word/2010/wordprocessingGroup" xmlns:wpi="http://schemas.microsoft.com/office/word/2010/wordprocessingInk" xmlns:wne="http://schemas.microsoft.com/office/word/2006/wordml" xmlns:wps="http://schemas.microsoft.com/office/word/2010/wordprocessingShape">
-  <w:p>
-    <w:pPr>
-      <w:jc w:val="center"/>
-    </w:pPr>
-    <w:r>
-      <w:rPr>
-        <w:rFonts w:ascii="Times New Roman" w:cs="Times New Roman" w:eastAsia="Times New Roman" w:hAnsi="Times New Roman"/>
-        <w:sz w:val="18"/>
-        <w:szCs w:val="18"/>
-      </w:rPr>
-      <w:fldChar w:fldCharType="begin"/>
-      <w:instrText xml:space="preserve">PAGE</w:instrText>
-      <w:fldChar w:fldCharType="separate"/>
-      <w:fldChar w:fldCharType="end"/>
-    </w:r>
-  </w:p>
-</w:ftr>
-</file>
-
-<file path=word/footer10.xml><?xml version="1.0" encoding="utf-8"?>
-<w:ftr xmlns:wpc="http://schemas.microsoft.com/office/word/2010/wordprocessingCanvas" xmlns:mc="http://schemas.openxmlformats.org/markup-compatibility/2006" xmlns:o="urn:schemas-microsoft-com:office:office" xmlns:r="http://schemas.openxmlformats.org/officeDocument/2006/relationships" xmlns:m="http://schemas.openxmlformats.org/officeDocument/2006/math" xmlns:v="urn:schemas-microsoft-com:vml" xmlns:wp14="http://schemas.microsoft.com/office/word/2010/wordprocessingDrawing" xmlns:wp="http://schemas.openxmlformats.org/drawingml/2006/wordprocessingDrawing" xmlns:w10="urn:schemas-microsoft-com:office:word" xmlns:w="http://schemas.openxmlformats.org/wordprocessingml/2006/main" xmlns:w14="http://schemas.microsoft.com/office/word/2010/wordml" xmlns:w15="http://schemas.microsoft.com/office/word/2012/wordml" xmlns:wpg="http://schemas.microsoft.com/office/word/2010/wordprocessingGroup" xmlns:wpi="http://schemas.microsoft.com/office/word/2010/wordprocessingInk" xmlns:wne="http://schemas.microsoft.com/office/word/2006/wordml" xmlns:wps="http://schemas.microsoft.com/office/word/2010/wordprocessingShape">
-  <w:p>
-    <w:pPr>
-      <w:jc w:val="center"/>
-    </w:pPr>
-    <w:r>
-      <w:rPr>
-        <w:rFonts w:ascii="Times New Roman" w:cs="Times New Roman" w:eastAsia="Times New Roman" w:hAnsi="Times New Roman"/>
-        <w:sz w:val="18"/>
-        <w:szCs w:val="18"/>
-      </w:rPr>
-      <w:fldChar w:fldCharType="begin"/>
-      <w:instrText xml:space="preserve">PAGE</w:instrText>
-      <w:fldChar w:fldCharType="separate"/>
-      <w:fldChar w:fldCharType="end"/>
-    </w:r>
-  </w:p>
-</w:ftr>
-</file>
-
-<file path=word/footer11.xml><?xml version="1.0" encoding="utf-8"?>
-<w:ftr xmlns:wpc="http://schemas.microsoft.com/office/word/2010/wordprocessingCanvas" xmlns:mc="http://schemas.openxmlformats.org/markup-compatibility/2006" xmlns:o="urn:schemas-microsoft-com:office:office" xmlns:r="http://schemas.openxmlformats.org/officeDocument/2006/relationships" xmlns:m="http://schemas.openxmlformats.org/officeDocument/2006/math" xmlns:v="urn:schemas-microsoft-com:vml" xmlns:wp14="http://schemas.microsoft.com/office/word/2010/wordprocessingDrawing" xmlns:wp="http://schemas.openxmlformats.org/drawingml/2006/wordprocessingDrawing" xmlns:w10="urn:schemas-microsoft-com:office:word" xmlns:w="http://schemas.openxmlformats.org/wordprocessingml/2006/main" xmlns:w14="http://schemas.microsoft.com/office/word/2010/wordml" xmlns:w15="http://schemas.microsoft.com/office/word/2012/wordml" xmlns:wpg="http://schemas.microsoft.com/office/word/2010/wordprocessingGroup" xmlns:wpi="http://schemas.microsoft.com/office/word/2010/wordprocessingInk" xmlns:wne="http://schemas.microsoft.com/office/word/2006/wordml" xmlns:wps="http://schemas.microsoft.com/office/word/2010/wordprocessingShape">
-  <w:p>
-    <w:pPr>
-      <w:jc w:val="center"/>
-    </w:pPr>
-    <w:r>
-      <w:rPr>
-        <w:rFonts w:ascii="Times New Roman" w:cs="Times New Roman" w:eastAsia="Times New Roman" w:hAnsi="Times New Roman"/>
-        <w:sz w:val="18"/>
-        <w:szCs w:val="18"/>
-      </w:rPr>
-      <w:fldChar w:fldCharType="begin"/>
-      <w:instrText xml:space="preserve">PAGE</w:instrText>
-      <w:fldChar w:fldCharType="separate"/>
-      <w:fldChar w:fldCharType="end"/>
-    </w:r>
-  </w:p>
-</w:ftr>
-</file>
-
-<file path=word/footer12.xml><?xml version="1.0" encoding="utf-8"?>
-<w:ftr xmlns:wpc="http://schemas.microsoft.com/office/word/2010/wordprocessingCanvas" xmlns:mc="http://schemas.openxmlformats.org/markup-compatibility/2006" xmlns:o="urn:schemas-microsoft-com:office:office" xmlns:r="http://schemas.openxmlformats.org/officeDocument/2006/relationships" xmlns:m="http://schemas.openxmlformats.org/officeDocument/2006/math" xmlns:v="urn:schemas-microsoft-com:vml" xmlns:wp14="http://schemas.microsoft.com/office/word/2010/wordprocessingDrawing" xmlns:wp="http://schemas.openxmlformats.org/drawingml/2006/wordprocessingDrawing" xmlns:w10="urn:schemas-microsoft-com:office:word" xmlns:w="http://schemas.openxmlformats.org/wordprocessingml/2006/main" xmlns:w14="http://schemas.microsoft.com/office/word/2010/wordml" xmlns:w15="http://schemas.microsoft.com/office/word/2012/wordml" xmlns:wpg="http://schemas.microsoft.com/office/word/2010/wordprocessingGroup" xmlns:wpi="http://schemas.microsoft.com/office/word/2010/wordprocessingInk" xmlns:wne="http://schemas.microsoft.com/office/word/2006/wordml" xmlns:wps="http://schemas.microsoft.com/office/word/2010/wordprocessingShape">
-  <w:p>
-    <w:pPr>
-      <w:jc w:val="center"/>
-    </w:pPr>
-    <w:r>
-      <w:rPr>
-        <w:rFonts w:ascii="Times New Roman" w:cs="Times New Roman" w:eastAsia="Times New Roman" w:hAnsi="Times New Roman"/>
-        <w:sz w:val="18"/>
-        <w:szCs w:val="18"/>
-      </w:rPr>
-      <w:fldChar w:fldCharType="begin"/>
-      <w:instrText xml:space="preserve">PAGE</w:instrText>
-      <w:fldChar w:fldCharType="separate"/>
-      <w:fldChar w:fldCharType="end"/>
-    </w:r>
-  </w:p>
-</w:ftr>
-</file>
-
-<file path=word/footer13.xml><?xml version="1.0" encoding="utf-8"?>
-<w:ftr xmlns:wpc="http://schemas.microsoft.com/office/word/2010/wordprocessingCanvas" xmlns:mc="http://schemas.openxmlformats.org/markup-compatibility/2006" xmlns:o="urn:schemas-microsoft-com:office:office" xmlns:r="http://schemas.openxmlformats.org/officeDocument/2006/relationships" xmlns:m="http://schemas.openxmlformats.org/officeDocument/2006/math" xmlns:v="urn:schemas-microsoft-com:vml" xmlns:wp14="http://schemas.microsoft.com/office/word/2010/wordprocessingDrawing" xmlns:wp="http://schemas.openxmlformats.org/drawingml/2006/wordprocessingDrawing" xmlns:w10="urn:schemas-microsoft-com:office:word" xmlns:w="http://schemas.openxmlformats.org/wordprocessingml/2006/main" xmlns:w14="http://schemas.microsoft.com/office/word/2010/wordml" xmlns:w15="http://schemas.microsoft.com/office/word/2012/wordml" xmlns:wpg="http://schemas.microsoft.com/office/word/2010/wordprocessingGroup" xmlns:wpi="http://schemas.microsoft.com/office/word/2010/wordprocessingInk" xmlns:wne="http://schemas.microsoft.com/office/word/2006/wordml" xmlns:wps="http://schemas.microsoft.com/office/word/2010/wordprocessingShape">
-  <w:p>
-    <w:pPr>
-      <w:jc w:val="center"/>
-    </w:pPr>
-    <w:r>
-      <w:rPr>
-        <w:rFonts w:ascii="Times New Roman" w:cs="Times New Roman" w:eastAsia="Times New Roman" w:hAnsi="Times New Roman"/>
-        <w:sz w:val="18"/>
-        <w:szCs w:val="18"/>
-      </w:rPr>
-      <w:fldChar w:fldCharType="begin"/>
-      <w:instrText xml:space="preserve">PAGE</w:instrText>
-      <w:fldChar w:fldCharType="separate"/>
-      <w:fldChar w:fldCharType="end"/>
-    </w:r>
-  </w:p>
-</w:ftr>
-</file>
-
-<file path=word/footer14.xml><?xml version="1.0" encoding="utf-8"?>
-<w:ftr xmlns:wpc="http://schemas.microsoft.com/office/word/2010/wordprocessingCanvas" xmlns:mc="http://schemas.openxmlformats.org/markup-compatibility/2006" xmlns:o="urn:schemas-microsoft-com:office:office" xmlns:r="http://schemas.openxmlformats.org/officeDocument/2006/relationships" xmlns:m="http://schemas.openxmlformats.org/officeDocument/2006/math" xmlns:v="urn:schemas-microsoft-com:vml" xmlns:wp14="http://schemas.microsoft.com/office/word/2010/wordprocessingDrawing" xmlns:wp="http://schemas.openxmlformats.org/drawingml/2006/wordprocessingDrawing" xmlns:w10="urn:schemas-microsoft-com:office:word" xmlns:w="http://schemas.openxmlformats.org/wordprocessingml/2006/main" xmlns:w14="http://schemas.microsoft.com/office/word/2010/wordml" xmlns:w15="http://schemas.microsoft.com/office/word/2012/wordml" xmlns:wpg="http://schemas.microsoft.com/office/word/2010/wordprocessingGroup" xmlns:wpi="http://schemas.microsoft.com/office/word/2010/wordprocessingInk" xmlns:wne="http://schemas.microsoft.com/office/word/2006/wordml" xmlns:wps="http://schemas.microsoft.com/office/word/2010/wordprocessingShape">
-  <w:p>
-    <w:pPr>
-      <w:jc w:val="center"/>
-    </w:pPr>
-    <w:r>
-      <w:rPr>
-        <w:rFonts w:ascii="Times New Roman" w:cs="Times New Roman" w:eastAsia="Times New Roman" w:hAnsi="Times New Roman"/>
-        <w:sz w:val="18"/>
-        <w:szCs w:val="18"/>
-      </w:rPr>
-      <w:fldChar w:fldCharType="begin"/>
-      <w:instrText xml:space="preserve">PAGE</w:instrText>
-      <w:fldChar w:fldCharType="separate"/>
-      <w:fldChar w:fldCharType="end"/>
-    </w:r>
-  </w:p>
-</w:ftr>
-</file>
-
-<file path=word/footer15.xml><?xml version="1.0" encoding="utf-8"?>
-<w:ftr xmlns:wpc="http://schemas.microsoft.com/office/word/2010/wordprocessingCanvas" xmlns:mc="http://schemas.openxmlformats.org/markup-compatibility/2006" xmlns:o="urn:schemas-microsoft-com:office:office" xmlns:r="http://schemas.openxmlformats.org/officeDocument/2006/relationships" xmlns:m="http://schemas.openxmlformats.org/officeDocument/2006/math" xmlns:v="urn:schemas-microsoft-com:vml" xmlns:wp14="http://schemas.microsoft.com/office/word/2010/wordprocessingDrawing" xmlns:wp="http://schemas.openxmlformats.org/drawingml/2006/wordprocessingDrawing" xmlns:w10="urn:schemas-microsoft-com:office:word" xmlns:w="http://schemas.openxmlformats.org/wordprocessingml/2006/main" xmlns:w14="http://schemas.microsoft.com/office/word/2010/wordml" xmlns:w15="http://schemas.microsoft.com/office/word/2012/wordml" xmlns:wpg="http://schemas.microsoft.com/office/word/2010/wordprocessingGroup" xmlns:wpi="http://schemas.microsoft.com/office/word/2010/wordprocessingInk" xmlns:wne="http://schemas.microsoft.com/office/word/2006/wordml" xmlns:wps="http://schemas.microsoft.com/office/word/2010/wordprocessingShape">
-  <w:p>
-    <w:pPr>
-      <w:jc w:val="center"/>
-    </w:pPr>
-    <w:r>
-      <w:rPr>
-        <w:rFonts w:ascii="Times New Roman" w:cs="Times New Roman" w:eastAsia="Times New Roman" w:hAnsi="Times New Roman"/>
-        <w:sz w:val="18"/>
-        <w:szCs w:val="18"/>
-      </w:rPr>
-      <w:fldChar w:fldCharType="begin"/>
-      <w:instrText xml:space="preserve">PAGE</w:instrText>
-      <w:fldChar w:fldCharType="separate"/>
-      <w:fldChar w:fldCharType="end"/>
-    </w:r>
-  </w:p>
-</w:ftr>
-</file>
-
-<file path=word/footer16.xml><?xml version="1.0" encoding="utf-8"?>
-<w:ftr xmlns:wpc="http://schemas.microsoft.com/office/word/2010/wordprocessingCanvas" xmlns:mc="http://schemas.openxmlformats.org/markup-compatibility/2006" xmlns:o="urn:schemas-microsoft-com:office:office" xmlns:r="http://schemas.openxmlformats.org/officeDocument/2006/relationships" xmlns:m="http://schemas.openxmlformats.org/officeDocument/2006/math" xmlns:v="urn:schemas-microsoft-com:vml" xmlns:wp14="http://schemas.microsoft.com/office/word/2010/wordprocessingDrawing" xmlns:wp="http://schemas.openxmlformats.org/drawingml/2006/wordprocessingDrawing" xmlns:w10="urn:schemas-microsoft-com:office:word" xmlns:w="http://schemas.openxmlformats.org/wordprocessingml/2006/main" xmlns:w14="http://schemas.microsoft.com/office/word/2010/wordml" xmlns:w15="http://schemas.microsoft.com/office/word/2012/wordml" xmlns:wpg="http://schemas.microsoft.com/office/word/2010/wordprocessingGroup" xmlns:wpi="http://schemas.microsoft.com/office/word/2010/wordprocessingInk" xmlns:wne="http://schemas.microsoft.com/office/word/2006/wordml" xmlns:wps="http://schemas.microsoft.com/office/word/2010/wordprocessingShape">
-  <w:p>
-    <w:pPr>
-      <w:jc w:val="center"/>
-    </w:pPr>
-    <w:r>
-      <w:rPr>
-        <w:rFonts w:ascii="Times New Roman" w:cs="Times New Roman" w:eastAsia="Times New Roman" w:hAnsi="Times New Roman"/>
-        <w:sz w:val="18"/>
-        <w:szCs w:val="18"/>
-      </w:rPr>
-      <w:fldChar w:fldCharType="begin"/>
-      <w:instrText xml:space="preserve">PAGE</w:instrText>
-      <w:fldChar w:fldCharType="separate"/>
-      <w:fldChar w:fldCharType="end"/>
-    </w:r>
-  </w:p>
-</w:ftr>
-</file>
-
-<file path=word/footer2.xml><?xml version="1.0" encoding="utf-8"?>
-<w:ftr xmlns:wpc="http://schemas.microsoft.com/office/word/2010/wordprocessingCanvas" xmlns:mc="http://schemas.openxmlformats.org/markup-compatibility/2006" xmlns:o="urn:schemas-microsoft-com:office:office" xmlns:r="http://schemas.openxmlformats.org/officeDocument/2006/relationships" xmlns:m="http://schemas.openxmlformats.org/officeDocument/2006/math" xmlns:v="urn:schemas-microsoft-com:vml" xmlns:wp14="http://schemas.microsoft.com/office/word/2010/wordprocessingDrawing" xmlns:wp="http://schemas.openxmlformats.org/drawingml/2006/wordprocessingDrawing" xmlns:w10="urn:schemas-microsoft-com:office:word" xmlns:w="http://schemas.openxmlformats.org/wordprocessingml/2006/main" xmlns:w14="http://schemas.microsoft.com/office/word/2010/wordml" xmlns:w15="http://schemas.microsoft.com/office/word/2012/wordml" xmlns:wpg="http://schemas.microsoft.com/office/word/2010/wordprocessingGroup" xmlns:wpi="http://schemas.microsoft.com/office/word/2010/wordprocessingInk" xmlns:wne="http://schemas.microsoft.com/office/word/2006/wordml" xmlns:wps="http://schemas.microsoft.com/office/word/2010/wordprocessingShape">
-  <w:p>
-    <w:pPr>
-      <w:jc w:val="center"/>
-    </w:pPr>
-    <w:r>
-      <w:rPr>
-        <w:rFonts w:ascii="Times New Roman" w:cs="Times New Roman" w:eastAsia="Times New Roman" w:hAnsi="Times New Roman"/>
-        <w:sz w:val="18"/>
-        <w:szCs w:val="18"/>
-      </w:rPr>
-      <w:fldChar w:fldCharType="begin"/>
-      <w:instrText xml:space="preserve">PAGE</w:instrText>
-      <w:fldChar w:fldCharType="separate"/>
-      <w:fldChar w:fldCharType="end"/>
-    </w:r>
-  </w:p>
-</w:ftr>
-</file>
-
-<file path=word/footer3.xml><?xml version="1.0" encoding="utf-8"?>
-<w:ftr xmlns:wpc="http://schemas.microsoft.com/office/word/2010/wordprocessingCanvas" xmlns:mc="http://schemas.openxmlformats.org/markup-compatibility/2006" xmlns:o="urn:schemas-microsoft-com:office:office" xmlns:r="http://schemas.openxmlformats.org/officeDocument/2006/relationships" xmlns:m="http://schemas.openxmlformats.org/officeDocument/2006/math" xmlns:v="urn:schemas-microsoft-com:vml" xmlns:wp14="http://schemas.microsoft.com/office/word/2010/wordprocessingDrawing" xmlns:wp="http://schemas.openxmlformats.org/drawingml/2006/wordprocessingDrawing" xmlns:w10="urn:schemas-microsoft-com:office:word" xmlns:w="http://schemas.openxmlformats.org/wordprocessingml/2006/main" xmlns:w14="http://schemas.microsoft.com/office/word/2010/wordml" xmlns:w15="http://schemas.microsoft.com/office/word/2012/wordml" xmlns:wpg="http://schemas.microsoft.com/office/word/2010/wordprocessingGroup" xmlns:wpi="http://schemas.microsoft.com/office/word/2010/wordprocessingInk" xmlns:wne="http://schemas.microsoft.com/office/word/2006/wordml" xmlns:wps="http://schemas.microsoft.com/office/word/2010/wordprocessingShape">
-  <w:p>
-    <w:pPr>
-      <w:jc w:val="center"/>
-    </w:pPr>
-    <w:r>
-      <w:rPr>
-        <w:rFonts w:ascii="Times New Roman" w:cs="Times New Roman" w:eastAsia="Times New Roman" w:hAnsi="Times New Roman"/>
-        <w:sz w:val="18"/>
-        <w:szCs w:val="18"/>
-      </w:rPr>
-      <w:fldChar w:fldCharType="begin"/>
-      <w:instrText xml:space="preserve">PAGE</w:instrText>
-      <w:fldChar w:fldCharType="separate"/>
-      <w:fldChar w:fldCharType="end"/>
-    </w:r>
-  </w:p>
-</w:ftr>
-</file>
-
-<file path=word/footer4.xml><?xml version="1.0" encoding="utf-8"?>
-<w:ftr xmlns:wpc="http://schemas.microsoft.com/office/word/2010/wordprocessingCanvas" xmlns:mc="http://schemas.openxmlformats.org/markup-compatibility/2006" xmlns:o="urn:schemas-microsoft-com:office:office" xmlns:r="http://schemas.openxmlformats.org/officeDocument/2006/relationships" xmlns:m="http://schemas.openxmlformats.org/officeDocument/2006/math" xmlns:v="urn:schemas-microsoft-com:vml" xmlns:wp14="http://schemas.microsoft.com/office/word/2010/wordprocessingDrawing" xmlns:wp="http://schemas.openxmlformats.org/drawingml/2006/wordprocessingDrawing" xmlns:w10="urn:schemas-microsoft-com:office:word" xmlns:w="http://schemas.openxmlformats.org/wordprocessingml/2006/main" xmlns:w14="http://schemas.microsoft.com/office/word/2010/wordml" xmlns:w15="http://schemas.microsoft.com/office/word/2012/wordml" xmlns:wpg="http://schemas.microsoft.com/office/word/2010/wordprocessingGroup" xmlns:wpi="http://schemas.microsoft.com/office/word/2010/wordprocessingInk" xmlns:wne="http://schemas.microsoft.com/office/word/2006/wordml" xmlns:wps="http://schemas.microsoft.com/office/word/2010/wordprocessingShape">
-  <w:p>
-    <w:pPr>
-      <w:jc w:val="center"/>
-    </w:pPr>
-    <w:r>
-      <w:rPr>
-        <w:rFonts w:ascii="Times New Roman" w:cs="Times New Roman" w:eastAsia="Times New Roman" w:hAnsi="Times New Roman"/>
-        <w:sz w:val="18"/>
-        <w:szCs w:val="18"/>
-      </w:rPr>
-      <w:fldChar w:fldCharType="begin"/>
-      <w:instrText xml:space="preserve">PAGE</w:instrText>
-      <w:fldChar w:fldCharType="separate"/>
-      <w:fldChar w:fldCharType="end"/>
-    </w:r>
-  </w:p>
-</w:ftr>
-</file>
-
-<file path=word/footer5.xml><?xml version="1.0" encoding="utf-8"?>
-<w:ftr xmlns:wpc="http://schemas.microsoft.com/office/word/2010/wordprocessingCanvas" xmlns:mc="http://schemas.openxmlformats.org/markup-compatibility/2006" xmlns:o="urn:schemas-microsoft-com:office:office" xmlns:r="http://schemas.openxmlformats.org/officeDocument/2006/relationships" xmlns:m="http://schemas.openxmlformats.org/officeDocument/2006/math" xmlns:v="urn:schemas-microsoft-com:vml" xmlns:wp14="http://schemas.microsoft.com/office/word/2010/wordprocessingDrawing" xmlns:wp="http://schemas.openxmlformats.org/drawingml/2006/wordprocessingDrawing" xmlns:w10="urn:schemas-microsoft-com:office:word" xmlns:w="http://schemas.openxmlformats.org/wordprocessingml/2006/main" xmlns:w14="http://schemas.microsoft.com/office/word/2010/wordml" xmlns:w15="http://schemas.microsoft.com/office/word/2012/wordml" xmlns:wpg="http://schemas.microsoft.com/office/word/2010/wordprocessingGroup" xmlns:wpi="http://schemas.microsoft.com/office/word/2010/wordprocessingInk" xmlns:wne="http://schemas.microsoft.com/office/word/2006/wordml" xmlns:wps="http://schemas.microsoft.com/office/word/2010/wordprocessingShape">
-  <w:p>
-    <w:pPr>
-      <w:jc w:val="center"/>
-    </w:pPr>
-    <w:r>
-      <w:rPr>
-        <w:rFonts w:ascii="Times New Roman" w:cs="Times New Roman" w:eastAsia="Times New Roman" w:hAnsi="Times New Roman"/>
-        <w:sz w:val="18"/>
-        <w:szCs w:val="18"/>
-      </w:rPr>
-      <w:fldChar w:fldCharType="begin"/>
-      <w:instrText xml:space="preserve">PAGE</w:instrText>
-      <w:fldChar w:fldCharType="separate"/>
-      <w:fldChar w:fldCharType="end"/>
-    </w:r>
-  </w:p>
-</w:ftr>
-</file>
-
-<file path=word/footer6.xml><?xml version="1.0" encoding="utf-8"?>
-<w:ftr xmlns:wpc="http://schemas.microsoft.com/office/word/2010/wordprocessingCanvas" xmlns:mc="http://schemas.openxmlformats.org/markup-compatibility/2006" xmlns:o="urn:schemas-microsoft-com:office:office" xmlns:r="http://schemas.openxmlformats.org/officeDocument/2006/relationships" xmlns:m="http://schemas.openxmlformats.org/officeDocument/2006/math" xmlns:v="urn:schemas-microsoft-com:vml" xmlns:wp14="http://schemas.microsoft.com/office/word/2010/wordprocessingDrawing" xmlns:wp="http://schemas.openxmlformats.org/drawingml/2006/wordprocessingDrawing" xmlns:w10="urn:schemas-microsoft-com:office:word" xmlns:w="http://schemas.openxmlformats.org/wordprocessingml/2006/main" xmlns:w14="http://schemas.microsoft.com/office/word/2010/wordml" xmlns:w15="http://schemas.microsoft.com/office/word/2012/wordml" xmlns:wpg="http://schemas.microsoft.com/office/word/2010/wordprocessingGroup" xmlns:wpi="http://schemas.microsoft.com/office/word/2010/wordprocessingInk" xmlns:wne="http://schemas.microsoft.com/office/word/2006/wordml" xmlns:wps="http://schemas.microsoft.com/office/word/2010/wordprocessingShape">
-  <w:p>
-    <w:pPr>
-      <w:jc w:val="center"/>
-    </w:pPr>
-    <w:r>
-      <w:rPr>
-        <w:rFonts w:ascii="Times New Roman" w:cs="Times New Roman" w:eastAsia="Times New Roman" w:hAnsi="Times New Roman"/>
-        <w:sz w:val="18"/>
-        <w:szCs w:val="18"/>
-      </w:rPr>
-      <w:fldChar w:fldCharType="begin"/>
-      <w:instrText xml:space="preserve">PAGE</w:instrText>
-      <w:fldChar w:fldCharType="separate"/>
-      <w:fldChar w:fldCharType="end"/>
-    </w:r>
-  </w:p>
-</w:ftr>
-</file>
-
-<file path=word/footer7.xml><?xml version="1.0" encoding="utf-8"?>
-<w:ftr xmlns:wpc="http://schemas.microsoft.com/office/word/2010/wordprocessingCanvas" xmlns:mc="http://schemas.openxmlformats.org/markup-compatibility/2006" xmlns:o="urn:schemas-microsoft-com:office:office" xmlns:r="http://schemas.openxmlformats.org/officeDocument/2006/relationships" xmlns:m="http://schemas.openxmlformats.org/officeDocument/2006/math" xmlns:v="urn:schemas-microsoft-com:vml" xmlns:wp14="http://schemas.microsoft.com/office/word/2010/wordprocessingDrawing" xmlns:wp="http://schemas.openxmlformats.org/drawingml/2006/wordprocessingDrawing" xmlns:w10="urn:schemas-microsoft-com:office:word" xmlns:w="http://schemas.openxmlformats.org/wordprocessingml/2006/main" xmlns:w14="http://schemas.microsoft.com/office/word/2010/wordml" xmlns:w15="http://schemas.microsoft.com/office/word/2012/wordml" xmlns:wpg="http://schemas.microsoft.com/office/word/2010/wordprocessingGroup" xmlns:wpi="http://schemas.microsoft.com/office/word/2010/wordprocessingInk" xmlns:wne="http://schemas.microsoft.com/office/word/2006/wordml" xmlns:wps="http://schemas.microsoft.com/office/word/2010/wordprocessingShape">
-  <w:p>
-    <w:pPr>
-      <w:jc w:val="center"/>
-    </w:pPr>
-    <w:r>
-      <w:rPr>
-        <w:rFonts w:ascii="Times New Roman" w:cs="Times New Roman" w:eastAsia="Times New Roman" w:hAnsi="Times New Roman"/>
-        <w:sz w:val="18"/>
-        <w:szCs w:val="18"/>
-      </w:rPr>
-      <w:fldChar w:fldCharType="begin"/>
-      <w:instrText xml:space="preserve">PAGE</w:instrText>
-      <w:fldChar w:fldCharType="separate"/>
-      <w:fldChar w:fldCharType="end"/>
-    </w:r>
-  </w:p>
-</w:ftr>
-</file>
-
-<file path=word/footer8.xml><?xml version="1.0" encoding="utf-8"?>
-<w:ftr xmlns:wpc="http://schemas.microsoft.com/office/word/2010/wordprocessingCanvas" xmlns:mc="http://schemas.openxmlformats.org/markup-compatibility/2006" xmlns:o="urn:schemas-microsoft-com:office:office" xmlns:r="http://schemas.openxmlformats.org/officeDocument/2006/relationships" xmlns:m="http://schemas.openxmlformats.org/officeDocument/2006/math" xmlns:v="urn:schemas-microsoft-com:vml" xmlns:wp14="http://schemas.microsoft.com/office/word/2010/wordprocessingDrawing" xmlns:wp="http://schemas.openxmlformats.org/drawingml/2006/wordprocessingDrawing" xmlns:w10="urn:schemas-microsoft-com:office:word" xmlns:w="http://schemas.openxmlformats.org/wordprocessingml/2006/main" xmlns:w14="http://schemas.microsoft.com/office/word/2010/wordml" xmlns:w15="http://schemas.microsoft.com/office/word/2012/wordml" xmlns:wpg="http://schemas.microsoft.com/office/word/2010/wordprocessingGroup" xmlns:wpi="http://schemas.microsoft.com/office/word/2010/wordprocessingInk" xmlns:wne="http://schemas.microsoft.com/office/word/2006/wordml" xmlns:wps="http://schemas.microsoft.com/office/word/2010/wordprocessingShape">
-  <w:p>
-    <w:pPr>
-      <w:jc w:val="center"/>
-    </w:pPr>
-    <w:r>
-      <w:rPr>
-        <w:rFonts w:ascii="Times New Roman" w:cs="Times New Roman" w:eastAsia="Times New Roman" w:hAnsi="Times New Roman"/>
-        <w:sz w:val="18"/>
-        <w:szCs w:val="18"/>
-      </w:rPr>
-      <w:fldChar w:fldCharType="begin"/>
-      <w:instrText xml:space="preserve">PAGE</w:instrText>
-      <w:fldChar w:fldCharType="separate"/>
-      <w:fldChar w:fldCharType="end"/>
-    </w:r>
-  </w:p>
-</w:ftr>
-</file>
-
-<file path=word/footer9.xml><?xml version="1.0" encoding="utf-8"?>
-<w:ftr xmlns:wpc="http://schemas.microsoft.com/office/word/2010/wordprocessingCanvas" xmlns:mc="http://schemas.openxmlformats.org/markup-compatibility/2006" xmlns:o="urn:schemas-microsoft-com:office:office" xmlns:r="http://schemas.openxmlformats.org/officeDocument/2006/relationships" xmlns:m="http://schemas.openxmlformats.org/officeDocument/2006/math" xmlns:v="urn:schemas-microsoft-com:vml" xmlns:wp14="http://schemas.microsoft.com/office/word/2010/wordprocessingDrawing" xmlns:wp="http://schemas.openxmlformats.org/drawingml/2006/wordprocessingDrawing" xmlns:w10="urn:schemas-microsoft-com:office:word" xmlns:w="http://schemas.openxmlformats.org/wordprocessingml/2006/main" xmlns:w14="http://schemas.microsoft.com/office/word/2010/wordml" xmlns:w15="http://schemas.microsoft.com/office/word/2012/wordml" xmlns:wpg="http://schemas.microsoft.com/office/word/2010/wordprocessingGroup" xmlns:wpi="http://schemas.microsoft.com/office/word/2010/wordprocessingInk" xmlns:wne="http://schemas.microsoft.com/office/word/2006/wordml" xmlns:wps="http://schemas.microsoft.com/office/word/2010/wordprocessingShape">
-  <w:p>
-    <w:pPr>
-      <w:jc w:val="center"/>
-    </w:pPr>
-    <w:r>
-      <w:rPr>
-        <w:rFonts w:ascii="Times New Roman" w:cs="Times New Roman" w:eastAsia="Times New Roman" w:hAnsi="Times New Roman"/>
-        <w:sz w:val="18"/>
-        <w:szCs w:val="18"/>
-      </w:rPr>
-      <w:fldChar w:fldCharType="begin"/>
-      <w:instrText xml:space="preserve">PAGE</w:instrText>
-      <w:fldChar w:fldCharType="separate"/>
-      <w:fldChar w:fldCharType="end"/>
-    </w:r>
-  </w:p>
-</w:ftr>
 </file>
 
 <file path=word/footnotes.xml><?xml version="1.0" encoding="utf-8"?>

</xml_diff>